<commit_message>
feat: Update INFORME_REQUESITOS: Introduccion; Alcance y Despliegue.
</commit_message>
<xml_diff>
--- a/INFORME_REQUISITOS.docx
+++ b/INFORME_REQUISITOS.docx
@@ -5,17 +5,12 @@
     <w:p>
       <w:pPr>
         <w:spacing w:after="240" w:lineRule="auto"/>
-        <w:ind w:left="2880" w:firstLine="0"/>
+        <w:ind w:left="2880" w:firstLine="720"/>
         <w:jc w:val="both"/>
-        <w:rPr>
-          <w:b w:val="1"/>
-          <w:bCs w:val="1"/>
-        </w:rPr>
-      </w:pPr>
-      <w:r>
-        <w:rPr>
-          <w:b w:val="1"/>
-          <w:bCs w:val="1"/>
+        <w:rPr/>
+      </w:pPr>
+      <w:r>
+        <w:rPr>
           <w:rtl w:val="0"/>
         </w:rPr>
         <w:t xml:space="preserve">INFORME DE REQUISITOS</w:t>
@@ -37,7 +32,7 @@
     <w:p>
       <w:pPr>
         <w:spacing w:after="240" w:lineRule="auto"/>
-        <w:ind w:left="2880" w:firstLine="0"/>
+        <w:ind w:left="2880" w:firstLine="720"/>
         <w:jc w:val="both"/>
         <w:rPr/>
       </w:pPr>
@@ -60,6 +55,7 @@
         <w:rPr>
           <w:rtl w:val="0"/>
         </w:rPr>
+        <w:tab/>
         <w:t xml:space="preserve">Yeferson Estiven Castañeda</w:t>
       </w:r>
     </w:p>
@@ -74,6 +70,7 @@
         <w:rPr>
           <w:rtl w:val="0"/>
         </w:rPr>
+        <w:tab/>
         <w:t xml:space="preserve">Miguel Samudio</w:t>
       </w:r>
     </w:p>
@@ -88,6 +85,7 @@
         <w:rPr>
           <w:rtl w:val="0"/>
         </w:rPr>
+        <w:tab/>
         <w:t xml:space="preserve">Luis Loaiza García</w:t>
       </w:r>
     </w:p>
@@ -102,6 +100,7 @@
         <w:rPr>
           <w:rtl w:val="0"/>
         </w:rPr>
+        <w:tab/>
         <w:t xml:space="preserve">Andrés Vélez Hurtado</w:t>
       </w:r>
     </w:p>
@@ -145,6 +144,7 @@
     </w:p>
     <w:p>
       <w:pPr>
+        <w:spacing w:line="480" w:lineRule="auto"/>
         <w:ind w:firstLine="0"/>
         <w:jc w:val="center"/>
         <w:rPr/>
@@ -158,6 +158,7 @@
     </w:p>
     <w:p>
       <w:pPr>
+        <w:spacing w:line="480" w:lineRule="auto"/>
         <w:ind w:firstLine="0"/>
         <w:jc w:val="center"/>
         <w:rPr/>
@@ -171,6 +172,7 @@
     </w:p>
     <w:p>
       <w:pPr>
+        <w:spacing w:line="480" w:lineRule="auto"/>
         <w:ind w:firstLine="0"/>
         <w:jc w:val="center"/>
         <w:rPr/>
@@ -184,6 +186,7 @@
     </w:p>
     <w:p>
       <w:pPr>
+        <w:spacing w:line="480" w:lineRule="auto"/>
         <w:ind w:firstLine="0"/>
         <w:jc w:val="center"/>
         <w:rPr/>
@@ -196,6 +199,7 @@
     </w:p>
     <w:p>
       <w:pPr>
+        <w:spacing w:line="480" w:lineRule="auto"/>
         <w:ind w:firstLine="0"/>
         <w:jc w:val="center"/>
         <w:rPr/>
@@ -208,6 +212,7 @@
     </w:p>
     <w:p>
       <w:pPr>
+        <w:spacing w:line="480" w:lineRule="auto"/>
         <w:ind w:firstLine="0"/>
         <w:jc w:val="center"/>
         <w:rPr/>
@@ -220,28 +225,38 @@
     </w:p>
     <w:p>
       <w:pPr>
+        <w:spacing w:line="480" w:lineRule="auto"/>
         <w:ind w:firstLine="0"/>
         <w:jc w:val="center"/>
         <w:rPr/>
       </w:pPr>
       <w:r>
         <w:rPr>
+          <w:rFonts w:ascii="Times New Roman" w:cs="Times New Roman" w:eastAsia="Times New Roman" w:hAnsi="Times New Roman"/>
+          <w:sz w:val="24"/>
+          <w:szCs w:val="24"/>
           <w:rtl w:val="0"/>
         </w:rPr>
         <w:t xml:space="preserve">Medellín, Colombia</w:t>
       </w:r>
-    </w:p>
-    <w:p>
-      <w:pPr>
+      <w:r>
+        <w:rPr>
+          <w:rtl w:val="0"/>
+        </w:rPr>
+      </w:r>
+    </w:p>
+    <w:p>
+      <w:pPr>
+        <w:spacing w:line="480" w:lineRule="auto"/>
         <w:ind w:firstLine="0"/>
         <w:jc w:val="center"/>
-        <w:rPr>
-          <w:b w:val="1"/>
-          <w:bCs w:val="1"/>
-        </w:rPr>
-      </w:pPr>
-      <w:r>
-        <w:rPr>
+        <w:rPr/>
+      </w:pPr>
+      <w:r>
+        <w:rPr>
+          <w:rFonts w:ascii="Times New Roman" w:cs="Times New Roman" w:eastAsia="Times New Roman" w:hAnsi="Times New Roman"/>
+          <w:sz w:val="24"/>
+          <w:szCs w:val="24"/>
           <w:rtl w:val="0"/>
         </w:rPr>
         <w:t xml:space="preserve">2026</w:t>
@@ -254,6 +269,7 @@
     </w:p>
     <w:p>
       <w:pPr>
+        <w:jc w:val="both"/>
         <w:rPr/>
       </w:pPr>
       <w:r>
@@ -281,7 +297,7 @@
     </w:p>
     <w:sdt>
       <w:sdtPr>
-        <w:id w:val="-850206450"/>
+        <w:id w:val="-418000486"/>
         <w:docPartObj>
           <w:docPartGallery w:val="Table of Contents"/>
           <w:docPartUnique w:val="1"/>
@@ -290,33 +306,2111 @@
       <w:sdtContent>
         <w:p>
           <w:pPr>
-            <w:keepNext w:val="0"/>
-            <w:keepLines w:val="0"/>
-            <w:pageBreakBefore w:val="0"/>
             <w:widowControl w:val="0"/>
-            <w:pBdr>
-              <w:top w:space="0" w:sz="0" w:val="nil"/>
-              <w:left w:space="0" w:sz="0" w:val="nil"/>
-              <w:bottom w:space="0" w:sz="0" w:val="nil"/>
-              <w:right w:space="0" w:sz="0" w:val="nil"/>
-              <w:between w:space="0" w:sz="0" w:val="nil"/>
-            </w:pBdr>
-            <w:shd w:fill="auto" w:val="clear"/>
-            <w:spacing w:after="0" w:before="0" w:line="276" w:lineRule="auto"/>
-            <w:ind w:left="0" w:right="0" w:firstLine="0"/>
-            <w:jc w:val="left"/>
-            <w:rPr/>
+            <w:tabs>
+              <w:tab w:val="right" w:leader="none" w:pos="12000"/>
+            </w:tabs>
+            <w:spacing w:before="60" w:line="240" w:lineRule="auto"/>
+            <w:ind w:firstLine="0"/>
+            <w:rPr>
+              <w:rFonts w:ascii="Arial" w:cs="Arial" w:eastAsia="Arial" w:hAnsi="Arial"/>
+              <w:b w:val="1"/>
+              <w:bCs w:val="1"/>
+              <w:i w:val="0"/>
+              <w:iCs w:val="0"/>
+              <w:smallCaps w:val="0"/>
+              <w:strike w:val="0"/>
+              <w:color w:val="000000"/>
+              <w:sz w:val="22"/>
+              <w:szCs w:val="22"/>
+              <w:u w:val="none"/>
+              <w:shd w:fill="auto" w:val="clear"/>
+              <w:vertAlign w:val="baseline"/>
+            </w:rPr>
           </w:pPr>
           <w:r>
             <w:fldChar w:fldCharType="begin"/>
             <w:instrText xml:space="preserve"> TOC \h \u \z \t "Heading 1,1,Heading 2,2,Heading 3,3,"</w:instrText>
             <w:fldChar w:fldCharType="separate"/>
           </w:r>
+          <w:hyperlink w:anchor="">
+            <w:r>
+              <w:rPr>
+                <w:rFonts w:ascii="Arial" w:cs="Arial" w:eastAsia="Arial" w:hAnsi="Arial"/>
+                <w:b w:val="1"/>
+                <w:bCs w:val="1"/>
+                <w:i w:val="0"/>
+                <w:iCs w:val="0"/>
+                <w:smallCaps w:val="0"/>
+                <w:strike w:val="0"/>
+                <w:color w:val="000000"/>
+                <w:sz w:val="22"/>
+                <w:szCs w:val="22"/>
+                <w:u w:val="none"/>
+                <w:shd w:fill="auto" w:val="clear"/>
+                <w:vertAlign w:val="baseline"/>
+                <w:rtl w:val="0"/>
+              </w:rPr>
+              <w:t xml:space="preserve">Tabla de contenido</w:t>
+              <w:tab/>
+              <w:t xml:space="preserve">2</w:t>
+            </w:r>
+          </w:hyperlink>
           <w:r>
             <w:rPr>
               <w:rtl w:val="0"/>
             </w:rPr>
-            <w:t xml:space="preserve">Actualizar campo en Word</w:t>
+          </w:r>
+        </w:p>
+        <w:p>
+          <w:pPr>
+            <w:widowControl w:val="0"/>
+            <w:tabs>
+              <w:tab w:val="right" w:leader="none" w:pos="12000"/>
+            </w:tabs>
+            <w:spacing w:before="60" w:line="240" w:lineRule="auto"/>
+            <w:ind w:firstLine="0"/>
+            <w:rPr>
+              <w:rFonts w:ascii="Arial" w:cs="Arial" w:eastAsia="Arial" w:hAnsi="Arial"/>
+              <w:b w:val="1"/>
+              <w:bCs w:val="1"/>
+              <w:i w:val="0"/>
+              <w:iCs w:val="0"/>
+              <w:smallCaps w:val="0"/>
+              <w:strike w:val="0"/>
+              <w:color w:val="000000"/>
+              <w:sz w:val="22"/>
+              <w:szCs w:val="22"/>
+              <w:u w:val="none"/>
+              <w:shd w:fill="auto" w:val="clear"/>
+              <w:vertAlign w:val="baseline"/>
+            </w:rPr>
+          </w:pPr>
+          <w:hyperlink w:anchor="">
+            <w:r>
+              <w:rPr>
+                <w:rFonts w:ascii="Arial" w:cs="Arial" w:eastAsia="Arial" w:hAnsi="Arial"/>
+                <w:b w:val="1"/>
+                <w:bCs w:val="1"/>
+                <w:color w:val="1155cc"/>
+                <w:sz w:val="22"/>
+                <w:szCs w:val="22"/>
+                <w:u w:val="single"/>
+                <w:rtl w:val="0"/>
+              </w:rPr>
+              <w:t xml:space="preserve">Lista de tablas 3</w:t>
+            </w:r>
+          </w:hyperlink>
+          <w:r>
+            <w:rPr>
+              <w:rtl w:val="0"/>
+            </w:rPr>
+          </w:r>
+        </w:p>
+        <w:p>
+          <w:pPr>
+            <w:widowControl w:val="0"/>
+            <w:tabs>
+              <w:tab w:val="right" w:leader="none" w:pos="12000"/>
+            </w:tabs>
+            <w:spacing w:before="60" w:line="240" w:lineRule="auto"/>
+            <w:ind w:firstLine="0"/>
+            <w:rPr>
+              <w:rFonts w:ascii="Arial" w:cs="Arial" w:eastAsia="Arial" w:hAnsi="Arial"/>
+              <w:b w:val="1"/>
+              <w:bCs w:val="1"/>
+              <w:i w:val="0"/>
+              <w:iCs w:val="0"/>
+              <w:smallCaps w:val="0"/>
+              <w:strike w:val="0"/>
+              <w:color w:val="000000"/>
+              <w:sz w:val="22"/>
+              <w:szCs w:val="22"/>
+              <w:u w:val="none"/>
+              <w:shd w:fill="auto" w:val="clear"/>
+              <w:vertAlign w:val="baseline"/>
+            </w:rPr>
+          </w:pPr>
+          <w:hyperlink w:anchor="">
+            <w:r>
+              <w:rPr>
+                <w:rFonts w:ascii="Arial" w:cs="Arial" w:eastAsia="Arial" w:hAnsi="Arial"/>
+                <w:b w:val="1"/>
+                <w:bCs w:val="1"/>
+                <w:color w:val="1155cc"/>
+                <w:sz w:val="22"/>
+                <w:szCs w:val="22"/>
+                <w:u w:val="single"/>
+                <w:rtl w:val="0"/>
+              </w:rPr>
+              <w:t xml:space="preserve">Lista de ilustraciones 4</w:t>
+            </w:r>
+          </w:hyperlink>
+          <w:r>
+            <w:rPr>
+              <w:rtl w:val="0"/>
+            </w:rPr>
+          </w:r>
+        </w:p>
+        <w:p>
+          <w:pPr>
+            <w:widowControl w:val="0"/>
+            <w:tabs>
+              <w:tab w:val="right" w:leader="none" w:pos="12000"/>
+            </w:tabs>
+            <w:spacing w:before="60" w:line="240" w:lineRule="auto"/>
+            <w:ind w:firstLine="0"/>
+            <w:rPr>
+              <w:rFonts w:ascii="Arial" w:cs="Arial" w:eastAsia="Arial" w:hAnsi="Arial"/>
+              <w:b w:val="1"/>
+              <w:bCs w:val="1"/>
+              <w:i w:val="0"/>
+              <w:iCs w:val="0"/>
+              <w:smallCaps w:val="0"/>
+              <w:strike w:val="0"/>
+              <w:color w:val="000000"/>
+              <w:sz w:val="22"/>
+              <w:szCs w:val="22"/>
+              <w:u w:val="none"/>
+              <w:shd w:fill="auto" w:val="clear"/>
+              <w:vertAlign w:val="baseline"/>
+            </w:rPr>
+          </w:pPr>
+          <w:hyperlink w:anchor="">
+            <w:r>
+              <w:rPr>
+                <w:rFonts w:ascii="Arial" w:cs="Arial" w:eastAsia="Arial" w:hAnsi="Arial"/>
+                <w:b w:val="1"/>
+                <w:bCs w:val="1"/>
+                <w:i w:val="0"/>
+                <w:iCs w:val="0"/>
+                <w:smallCaps w:val="0"/>
+                <w:strike w:val="0"/>
+                <w:color w:val="000000"/>
+                <w:sz w:val="22"/>
+                <w:szCs w:val="22"/>
+                <w:u w:val="none"/>
+                <w:shd w:fill="auto" w:val="clear"/>
+                <w:vertAlign w:val="baseline"/>
+                <w:rtl w:val="0"/>
+              </w:rPr>
+              <w:t xml:space="preserve">Glosario</w:t>
+              <w:tab/>
+              <w:t xml:space="preserve">5</w:t>
+            </w:r>
+          </w:hyperlink>
+          <w:r>
+            <w:rPr>
+              <w:rtl w:val="0"/>
+            </w:rPr>
+          </w:r>
+        </w:p>
+        <w:p>
+          <w:pPr>
+            <w:widowControl w:val="0"/>
+            <w:tabs>
+              <w:tab w:val="right" w:leader="none" w:pos="12000"/>
+            </w:tabs>
+            <w:spacing w:before="60" w:line="240" w:lineRule="auto"/>
+            <w:ind w:firstLine="0"/>
+            <w:rPr>
+              <w:rFonts w:ascii="Arial" w:cs="Arial" w:eastAsia="Arial" w:hAnsi="Arial"/>
+              <w:b w:val="1"/>
+              <w:bCs w:val="1"/>
+              <w:i w:val="0"/>
+              <w:iCs w:val="0"/>
+              <w:smallCaps w:val="0"/>
+              <w:strike w:val="0"/>
+              <w:color w:val="000000"/>
+              <w:sz w:val="22"/>
+              <w:szCs w:val="22"/>
+              <w:u w:val="none"/>
+              <w:shd w:fill="auto" w:val="clear"/>
+              <w:vertAlign w:val="baseline"/>
+            </w:rPr>
+          </w:pPr>
+          <w:hyperlink w:anchor="">
+            <w:r>
+              <w:rPr>
+                <w:rFonts w:ascii="Arial" w:cs="Arial" w:eastAsia="Arial" w:hAnsi="Arial"/>
+                <w:b w:val="1"/>
+                <w:bCs w:val="1"/>
+                <w:i w:val="0"/>
+                <w:iCs w:val="0"/>
+                <w:smallCaps w:val="0"/>
+                <w:strike w:val="0"/>
+                <w:color w:val="000000"/>
+                <w:sz w:val="22"/>
+                <w:szCs w:val="22"/>
+                <w:u w:val="none"/>
+                <w:shd w:fill="auto" w:val="clear"/>
+                <w:vertAlign w:val="baseline"/>
+                <w:rtl w:val="0"/>
+              </w:rPr>
+              <w:t xml:space="preserve">Objetivos</w:t>
+              <w:tab/>
+              <w:t xml:space="preserve">6</w:t>
+            </w:r>
+          </w:hyperlink>
+          <w:r>
+            <w:rPr>
+              <w:rtl w:val="0"/>
+            </w:rPr>
+          </w:r>
+        </w:p>
+        <w:p>
+          <w:pPr>
+            <w:widowControl w:val="0"/>
+            <w:tabs>
+              <w:tab w:val="right" w:leader="none" w:pos="12000"/>
+            </w:tabs>
+            <w:spacing w:before="60" w:line="240" w:lineRule="auto"/>
+            <w:ind w:left="360" w:firstLine="0"/>
+            <w:rPr>
+              <w:rFonts w:ascii="Arial" w:cs="Arial" w:eastAsia="Arial" w:hAnsi="Arial"/>
+              <w:b w:val="0"/>
+              <w:bCs w:val="0"/>
+              <w:i w:val="0"/>
+              <w:iCs w:val="0"/>
+              <w:smallCaps w:val="0"/>
+              <w:strike w:val="0"/>
+              <w:color w:val="000000"/>
+              <w:sz w:val="22"/>
+              <w:szCs w:val="22"/>
+              <w:u w:val="none"/>
+              <w:shd w:fill="auto" w:val="clear"/>
+              <w:vertAlign w:val="baseline"/>
+            </w:rPr>
+          </w:pPr>
+          <w:hyperlink w:anchor="">
+            <w:r>
+              <w:rPr>
+                <w:rFonts w:ascii="Arial" w:cs="Arial" w:eastAsia="Arial" w:hAnsi="Arial"/>
+                <w:b w:val="0"/>
+                <w:bCs w:val="0"/>
+                <w:i w:val="0"/>
+                <w:iCs w:val="0"/>
+                <w:smallCaps w:val="0"/>
+                <w:strike w:val="0"/>
+                <w:color w:val="000000"/>
+                <w:sz w:val="22"/>
+                <w:szCs w:val="22"/>
+                <w:u w:val="none"/>
+                <w:shd w:fill="auto" w:val="clear"/>
+                <w:vertAlign w:val="baseline"/>
+                <w:rtl w:val="0"/>
+              </w:rPr>
+              <w:t xml:space="preserve">Objetivo general</w:t>
+              <w:tab/>
+              <w:t xml:space="preserve">6</w:t>
+            </w:r>
+          </w:hyperlink>
+          <w:r>
+            <w:rPr>
+              <w:rtl w:val="0"/>
+            </w:rPr>
+          </w:r>
+        </w:p>
+        <w:p>
+          <w:pPr>
+            <w:widowControl w:val="0"/>
+            <w:tabs>
+              <w:tab w:val="right" w:leader="none" w:pos="12000"/>
+            </w:tabs>
+            <w:spacing w:before="60" w:line="240" w:lineRule="auto"/>
+            <w:ind w:left="360" w:firstLine="0"/>
+            <w:rPr>
+              <w:rFonts w:ascii="Arial" w:cs="Arial" w:eastAsia="Arial" w:hAnsi="Arial"/>
+              <w:b w:val="0"/>
+              <w:bCs w:val="0"/>
+              <w:i w:val="0"/>
+              <w:iCs w:val="0"/>
+              <w:smallCaps w:val="0"/>
+              <w:strike w:val="0"/>
+              <w:color w:val="000000"/>
+              <w:sz w:val="22"/>
+              <w:szCs w:val="22"/>
+              <w:u w:val="none"/>
+              <w:shd w:fill="auto" w:val="clear"/>
+              <w:vertAlign w:val="baseline"/>
+            </w:rPr>
+          </w:pPr>
+          <w:hyperlink w:anchor="">
+            <w:r>
+              <w:rPr>
+                <w:rFonts w:ascii="Arial" w:cs="Arial" w:eastAsia="Arial" w:hAnsi="Arial"/>
+                <w:b w:val="0"/>
+                <w:bCs w:val="0"/>
+                <w:i w:val="0"/>
+                <w:iCs w:val="0"/>
+                <w:smallCaps w:val="0"/>
+                <w:strike w:val="0"/>
+                <w:color w:val="000000"/>
+                <w:sz w:val="22"/>
+                <w:szCs w:val="22"/>
+                <w:u w:val="none"/>
+                <w:shd w:fill="auto" w:val="clear"/>
+                <w:vertAlign w:val="baseline"/>
+                <w:rtl w:val="0"/>
+              </w:rPr>
+              <w:t xml:space="preserve">Objetivos específicos</w:t>
+              <w:tab/>
+              <w:t xml:space="preserve">6</w:t>
+            </w:r>
+          </w:hyperlink>
+          <w:r>
+            <w:rPr>
+              <w:rtl w:val="0"/>
+            </w:rPr>
+          </w:r>
+        </w:p>
+        <w:p>
+          <w:pPr>
+            <w:widowControl w:val="0"/>
+            <w:tabs>
+              <w:tab w:val="right" w:leader="none" w:pos="12000"/>
+            </w:tabs>
+            <w:spacing w:before="60" w:line="240" w:lineRule="auto"/>
+            <w:ind w:firstLine="0"/>
+            <w:rPr>
+              <w:rFonts w:ascii="Arial" w:cs="Arial" w:eastAsia="Arial" w:hAnsi="Arial"/>
+              <w:b w:val="1"/>
+              <w:bCs w:val="1"/>
+              <w:i w:val="0"/>
+              <w:iCs w:val="0"/>
+              <w:smallCaps w:val="0"/>
+              <w:strike w:val="0"/>
+              <w:color w:val="000000"/>
+              <w:sz w:val="22"/>
+              <w:szCs w:val="22"/>
+              <w:u w:val="none"/>
+              <w:shd w:fill="auto" w:val="clear"/>
+              <w:vertAlign w:val="baseline"/>
+            </w:rPr>
+          </w:pPr>
+          <w:hyperlink w:anchor="">
+            <w:r>
+              <w:rPr>
+                <w:rFonts w:ascii="Arial" w:cs="Arial" w:eastAsia="Arial" w:hAnsi="Arial"/>
+                <w:b w:val="1"/>
+                <w:bCs w:val="1"/>
+                <w:i w:val="0"/>
+                <w:iCs w:val="0"/>
+                <w:smallCaps w:val="0"/>
+                <w:strike w:val="0"/>
+                <w:color w:val="000000"/>
+                <w:sz w:val="22"/>
+                <w:szCs w:val="22"/>
+                <w:u w:val="none"/>
+                <w:shd w:fill="auto" w:val="clear"/>
+                <w:vertAlign w:val="baseline"/>
+                <w:rtl w:val="0"/>
+              </w:rPr>
+              <w:t xml:space="preserve">Introducción</w:t>
+              <w:tab/>
+              <w:t xml:space="preserve">7</w:t>
+            </w:r>
+          </w:hyperlink>
+          <w:r>
+            <w:rPr>
+              <w:rtl w:val="0"/>
+            </w:rPr>
+          </w:r>
+        </w:p>
+        <w:p>
+          <w:pPr>
+            <w:widowControl w:val="0"/>
+            <w:tabs>
+              <w:tab w:val="right" w:leader="none" w:pos="12000"/>
+            </w:tabs>
+            <w:spacing w:before="60" w:line="240" w:lineRule="auto"/>
+            <w:ind w:firstLine="0"/>
+            <w:rPr>
+              <w:rFonts w:ascii="Arial" w:cs="Arial" w:eastAsia="Arial" w:hAnsi="Arial"/>
+              <w:b w:val="1"/>
+              <w:bCs w:val="1"/>
+              <w:i w:val="0"/>
+              <w:iCs w:val="0"/>
+              <w:smallCaps w:val="0"/>
+              <w:strike w:val="0"/>
+              <w:color w:val="000000"/>
+              <w:sz w:val="22"/>
+              <w:szCs w:val="22"/>
+              <w:u w:val="none"/>
+              <w:shd w:fill="auto" w:val="clear"/>
+              <w:vertAlign w:val="baseline"/>
+            </w:rPr>
+          </w:pPr>
+          <w:hyperlink w:anchor="">
+            <w:r>
+              <w:rPr>
+                <w:rFonts w:ascii="Arial" w:cs="Arial" w:eastAsia="Arial" w:hAnsi="Arial"/>
+                <w:b w:val="1"/>
+                <w:bCs w:val="1"/>
+                <w:i w:val="0"/>
+                <w:iCs w:val="0"/>
+                <w:smallCaps w:val="0"/>
+                <w:strike w:val="0"/>
+                <w:color w:val="000000"/>
+                <w:sz w:val="22"/>
+                <w:szCs w:val="22"/>
+                <w:u w:val="none"/>
+                <w:shd w:fill="auto" w:val="clear"/>
+                <w:vertAlign w:val="baseline"/>
+                <w:rtl w:val="0"/>
+              </w:rPr>
+              <w:t xml:space="preserve">Planteamiento del problema</w:t>
+              <w:tab/>
+              <w:t xml:space="preserve">8</w:t>
+            </w:r>
+          </w:hyperlink>
+          <w:r>
+            <w:rPr>
+              <w:rtl w:val="0"/>
+            </w:rPr>
+          </w:r>
+        </w:p>
+        <w:p>
+          <w:pPr>
+            <w:widowControl w:val="0"/>
+            <w:tabs>
+              <w:tab w:val="right" w:leader="none" w:pos="12000"/>
+            </w:tabs>
+            <w:spacing w:before="60" w:line="240" w:lineRule="auto"/>
+            <w:ind w:left="360" w:firstLine="0"/>
+            <w:rPr>
+              <w:rFonts w:ascii="Arial" w:cs="Arial" w:eastAsia="Arial" w:hAnsi="Arial"/>
+              <w:b w:val="0"/>
+              <w:bCs w:val="0"/>
+              <w:i w:val="0"/>
+              <w:iCs w:val="0"/>
+              <w:smallCaps w:val="0"/>
+              <w:strike w:val="0"/>
+              <w:color w:val="000000"/>
+              <w:sz w:val="22"/>
+              <w:szCs w:val="22"/>
+              <w:u w:val="none"/>
+              <w:shd w:fill="auto" w:val="clear"/>
+              <w:vertAlign w:val="baseline"/>
+            </w:rPr>
+          </w:pPr>
+          <w:hyperlink w:anchor="">
+            <w:r>
+              <w:rPr>
+                <w:rFonts w:ascii="Arial" w:cs="Arial" w:eastAsia="Arial" w:hAnsi="Arial"/>
+                <w:b w:val="0"/>
+                <w:bCs w:val="0"/>
+                <w:i w:val="0"/>
+                <w:iCs w:val="0"/>
+                <w:smallCaps w:val="0"/>
+                <w:strike w:val="0"/>
+                <w:color w:val="000000"/>
+                <w:sz w:val="22"/>
+                <w:szCs w:val="22"/>
+                <w:u w:val="none"/>
+                <w:shd w:fill="auto" w:val="clear"/>
+                <w:vertAlign w:val="baseline"/>
+                <w:rtl w:val="0"/>
+              </w:rPr>
+              <w:t xml:space="preserve">Necesidad</w:t>
+              <w:tab/>
+              <w:t xml:space="preserve">8</w:t>
+            </w:r>
+          </w:hyperlink>
+          <w:r>
+            <w:rPr>
+              <w:rtl w:val="0"/>
+            </w:rPr>
+          </w:r>
+        </w:p>
+        <w:p>
+          <w:pPr>
+            <w:widowControl w:val="0"/>
+            <w:tabs>
+              <w:tab w:val="right" w:leader="none" w:pos="12000"/>
+            </w:tabs>
+            <w:spacing w:before="60" w:line="240" w:lineRule="auto"/>
+            <w:ind w:left="360" w:firstLine="0"/>
+            <w:rPr>
+              <w:rFonts w:ascii="Arial" w:cs="Arial" w:eastAsia="Arial" w:hAnsi="Arial"/>
+              <w:b w:val="0"/>
+              <w:bCs w:val="0"/>
+              <w:i w:val="0"/>
+              <w:iCs w:val="0"/>
+              <w:smallCaps w:val="0"/>
+              <w:strike w:val="0"/>
+              <w:color w:val="000000"/>
+              <w:sz w:val="22"/>
+              <w:szCs w:val="22"/>
+              <w:u w:val="none"/>
+              <w:shd w:fill="auto" w:val="clear"/>
+              <w:vertAlign w:val="baseline"/>
+            </w:rPr>
+          </w:pPr>
+          <w:hyperlink w:anchor="">
+            <w:r>
+              <w:rPr>
+                <w:rFonts w:ascii="Arial" w:cs="Arial" w:eastAsia="Arial" w:hAnsi="Arial"/>
+                <w:b w:val="0"/>
+                <w:bCs w:val="0"/>
+                <w:i w:val="0"/>
+                <w:iCs w:val="0"/>
+                <w:smallCaps w:val="0"/>
+                <w:strike w:val="0"/>
+                <w:color w:val="000000"/>
+                <w:sz w:val="22"/>
+                <w:szCs w:val="22"/>
+                <w:u w:val="none"/>
+                <w:shd w:fill="auto" w:val="clear"/>
+                <w:vertAlign w:val="baseline"/>
+                <w:rtl w:val="0"/>
+              </w:rPr>
+              <w:t xml:space="preserve">Manejo actual</w:t>
+              <w:tab/>
+              <w:t xml:space="preserve">8</w:t>
+            </w:r>
+          </w:hyperlink>
+          <w:r>
+            <w:rPr>
+              <w:rtl w:val="0"/>
+            </w:rPr>
+          </w:r>
+        </w:p>
+        <w:p>
+          <w:pPr>
+            <w:widowControl w:val="0"/>
+            <w:tabs>
+              <w:tab w:val="right" w:leader="none" w:pos="12000"/>
+            </w:tabs>
+            <w:spacing w:before="60" w:line="240" w:lineRule="auto"/>
+            <w:ind w:left="360" w:firstLine="0"/>
+            <w:rPr>
+              <w:rFonts w:ascii="Arial" w:cs="Arial" w:eastAsia="Arial" w:hAnsi="Arial"/>
+              <w:b w:val="0"/>
+              <w:bCs w:val="0"/>
+              <w:i w:val="0"/>
+              <w:iCs w:val="0"/>
+              <w:smallCaps w:val="0"/>
+              <w:strike w:val="0"/>
+              <w:color w:val="000000"/>
+              <w:sz w:val="22"/>
+              <w:szCs w:val="22"/>
+              <w:u w:val="none"/>
+              <w:shd w:fill="auto" w:val="clear"/>
+              <w:vertAlign w:val="baseline"/>
+            </w:rPr>
+          </w:pPr>
+          <w:hyperlink w:anchor="">
+            <w:r>
+              <w:rPr>
+                <w:rFonts w:ascii="Arial" w:cs="Arial" w:eastAsia="Arial" w:hAnsi="Arial"/>
+                <w:b w:val="0"/>
+                <w:bCs w:val="0"/>
+                <w:i w:val="0"/>
+                <w:iCs w:val="0"/>
+                <w:smallCaps w:val="0"/>
+                <w:strike w:val="0"/>
+                <w:color w:val="000000"/>
+                <w:sz w:val="22"/>
+                <w:szCs w:val="22"/>
+                <w:u w:val="none"/>
+                <w:shd w:fill="auto" w:val="clear"/>
+                <w:vertAlign w:val="baseline"/>
+                <w:rtl w:val="0"/>
+              </w:rPr>
+              <w:t xml:space="preserve">Solución propuesta: Planificador de Menús y Lista de Mercado</w:t>
+              <w:tab/>
+              <w:t xml:space="preserve">8</w:t>
+            </w:r>
+          </w:hyperlink>
+          <w:r>
+            <w:rPr>
+              <w:rtl w:val="0"/>
+            </w:rPr>
+          </w:r>
+        </w:p>
+        <w:p>
+          <w:pPr>
+            <w:widowControl w:val="0"/>
+            <w:tabs>
+              <w:tab w:val="right" w:leader="none" w:pos="12000"/>
+            </w:tabs>
+            <w:spacing w:before="60" w:line="240" w:lineRule="auto"/>
+            <w:ind w:firstLine="0"/>
+            <w:rPr>
+              <w:rFonts w:ascii="Arial" w:cs="Arial" w:eastAsia="Arial" w:hAnsi="Arial"/>
+              <w:b w:val="1"/>
+              <w:bCs w:val="1"/>
+              <w:i w:val="0"/>
+              <w:iCs w:val="0"/>
+              <w:smallCaps w:val="0"/>
+              <w:strike w:val="0"/>
+              <w:color w:val="000000"/>
+              <w:sz w:val="22"/>
+              <w:szCs w:val="22"/>
+              <w:u w:val="none"/>
+              <w:shd w:fill="auto" w:val="clear"/>
+              <w:vertAlign w:val="baseline"/>
+            </w:rPr>
+          </w:pPr>
+          <w:hyperlink w:anchor="">
+            <w:r>
+              <w:rPr>
+                <w:rFonts w:ascii="Arial" w:cs="Arial" w:eastAsia="Arial" w:hAnsi="Arial"/>
+                <w:b w:val="1"/>
+                <w:bCs w:val="1"/>
+                <w:i w:val="0"/>
+                <w:iCs w:val="0"/>
+                <w:smallCaps w:val="0"/>
+                <w:strike w:val="0"/>
+                <w:color w:val="000000"/>
+                <w:sz w:val="22"/>
+                <w:szCs w:val="22"/>
+                <w:u w:val="none"/>
+                <w:shd w:fill="auto" w:val="clear"/>
+                <w:vertAlign w:val="baseline"/>
+                <w:rtl w:val="0"/>
+              </w:rPr>
+              <w:t xml:space="preserve">Requisitos del sistema</w:t>
+              <w:tab/>
+              <w:t xml:space="preserve">9</w:t>
+            </w:r>
+          </w:hyperlink>
+          <w:r>
+            <w:rPr>
+              <w:rtl w:val="0"/>
+            </w:rPr>
+          </w:r>
+        </w:p>
+        <w:p>
+          <w:pPr>
+            <w:widowControl w:val="0"/>
+            <w:tabs>
+              <w:tab w:val="right" w:leader="none" w:pos="12000"/>
+            </w:tabs>
+            <w:spacing w:before="60" w:line="240" w:lineRule="auto"/>
+            <w:ind w:left="360" w:firstLine="0"/>
+            <w:rPr>
+              <w:rFonts w:ascii="Arial" w:cs="Arial" w:eastAsia="Arial" w:hAnsi="Arial"/>
+              <w:b w:val="0"/>
+              <w:bCs w:val="0"/>
+              <w:i w:val="0"/>
+              <w:iCs w:val="0"/>
+              <w:smallCaps w:val="0"/>
+              <w:strike w:val="0"/>
+              <w:color w:val="000000"/>
+              <w:sz w:val="22"/>
+              <w:szCs w:val="22"/>
+              <w:u w:val="none"/>
+              <w:shd w:fill="auto" w:val="clear"/>
+              <w:vertAlign w:val="baseline"/>
+            </w:rPr>
+          </w:pPr>
+          <w:hyperlink w:anchor="">
+            <w:r>
+              <w:rPr>
+                <w:rFonts w:ascii="Arial" w:cs="Arial" w:eastAsia="Arial" w:hAnsi="Arial"/>
+                <w:b w:val="0"/>
+                <w:bCs w:val="0"/>
+                <w:i w:val="0"/>
+                <w:iCs w:val="0"/>
+                <w:smallCaps w:val="0"/>
+                <w:strike w:val="0"/>
+                <w:color w:val="000000"/>
+                <w:sz w:val="22"/>
+                <w:szCs w:val="22"/>
+                <w:u w:val="none"/>
+                <w:shd w:fill="auto" w:val="clear"/>
+                <w:vertAlign w:val="baseline"/>
+                <w:rtl w:val="0"/>
+              </w:rPr>
+              <w:t xml:space="preserve">Requisitos funcionales</w:t>
+              <w:tab/>
+              <w:t xml:space="preserve">9</w:t>
+            </w:r>
+          </w:hyperlink>
+          <w:r>
+            <w:rPr>
+              <w:rtl w:val="0"/>
+            </w:rPr>
+          </w:r>
+        </w:p>
+        <w:p>
+          <w:pPr>
+            <w:widowControl w:val="0"/>
+            <w:tabs>
+              <w:tab w:val="right" w:leader="none" w:pos="12000"/>
+            </w:tabs>
+            <w:spacing w:before="60" w:line="240" w:lineRule="auto"/>
+            <w:ind w:left="360" w:firstLine="0"/>
+            <w:rPr>
+              <w:rFonts w:ascii="Arial" w:cs="Arial" w:eastAsia="Arial" w:hAnsi="Arial"/>
+              <w:b w:val="0"/>
+              <w:bCs w:val="0"/>
+              <w:i w:val="0"/>
+              <w:iCs w:val="0"/>
+              <w:smallCaps w:val="0"/>
+              <w:strike w:val="0"/>
+              <w:color w:val="000000"/>
+              <w:sz w:val="22"/>
+              <w:szCs w:val="22"/>
+              <w:u w:val="none"/>
+              <w:shd w:fill="auto" w:val="clear"/>
+              <w:vertAlign w:val="baseline"/>
+            </w:rPr>
+          </w:pPr>
+          <w:hyperlink w:anchor="">
+            <w:r>
+              <w:rPr>
+                <w:rFonts w:ascii="Arial" w:cs="Arial" w:eastAsia="Arial" w:hAnsi="Arial"/>
+                <w:b w:val="0"/>
+                <w:bCs w:val="0"/>
+                <w:i w:val="0"/>
+                <w:iCs w:val="0"/>
+                <w:smallCaps w:val="0"/>
+                <w:strike w:val="0"/>
+                <w:color w:val="000000"/>
+                <w:sz w:val="22"/>
+                <w:szCs w:val="22"/>
+                <w:u w:val="none"/>
+                <w:shd w:fill="auto" w:val="clear"/>
+                <w:vertAlign w:val="baseline"/>
+                <w:rtl w:val="0"/>
+              </w:rPr>
+              <w:t xml:space="preserve">Requisitos no funcionales</w:t>
+              <w:tab/>
+              <w:t xml:space="preserve">10</w:t>
+            </w:r>
+          </w:hyperlink>
+          <w:r>
+            <w:rPr>
+              <w:rtl w:val="0"/>
+            </w:rPr>
+          </w:r>
+        </w:p>
+        <w:p>
+          <w:pPr>
+            <w:widowControl w:val="0"/>
+            <w:tabs>
+              <w:tab w:val="right" w:leader="none" w:pos="12000"/>
+            </w:tabs>
+            <w:spacing w:before="60" w:line="240" w:lineRule="auto"/>
+            <w:ind w:firstLine="0"/>
+            <w:rPr>
+              <w:rFonts w:ascii="Arial" w:cs="Arial" w:eastAsia="Arial" w:hAnsi="Arial"/>
+              <w:b w:val="1"/>
+              <w:bCs w:val="1"/>
+              <w:i w:val="0"/>
+              <w:iCs w:val="0"/>
+              <w:smallCaps w:val="0"/>
+              <w:strike w:val="0"/>
+              <w:color w:val="000000"/>
+              <w:sz w:val="22"/>
+              <w:szCs w:val="22"/>
+              <w:u w:val="none"/>
+              <w:shd w:fill="auto" w:val="clear"/>
+              <w:vertAlign w:val="baseline"/>
+            </w:rPr>
+          </w:pPr>
+          <w:hyperlink w:anchor="">
+            <w:r>
+              <w:rPr>
+                <w:rFonts w:ascii="Arial" w:cs="Arial" w:eastAsia="Arial" w:hAnsi="Arial"/>
+                <w:b w:val="1"/>
+                <w:bCs w:val="1"/>
+                <w:i w:val="0"/>
+                <w:iCs w:val="0"/>
+                <w:smallCaps w:val="0"/>
+                <w:strike w:val="0"/>
+                <w:color w:val="000000"/>
+                <w:sz w:val="22"/>
+                <w:szCs w:val="22"/>
+                <w:u w:val="none"/>
+                <w:shd w:fill="auto" w:val="clear"/>
+                <w:vertAlign w:val="baseline"/>
+                <w:rtl w:val="0"/>
+              </w:rPr>
+              <w:t xml:space="preserve">Arquitectura y relación Frontend–Backend</w:t>
+              <w:tab/>
+              <w:t xml:space="preserve">11</w:t>
+            </w:r>
+          </w:hyperlink>
+          <w:r>
+            <w:rPr>
+              <w:rtl w:val="0"/>
+            </w:rPr>
+          </w:r>
+        </w:p>
+        <w:p>
+          <w:pPr>
+            <w:widowControl w:val="0"/>
+            <w:tabs>
+              <w:tab w:val="right" w:leader="none" w:pos="12000"/>
+            </w:tabs>
+            <w:spacing w:before="60" w:line="240" w:lineRule="auto"/>
+            <w:ind w:left="360" w:firstLine="0"/>
+            <w:rPr>
+              <w:rFonts w:ascii="Arial" w:cs="Arial" w:eastAsia="Arial" w:hAnsi="Arial"/>
+              <w:b w:val="0"/>
+              <w:bCs w:val="0"/>
+              <w:i w:val="0"/>
+              <w:iCs w:val="0"/>
+              <w:smallCaps w:val="0"/>
+              <w:strike w:val="0"/>
+              <w:color w:val="000000"/>
+              <w:sz w:val="22"/>
+              <w:szCs w:val="22"/>
+              <w:u w:val="none"/>
+              <w:shd w:fill="auto" w:val="clear"/>
+              <w:vertAlign w:val="baseline"/>
+            </w:rPr>
+          </w:pPr>
+          <w:hyperlink w:anchor="">
+            <w:r>
+              <w:rPr>
+                <w:rFonts w:ascii="Arial" w:cs="Arial" w:eastAsia="Arial" w:hAnsi="Arial"/>
+                <w:b w:val="0"/>
+                <w:bCs w:val="0"/>
+                <w:i w:val="0"/>
+                <w:iCs w:val="0"/>
+                <w:smallCaps w:val="0"/>
+                <w:strike w:val="0"/>
+                <w:color w:val="000000"/>
+                <w:sz w:val="22"/>
+                <w:szCs w:val="22"/>
+                <w:u w:val="none"/>
+                <w:shd w:fill="auto" w:val="clear"/>
+                <w:vertAlign w:val="baseline"/>
+                <w:rtl w:val="0"/>
+              </w:rPr>
+              <w:t xml:space="preserve">Despliegue</w:t>
+              <w:tab/>
+              <w:t xml:space="preserve">11</w:t>
+            </w:r>
+          </w:hyperlink>
+          <w:r>
+            <w:rPr>
+              <w:rtl w:val="0"/>
+            </w:rPr>
+          </w:r>
+        </w:p>
+        <w:p>
+          <w:pPr>
+            <w:widowControl w:val="0"/>
+            <w:tabs>
+              <w:tab w:val="right" w:leader="none" w:pos="12000"/>
+            </w:tabs>
+            <w:spacing w:before="60" w:line="240" w:lineRule="auto"/>
+            <w:ind w:firstLine="0"/>
+            <w:rPr>
+              <w:rFonts w:ascii="Arial" w:cs="Arial" w:eastAsia="Arial" w:hAnsi="Arial"/>
+              <w:b w:val="1"/>
+              <w:bCs w:val="1"/>
+              <w:i w:val="0"/>
+              <w:iCs w:val="0"/>
+              <w:smallCaps w:val="0"/>
+              <w:strike w:val="0"/>
+              <w:color w:val="000000"/>
+              <w:sz w:val="22"/>
+              <w:szCs w:val="22"/>
+              <w:u w:val="none"/>
+              <w:shd w:fill="auto" w:val="clear"/>
+              <w:vertAlign w:val="baseline"/>
+            </w:rPr>
+          </w:pPr>
+          <w:hyperlink w:anchor="">
+            <w:r>
+              <w:rPr>
+                <w:rFonts w:ascii="Arial" w:cs="Arial" w:eastAsia="Arial" w:hAnsi="Arial"/>
+                <w:b w:val="1"/>
+                <w:bCs w:val="1"/>
+                <w:i w:val="0"/>
+                <w:iCs w:val="0"/>
+                <w:smallCaps w:val="0"/>
+                <w:strike w:val="0"/>
+                <w:color w:val="000000"/>
+                <w:sz w:val="22"/>
+                <w:szCs w:val="22"/>
+                <w:u w:val="none"/>
+                <w:shd w:fill="auto" w:val="clear"/>
+                <w:vertAlign w:val="baseline"/>
+                <w:rtl w:val="0"/>
+              </w:rPr>
+              <w:t xml:space="preserve">Modelo de base de datos</w:t>
+              <w:tab/>
+              <w:t xml:space="preserve">12</w:t>
+            </w:r>
+          </w:hyperlink>
+          <w:r>
+            <w:rPr>
+              <w:rtl w:val="0"/>
+            </w:rPr>
+          </w:r>
+        </w:p>
+        <w:p>
+          <w:pPr>
+            <w:widowControl w:val="0"/>
+            <w:tabs>
+              <w:tab w:val="right" w:leader="none" w:pos="12000"/>
+            </w:tabs>
+            <w:spacing w:before="60" w:line="240" w:lineRule="auto"/>
+            <w:ind w:left="360" w:firstLine="0"/>
+            <w:rPr>
+              <w:rFonts w:ascii="Arial" w:cs="Arial" w:eastAsia="Arial" w:hAnsi="Arial"/>
+              <w:b w:val="0"/>
+              <w:bCs w:val="0"/>
+              <w:i w:val="0"/>
+              <w:iCs w:val="0"/>
+              <w:smallCaps w:val="0"/>
+              <w:strike w:val="0"/>
+              <w:color w:val="000000"/>
+              <w:sz w:val="22"/>
+              <w:szCs w:val="22"/>
+              <w:u w:val="none"/>
+              <w:shd w:fill="auto" w:val="clear"/>
+              <w:vertAlign w:val="baseline"/>
+            </w:rPr>
+          </w:pPr>
+          <w:hyperlink w:anchor="">
+            <w:r>
+              <w:rPr>
+                <w:rFonts w:ascii="Arial" w:cs="Arial" w:eastAsia="Arial" w:hAnsi="Arial"/>
+                <w:b w:val="0"/>
+                <w:bCs w:val="0"/>
+                <w:i w:val="0"/>
+                <w:iCs w:val="0"/>
+                <w:smallCaps w:val="0"/>
+                <w:strike w:val="0"/>
+                <w:color w:val="000000"/>
+                <w:sz w:val="22"/>
+                <w:szCs w:val="22"/>
+                <w:u w:val="none"/>
+                <w:shd w:fill="auto" w:val="clear"/>
+                <w:vertAlign w:val="baseline"/>
+                <w:rtl w:val="0"/>
+              </w:rPr>
+              <w:t xml:space="preserve">Regla de cálculo de la lista</w:t>
+              <w:tab/>
+              <w:t xml:space="preserve">12</w:t>
+            </w:r>
+          </w:hyperlink>
+          <w:r>
+            <w:rPr>
+              <w:rtl w:val="0"/>
+            </w:rPr>
+          </w:r>
+        </w:p>
+        <w:p>
+          <w:pPr>
+            <w:widowControl w:val="0"/>
+            <w:tabs>
+              <w:tab w:val="right" w:leader="none" w:pos="12000"/>
+            </w:tabs>
+            <w:spacing w:before="60" w:line="240" w:lineRule="auto"/>
+            <w:ind w:firstLine="0"/>
+            <w:rPr>
+              <w:rFonts w:ascii="Arial" w:cs="Arial" w:eastAsia="Arial" w:hAnsi="Arial"/>
+              <w:b w:val="1"/>
+              <w:bCs w:val="1"/>
+              <w:i w:val="0"/>
+              <w:iCs w:val="0"/>
+              <w:smallCaps w:val="0"/>
+              <w:strike w:val="0"/>
+              <w:color w:val="000000"/>
+              <w:sz w:val="22"/>
+              <w:szCs w:val="22"/>
+              <w:u w:val="none"/>
+              <w:shd w:fill="auto" w:val="clear"/>
+              <w:vertAlign w:val="baseline"/>
+            </w:rPr>
+          </w:pPr>
+          <w:hyperlink w:anchor="">
+            <w:r>
+              <w:rPr>
+                <w:rFonts w:ascii="Arial" w:cs="Arial" w:eastAsia="Arial" w:hAnsi="Arial"/>
+                <w:b w:val="1"/>
+                <w:bCs w:val="1"/>
+                <w:i w:val="0"/>
+                <w:iCs w:val="0"/>
+                <w:smallCaps w:val="0"/>
+                <w:strike w:val="0"/>
+                <w:color w:val="000000"/>
+                <w:sz w:val="22"/>
+                <w:szCs w:val="22"/>
+                <w:u w:val="none"/>
+                <w:shd w:fill="auto" w:val="clear"/>
+                <w:vertAlign w:val="baseline"/>
+                <w:rtl w:val="0"/>
+              </w:rPr>
+              <w:t xml:space="preserve">Diagramación</w:t>
+              <w:tab/>
+              <w:t xml:space="preserve">13</w:t>
+            </w:r>
+          </w:hyperlink>
+          <w:r>
+            <w:rPr>
+              <w:rtl w:val="0"/>
+            </w:rPr>
+          </w:r>
+        </w:p>
+        <w:p>
+          <w:pPr>
+            <w:widowControl w:val="0"/>
+            <w:tabs>
+              <w:tab w:val="right" w:leader="none" w:pos="12000"/>
+            </w:tabs>
+            <w:spacing w:before="60" w:line="240" w:lineRule="auto"/>
+            <w:ind w:left="360" w:firstLine="0"/>
+            <w:rPr>
+              <w:rFonts w:ascii="Arial" w:cs="Arial" w:eastAsia="Arial" w:hAnsi="Arial"/>
+              <w:b w:val="0"/>
+              <w:bCs w:val="0"/>
+              <w:i w:val="0"/>
+              <w:iCs w:val="0"/>
+              <w:smallCaps w:val="0"/>
+              <w:strike w:val="0"/>
+              <w:color w:val="000000"/>
+              <w:sz w:val="22"/>
+              <w:szCs w:val="22"/>
+              <w:u w:val="none"/>
+              <w:shd w:fill="auto" w:val="clear"/>
+              <w:vertAlign w:val="baseline"/>
+            </w:rPr>
+          </w:pPr>
+          <w:hyperlink w:anchor="">
+            <w:r>
+              <w:rPr>
+                <w:rFonts w:ascii="Arial" w:cs="Arial" w:eastAsia="Arial" w:hAnsi="Arial"/>
+                <w:b w:val="0"/>
+                <w:bCs w:val="0"/>
+                <w:i w:val="0"/>
+                <w:iCs w:val="0"/>
+                <w:smallCaps w:val="0"/>
+                <w:strike w:val="0"/>
+                <w:color w:val="000000"/>
+                <w:sz w:val="22"/>
+                <w:szCs w:val="22"/>
+                <w:u w:val="none"/>
+                <w:shd w:fill="auto" w:val="clear"/>
+                <w:vertAlign w:val="baseline"/>
+                <w:rtl w:val="0"/>
+              </w:rPr>
+              <w:t xml:space="preserve">Casos de uso</w:t>
+              <w:tab/>
+              <w:t xml:space="preserve">13</w:t>
+            </w:r>
+          </w:hyperlink>
+          <w:r>
+            <w:rPr>
+              <w:rtl w:val="0"/>
+            </w:rPr>
+          </w:r>
+        </w:p>
+        <w:p>
+          <w:pPr>
+            <w:widowControl w:val="0"/>
+            <w:tabs>
+              <w:tab w:val="right" w:leader="none" w:pos="12000"/>
+            </w:tabs>
+            <w:spacing w:before="60" w:line="240" w:lineRule="auto"/>
+            <w:ind w:left="360" w:firstLine="0"/>
+            <w:rPr>
+              <w:rFonts w:ascii="Arial" w:cs="Arial" w:eastAsia="Arial" w:hAnsi="Arial"/>
+              <w:b w:val="0"/>
+              <w:bCs w:val="0"/>
+              <w:i w:val="0"/>
+              <w:iCs w:val="0"/>
+              <w:smallCaps w:val="0"/>
+              <w:strike w:val="0"/>
+              <w:color w:val="000000"/>
+              <w:sz w:val="22"/>
+              <w:szCs w:val="22"/>
+              <w:u w:val="none"/>
+              <w:shd w:fill="auto" w:val="clear"/>
+              <w:vertAlign w:val="baseline"/>
+            </w:rPr>
+          </w:pPr>
+          <w:hyperlink w:anchor="">
+            <w:r>
+              <w:rPr>
+                <w:rFonts w:ascii="Arial" w:cs="Arial" w:eastAsia="Arial" w:hAnsi="Arial"/>
+                <w:b w:val="0"/>
+                <w:bCs w:val="0"/>
+                <w:i w:val="0"/>
+                <w:iCs w:val="0"/>
+                <w:smallCaps w:val="0"/>
+                <w:strike w:val="0"/>
+                <w:color w:val="000000"/>
+                <w:sz w:val="22"/>
+                <w:szCs w:val="22"/>
+                <w:u w:val="none"/>
+                <w:shd w:fill="auto" w:val="clear"/>
+                <w:vertAlign w:val="baseline"/>
+                <w:rtl w:val="0"/>
+              </w:rPr>
+              <w:t xml:space="preserve">Modelo relacional</w:t>
+              <w:tab/>
+              <w:t xml:space="preserve">13</w:t>
+            </w:r>
+          </w:hyperlink>
+          <w:r>
+            <w:rPr>
+              <w:rtl w:val="0"/>
+            </w:rPr>
+          </w:r>
+        </w:p>
+        <w:p>
+          <w:pPr>
+            <w:widowControl w:val="0"/>
+            <w:tabs>
+              <w:tab w:val="right" w:leader="none" w:pos="12000"/>
+            </w:tabs>
+            <w:spacing w:before="60" w:line="240" w:lineRule="auto"/>
+            <w:ind w:firstLine="0"/>
+            <w:rPr>
+              <w:rFonts w:ascii="Arial" w:cs="Arial" w:eastAsia="Arial" w:hAnsi="Arial"/>
+              <w:b w:val="1"/>
+              <w:bCs w:val="1"/>
+              <w:i w:val="0"/>
+              <w:iCs w:val="0"/>
+              <w:smallCaps w:val="0"/>
+              <w:strike w:val="0"/>
+              <w:color w:val="000000"/>
+              <w:sz w:val="22"/>
+              <w:szCs w:val="22"/>
+              <w:u w:val="none"/>
+              <w:shd w:fill="auto" w:val="clear"/>
+              <w:vertAlign w:val="baseline"/>
+            </w:rPr>
+          </w:pPr>
+          <w:hyperlink w:anchor="">
+            <w:r>
+              <w:rPr>
+                <w:rFonts w:ascii="Arial" w:cs="Arial" w:eastAsia="Arial" w:hAnsi="Arial"/>
+                <w:b w:val="1"/>
+                <w:bCs w:val="1"/>
+                <w:i w:val="0"/>
+                <w:iCs w:val="0"/>
+                <w:smallCaps w:val="0"/>
+                <w:strike w:val="0"/>
+                <w:color w:val="000000"/>
+                <w:sz w:val="22"/>
+                <w:szCs w:val="22"/>
+                <w:u w:val="none"/>
+                <w:shd w:fill="auto" w:val="clear"/>
+                <w:vertAlign w:val="baseline"/>
+                <w:rtl w:val="0"/>
+              </w:rPr>
+              <w:t xml:space="preserve">Alcance</w:t>
+              <w:tab/>
+              <w:t xml:space="preserve">14</w:t>
+            </w:r>
+          </w:hyperlink>
+          <w:r>
+            <w:rPr>
+              <w:rtl w:val="0"/>
+            </w:rPr>
+          </w:r>
+        </w:p>
+        <w:p>
+          <w:pPr>
+            <w:widowControl w:val="0"/>
+            <w:tabs>
+              <w:tab w:val="right" w:leader="none" w:pos="12000"/>
+            </w:tabs>
+            <w:spacing w:before="60" w:line="240" w:lineRule="auto"/>
+            <w:ind w:left="360" w:firstLine="0"/>
+            <w:rPr>
+              <w:rFonts w:ascii="Arial" w:cs="Arial" w:eastAsia="Arial" w:hAnsi="Arial"/>
+              <w:b w:val="0"/>
+              <w:bCs w:val="0"/>
+              <w:i w:val="0"/>
+              <w:iCs w:val="0"/>
+              <w:smallCaps w:val="0"/>
+              <w:strike w:val="0"/>
+              <w:color w:val="000000"/>
+              <w:sz w:val="22"/>
+              <w:szCs w:val="22"/>
+              <w:u w:val="none"/>
+              <w:shd w:fill="auto" w:val="clear"/>
+              <w:vertAlign w:val="baseline"/>
+            </w:rPr>
+          </w:pPr>
+          <w:hyperlink w:anchor="">
+            <w:r>
+              <w:rPr>
+                <w:rFonts w:ascii="Arial" w:cs="Arial" w:eastAsia="Arial" w:hAnsi="Arial"/>
+                <w:b w:val="0"/>
+                <w:bCs w:val="0"/>
+                <w:i w:val="0"/>
+                <w:iCs w:val="0"/>
+                <w:smallCaps w:val="0"/>
+                <w:strike w:val="0"/>
+                <w:color w:val="000000"/>
+                <w:sz w:val="22"/>
+                <w:szCs w:val="22"/>
+                <w:u w:val="none"/>
+                <w:shd w:fill="auto" w:val="clear"/>
+                <w:vertAlign w:val="baseline"/>
+                <w:rtl w:val="0"/>
+              </w:rPr>
+              <w:t xml:space="preserve">Entregable final</w:t>
+              <w:tab/>
+              <w:t xml:space="preserve">14</w:t>
+            </w:r>
+          </w:hyperlink>
+          <w:r>
+            <w:rPr>
+              <w:rtl w:val="0"/>
+            </w:rPr>
+          </w:r>
+        </w:p>
+        <w:p>
+          <w:pPr>
+            <w:widowControl w:val="0"/>
+            <w:tabs>
+              <w:tab w:val="right" w:leader="none" w:pos="12000"/>
+            </w:tabs>
+            <w:spacing w:before="60" w:line="240" w:lineRule="auto"/>
+            <w:ind w:left="360" w:firstLine="0"/>
+            <w:rPr>
+              <w:rFonts w:ascii="Arial" w:cs="Arial" w:eastAsia="Arial" w:hAnsi="Arial"/>
+              <w:b w:val="0"/>
+              <w:bCs w:val="0"/>
+              <w:i w:val="0"/>
+              <w:iCs w:val="0"/>
+              <w:smallCaps w:val="0"/>
+              <w:strike w:val="0"/>
+              <w:color w:val="000000"/>
+              <w:sz w:val="22"/>
+              <w:szCs w:val="22"/>
+              <w:u w:val="none"/>
+              <w:shd w:fill="auto" w:val="clear"/>
+              <w:vertAlign w:val="baseline"/>
+            </w:rPr>
+          </w:pPr>
+          <w:hyperlink w:anchor="">
+            <w:r>
+              <w:rPr>
+                <w:rFonts w:ascii="Arial" w:cs="Arial" w:eastAsia="Arial" w:hAnsi="Arial"/>
+                <w:b w:val="0"/>
+                <w:bCs w:val="0"/>
+                <w:i w:val="0"/>
+                <w:iCs w:val="0"/>
+                <w:smallCaps w:val="0"/>
+                <w:strike w:val="0"/>
+                <w:color w:val="000000"/>
+                <w:sz w:val="22"/>
+                <w:szCs w:val="22"/>
+                <w:u w:val="none"/>
+                <w:shd w:fill="auto" w:val="clear"/>
+                <w:vertAlign w:val="baseline"/>
+                <w:rtl w:val="0"/>
+              </w:rPr>
+              <w:t xml:space="preserve">Inclusiones</w:t>
+              <w:tab/>
+              <w:t xml:space="preserve">14</w:t>
+            </w:r>
+          </w:hyperlink>
+          <w:r>
+            <w:rPr>
+              <w:rtl w:val="0"/>
+            </w:rPr>
+          </w:r>
+        </w:p>
+        <w:p>
+          <w:pPr>
+            <w:widowControl w:val="0"/>
+            <w:tabs>
+              <w:tab w:val="right" w:leader="none" w:pos="12000"/>
+            </w:tabs>
+            <w:spacing w:before="60" w:line="240" w:lineRule="auto"/>
+            <w:ind w:left="360" w:firstLine="0"/>
+            <w:rPr>
+              <w:rFonts w:ascii="Arial" w:cs="Arial" w:eastAsia="Arial" w:hAnsi="Arial"/>
+              <w:b w:val="0"/>
+              <w:bCs w:val="0"/>
+              <w:i w:val="0"/>
+              <w:iCs w:val="0"/>
+              <w:smallCaps w:val="0"/>
+              <w:strike w:val="0"/>
+              <w:color w:val="000000"/>
+              <w:sz w:val="22"/>
+              <w:szCs w:val="22"/>
+              <w:u w:val="none"/>
+              <w:shd w:fill="auto" w:val="clear"/>
+              <w:vertAlign w:val="baseline"/>
+            </w:rPr>
+          </w:pPr>
+          <w:hyperlink w:anchor="">
+            <w:r>
+              <w:rPr>
+                <w:rFonts w:ascii="Arial" w:cs="Arial" w:eastAsia="Arial" w:hAnsi="Arial"/>
+                <w:b w:val="0"/>
+                <w:bCs w:val="0"/>
+                <w:i w:val="0"/>
+                <w:iCs w:val="0"/>
+                <w:smallCaps w:val="0"/>
+                <w:strike w:val="0"/>
+                <w:color w:val="000000"/>
+                <w:sz w:val="22"/>
+                <w:szCs w:val="22"/>
+                <w:u w:val="none"/>
+                <w:shd w:fill="auto" w:val="clear"/>
+                <w:vertAlign w:val="baseline"/>
+                <w:rtl w:val="0"/>
+              </w:rPr>
+              <w:t xml:space="preserve">Exclusiones</w:t>
+              <w:tab/>
+              <w:t xml:space="preserve">14</w:t>
+            </w:r>
+          </w:hyperlink>
+          <w:r>
+            <w:rPr>
+              <w:rtl w:val="0"/>
+            </w:rPr>
+          </w:r>
+        </w:p>
+        <w:p>
+          <w:pPr>
+            <w:widowControl w:val="0"/>
+            <w:tabs>
+              <w:tab w:val="right" w:leader="none" w:pos="12000"/>
+            </w:tabs>
+            <w:spacing w:before="60" w:line="240" w:lineRule="auto"/>
+            <w:ind w:firstLine="0"/>
+            <w:rPr>
+              <w:rFonts w:ascii="Arial" w:cs="Arial" w:eastAsia="Arial" w:hAnsi="Arial"/>
+              <w:b w:val="1"/>
+              <w:bCs w:val="1"/>
+              <w:i w:val="0"/>
+              <w:iCs w:val="0"/>
+              <w:smallCaps w:val="0"/>
+              <w:strike w:val="0"/>
+              <w:color w:val="000000"/>
+              <w:sz w:val="22"/>
+              <w:szCs w:val="22"/>
+              <w:u w:val="none"/>
+              <w:shd w:fill="auto" w:val="clear"/>
+              <w:vertAlign w:val="baseline"/>
+            </w:rPr>
+          </w:pPr>
+          <w:hyperlink w:anchor="">
+            <w:r>
+              <w:rPr>
+                <w:rFonts w:ascii="Arial" w:cs="Arial" w:eastAsia="Arial" w:hAnsi="Arial"/>
+                <w:b w:val="1"/>
+                <w:bCs w:val="1"/>
+                <w:i w:val="0"/>
+                <w:iCs w:val="0"/>
+                <w:smallCaps w:val="0"/>
+                <w:strike w:val="0"/>
+                <w:color w:val="000000"/>
+                <w:sz w:val="22"/>
+                <w:szCs w:val="22"/>
+                <w:u w:val="none"/>
+                <w:shd w:fill="auto" w:val="clear"/>
+                <w:vertAlign w:val="baseline"/>
+                <w:rtl w:val="0"/>
+              </w:rPr>
+              <w:t xml:space="preserve">Stack tecnológico</w:t>
+              <w:tab/>
+              <w:t xml:space="preserve">16</w:t>
+            </w:r>
+          </w:hyperlink>
+          <w:r>
+            <w:rPr>
+              <w:rtl w:val="0"/>
+            </w:rPr>
+          </w:r>
+        </w:p>
+        <w:p>
+          <w:pPr>
+            <w:widowControl w:val="0"/>
+            <w:tabs>
+              <w:tab w:val="right" w:leader="none" w:pos="12000"/>
+            </w:tabs>
+            <w:spacing w:before="60" w:line="240" w:lineRule="auto"/>
+            <w:ind w:firstLine="0"/>
+            <w:rPr>
+              <w:rFonts w:ascii="Arial" w:cs="Arial" w:eastAsia="Arial" w:hAnsi="Arial"/>
+              <w:b w:val="1"/>
+              <w:bCs w:val="1"/>
+              <w:i w:val="0"/>
+              <w:iCs w:val="0"/>
+              <w:smallCaps w:val="0"/>
+              <w:strike w:val="0"/>
+              <w:color w:val="000000"/>
+              <w:sz w:val="22"/>
+              <w:szCs w:val="22"/>
+              <w:u w:val="none"/>
+              <w:shd w:fill="auto" w:val="clear"/>
+              <w:vertAlign w:val="baseline"/>
+            </w:rPr>
+          </w:pPr>
+          <w:hyperlink w:anchor="">
+            <w:r>
+              <w:rPr>
+                <w:rFonts w:ascii="Arial" w:cs="Arial" w:eastAsia="Arial" w:hAnsi="Arial"/>
+                <w:b w:val="1"/>
+                <w:bCs w:val="1"/>
+                <w:i w:val="0"/>
+                <w:iCs w:val="0"/>
+                <w:smallCaps w:val="0"/>
+                <w:strike w:val="0"/>
+                <w:color w:val="000000"/>
+                <w:sz w:val="22"/>
+                <w:szCs w:val="22"/>
+                <w:u w:val="none"/>
+                <w:shd w:fill="auto" w:val="clear"/>
+                <w:vertAlign w:val="baseline"/>
+                <w:rtl w:val="0"/>
+              </w:rPr>
+              <w:t xml:space="preserve">Implementación y condiciones legales</w:t>
+              <w:tab/>
+              <w:t xml:space="preserve">17</w:t>
+            </w:r>
+          </w:hyperlink>
+          <w:r>
+            <w:rPr>
+              <w:rtl w:val="0"/>
+            </w:rPr>
+          </w:r>
+        </w:p>
+        <w:p>
+          <w:pPr>
+            <w:widowControl w:val="0"/>
+            <w:tabs>
+              <w:tab w:val="right" w:leader="none" w:pos="12000"/>
+            </w:tabs>
+            <w:spacing w:before="60" w:line="240" w:lineRule="auto"/>
+            <w:ind w:left="360" w:firstLine="0"/>
+            <w:rPr>
+              <w:rFonts w:ascii="Arial" w:cs="Arial" w:eastAsia="Arial" w:hAnsi="Arial"/>
+              <w:b w:val="0"/>
+              <w:bCs w:val="0"/>
+              <w:i w:val="0"/>
+              <w:iCs w:val="0"/>
+              <w:smallCaps w:val="0"/>
+              <w:strike w:val="0"/>
+              <w:color w:val="000000"/>
+              <w:sz w:val="22"/>
+              <w:szCs w:val="22"/>
+              <w:u w:val="none"/>
+              <w:shd w:fill="auto" w:val="clear"/>
+              <w:vertAlign w:val="baseline"/>
+            </w:rPr>
+          </w:pPr>
+          <w:hyperlink w:anchor="">
+            <w:r>
+              <w:rPr>
+                <w:rFonts w:ascii="Arial" w:cs="Arial" w:eastAsia="Arial" w:hAnsi="Arial"/>
+                <w:b w:val="0"/>
+                <w:bCs w:val="0"/>
+                <w:i w:val="0"/>
+                <w:iCs w:val="0"/>
+                <w:smallCaps w:val="0"/>
+                <w:strike w:val="0"/>
+                <w:color w:val="000000"/>
+                <w:sz w:val="22"/>
+                <w:szCs w:val="22"/>
+                <w:u w:val="none"/>
+                <w:shd w:fill="auto" w:val="clear"/>
+                <w:vertAlign w:val="baseline"/>
+                <w:rtl w:val="0"/>
+              </w:rPr>
+              <w:t xml:space="preserve">Naturaleza académica y delimitación de marca</w:t>
+              <w:tab/>
+              <w:t xml:space="preserve">17</w:t>
+            </w:r>
+          </w:hyperlink>
+          <w:r>
+            <w:rPr>
+              <w:rtl w:val="0"/>
+            </w:rPr>
+          </w:r>
+        </w:p>
+        <w:p>
+          <w:pPr>
+            <w:widowControl w:val="0"/>
+            <w:tabs>
+              <w:tab w:val="right" w:leader="none" w:pos="12000"/>
+            </w:tabs>
+            <w:spacing w:before="60" w:line="240" w:lineRule="auto"/>
+            <w:ind w:left="360" w:firstLine="0"/>
+            <w:rPr>
+              <w:rFonts w:ascii="Arial" w:cs="Arial" w:eastAsia="Arial" w:hAnsi="Arial"/>
+              <w:b w:val="0"/>
+              <w:bCs w:val="0"/>
+              <w:i w:val="0"/>
+              <w:iCs w:val="0"/>
+              <w:smallCaps w:val="0"/>
+              <w:strike w:val="0"/>
+              <w:color w:val="000000"/>
+              <w:sz w:val="22"/>
+              <w:szCs w:val="22"/>
+              <w:u w:val="none"/>
+              <w:shd w:fill="auto" w:val="clear"/>
+              <w:vertAlign w:val="baseline"/>
+            </w:rPr>
+          </w:pPr>
+          <w:hyperlink w:anchor="">
+            <w:r>
+              <w:rPr>
+                <w:rFonts w:ascii="Arial" w:cs="Arial" w:eastAsia="Arial" w:hAnsi="Arial"/>
+                <w:b w:val="0"/>
+                <w:bCs w:val="0"/>
+                <w:i w:val="0"/>
+                <w:iCs w:val="0"/>
+                <w:smallCaps w:val="0"/>
+                <w:strike w:val="0"/>
+                <w:color w:val="000000"/>
+                <w:sz w:val="22"/>
+                <w:szCs w:val="22"/>
+                <w:u w:val="none"/>
+                <w:shd w:fill="auto" w:val="clear"/>
+                <w:vertAlign w:val="baseline"/>
+                <w:rtl w:val="0"/>
+              </w:rPr>
+              <w:t xml:space="preserve">Propiedad industrial y uso de signos distintivos</w:t>
+              <w:tab/>
+              <w:t xml:space="preserve">17</w:t>
+            </w:r>
+          </w:hyperlink>
+          <w:r>
+            <w:rPr>
+              <w:rtl w:val="0"/>
+            </w:rPr>
+          </w:r>
+        </w:p>
+        <w:p>
+          <w:pPr>
+            <w:widowControl w:val="0"/>
+            <w:tabs>
+              <w:tab w:val="right" w:leader="none" w:pos="12000"/>
+            </w:tabs>
+            <w:spacing w:before="60" w:line="240" w:lineRule="auto"/>
+            <w:ind w:left="360" w:firstLine="0"/>
+            <w:rPr>
+              <w:rFonts w:ascii="Arial" w:cs="Arial" w:eastAsia="Arial" w:hAnsi="Arial"/>
+              <w:b w:val="0"/>
+              <w:bCs w:val="0"/>
+              <w:i w:val="0"/>
+              <w:iCs w:val="0"/>
+              <w:smallCaps w:val="0"/>
+              <w:strike w:val="0"/>
+              <w:color w:val="000000"/>
+              <w:sz w:val="22"/>
+              <w:szCs w:val="22"/>
+              <w:u w:val="none"/>
+              <w:shd w:fill="auto" w:val="clear"/>
+              <w:vertAlign w:val="baseline"/>
+            </w:rPr>
+          </w:pPr>
+          <w:hyperlink w:anchor="">
+            <w:r>
+              <w:rPr>
+                <w:rFonts w:ascii="Arial" w:cs="Arial" w:eastAsia="Arial" w:hAnsi="Arial"/>
+                <w:b w:val="0"/>
+                <w:bCs w:val="0"/>
+                <w:i w:val="0"/>
+                <w:iCs w:val="0"/>
+                <w:smallCaps w:val="0"/>
+                <w:strike w:val="0"/>
+                <w:color w:val="000000"/>
+                <w:sz w:val="22"/>
+                <w:szCs w:val="22"/>
+                <w:u w:val="none"/>
+                <w:shd w:fill="auto" w:val="clear"/>
+                <w:vertAlign w:val="baseline"/>
+                <w:rtl w:val="0"/>
+              </w:rPr>
+              <w:t xml:space="preserve">Posibles consecuencias jurídicas</w:t>
+              <w:tab/>
+              <w:t xml:space="preserve">18</w:t>
+            </w:r>
+          </w:hyperlink>
+          <w:r>
+            <w:rPr>
+              <w:rtl w:val="0"/>
+            </w:rPr>
+          </w:r>
+        </w:p>
+        <w:p>
+          <w:pPr>
+            <w:widowControl w:val="0"/>
+            <w:tabs>
+              <w:tab w:val="right" w:leader="none" w:pos="12000"/>
+            </w:tabs>
+            <w:spacing w:before="60" w:line="240" w:lineRule="auto"/>
+            <w:ind w:left="360" w:firstLine="0"/>
+            <w:rPr>
+              <w:rFonts w:ascii="Arial" w:cs="Arial" w:eastAsia="Arial" w:hAnsi="Arial"/>
+              <w:b w:val="0"/>
+              <w:bCs w:val="0"/>
+              <w:i w:val="0"/>
+              <w:iCs w:val="0"/>
+              <w:smallCaps w:val="0"/>
+              <w:strike w:val="0"/>
+              <w:color w:val="000000"/>
+              <w:sz w:val="22"/>
+              <w:szCs w:val="22"/>
+              <w:u w:val="none"/>
+              <w:shd w:fill="auto" w:val="clear"/>
+              <w:vertAlign w:val="baseline"/>
+            </w:rPr>
+          </w:pPr>
+          <w:hyperlink w:anchor="">
+            <w:r>
+              <w:rPr>
+                <w:rFonts w:ascii="Arial" w:cs="Arial" w:eastAsia="Arial" w:hAnsi="Arial"/>
+                <w:b w:val="0"/>
+                <w:bCs w:val="0"/>
+                <w:i w:val="0"/>
+                <w:iCs w:val="0"/>
+                <w:smallCaps w:val="0"/>
+                <w:strike w:val="0"/>
+                <w:color w:val="000000"/>
+                <w:sz w:val="22"/>
+                <w:szCs w:val="22"/>
+                <w:u w:val="none"/>
+                <w:shd w:fill="auto" w:val="clear"/>
+                <w:vertAlign w:val="baseline"/>
+                <w:rtl w:val="0"/>
+              </w:rPr>
+              <w:t xml:space="preserve">Derechos de autor sobre el software</w:t>
+              <w:tab/>
+              <w:t xml:space="preserve">19</w:t>
+            </w:r>
+          </w:hyperlink>
+          <w:r>
+            <w:rPr>
+              <w:rtl w:val="0"/>
+            </w:rPr>
+          </w:r>
+        </w:p>
+        <w:p>
+          <w:pPr>
+            <w:widowControl w:val="0"/>
+            <w:tabs>
+              <w:tab w:val="right" w:leader="none" w:pos="12000"/>
+            </w:tabs>
+            <w:spacing w:before="60" w:line="240" w:lineRule="auto"/>
+            <w:ind w:left="360" w:firstLine="0"/>
+            <w:rPr>
+              <w:rFonts w:ascii="Arial" w:cs="Arial" w:eastAsia="Arial" w:hAnsi="Arial"/>
+              <w:b w:val="0"/>
+              <w:bCs w:val="0"/>
+              <w:i w:val="0"/>
+              <w:iCs w:val="0"/>
+              <w:smallCaps w:val="0"/>
+              <w:strike w:val="0"/>
+              <w:color w:val="000000"/>
+              <w:sz w:val="22"/>
+              <w:szCs w:val="22"/>
+              <w:u w:val="none"/>
+              <w:shd w:fill="auto" w:val="clear"/>
+              <w:vertAlign w:val="baseline"/>
+            </w:rPr>
+          </w:pPr>
+          <w:hyperlink w:anchor="">
+            <w:r>
+              <w:rPr>
+                <w:rFonts w:ascii="Arial" w:cs="Arial" w:eastAsia="Arial" w:hAnsi="Arial"/>
+                <w:b w:val="0"/>
+                <w:bCs w:val="0"/>
+                <w:i w:val="0"/>
+                <w:iCs w:val="0"/>
+                <w:smallCaps w:val="0"/>
+                <w:strike w:val="0"/>
+                <w:color w:val="000000"/>
+                <w:sz w:val="22"/>
+                <w:szCs w:val="22"/>
+                <w:u w:val="none"/>
+                <w:shd w:fill="auto" w:val="clear"/>
+                <w:vertAlign w:val="baseline"/>
+                <w:rtl w:val="0"/>
+              </w:rPr>
+              <w:t xml:space="preserve">Responsabilidad de aprendices e institución</w:t>
+              <w:tab/>
+              <w:t xml:space="preserve">19</w:t>
+            </w:r>
+          </w:hyperlink>
+          <w:r>
+            <w:rPr>
+              <w:rtl w:val="0"/>
+            </w:rPr>
+          </w:r>
+        </w:p>
+        <w:p>
+          <w:pPr>
+            <w:widowControl w:val="0"/>
+            <w:tabs>
+              <w:tab w:val="right" w:leader="none" w:pos="12000"/>
+            </w:tabs>
+            <w:spacing w:before="60" w:line="240" w:lineRule="auto"/>
+            <w:ind w:left="360" w:firstLine="0"/>
+            <w:rPr>
+              <w:rFonts w:ascii="Arial" w:cs="Arial" w:eastAsia="Arial" w:hAnsi="Arial"/>
+              <w:b w:val="0"/>
+              <w:bCs w:val="0"/>
+              <w:i w:val="0"/>
+              <w:iCs w:val="0"/>
+              <w:smallCaps w:val="0"/>
+              <w:strike w:val="0"/>
+              <w:color w:val="000000"/>
+              <w:sz w:val="22"/>
+              <w:szCs w:val="22"/>
+              <w:u w:val="none"/>
+              <w:shd w:fill="auto" w:val="clear"/>
+              <w:vertAlign w:val="baseline"/>
+            </w:rPr>
+          </w:pPr>
+          <w:hyperlink w:anchor="">
+            <w:r>
+              <w:rPr>
+                <w:rFonts w:ascii="Arial" w:cs="Arial" w:eastAsia="Arial" w:hAnsi="Arial"/>
+                <w:b w:val="0"/>
+                <w:bCs w:val="0"/>
+                <w:i w:val="0"/>
+                <w:iCs w:val="0"/>
+                <w:smallCaps w:val="0"/>
+                <w:strike w:val="0"/>
+                <w:color w:val="000000"/>
+                <w:sz w:val="22"/>
+                <w:szCs w:val="22"/>
+                <w:u w:val="none"/>
+                <w:shd w:fill="auto" w:val="clear"/>
+                <w:vertAlign w:val="baseline"/>
+                <w:rtl w:val="0"/>
+              </w:rPr>
+              <w:t xml:space="preserve">Cláusula de delimitación propuesta</w:t>
+              <w:tab/>
+              <w:t xml:space="preserve">20</w:t>
+            </w:r>
+          </w:hyperlink>
+          <w:r>
+            <w:rPr>
+              <w:rtl w:val="0"/>
+            </w:rPr>
+          </w:r>
+        </w:p>
+        <w:p>
+          <w:pPr>
+            <w:widowControl w:val="0"/>
+            <w:tabs>
+              <w:tab w:val="right" w:leader="none" w:pos="12000"/>
+            </w:tabs>
+            <w:spacing w:before="60" w:line="240" w:lineRule="auto"/>
+            <w:ind w:firstLine="0"/>
+            <w:rPr>
+              <w:rFonts w:ascii="Arial" w:cs="Arial" w:eastAsia="Arial" w:hAnsi="Arial"/>
+              <w:b w:val="1"/>
+              <w:bCs w:val="1"/>
+              <w:i w:val="0"/>
+              <w:iCs w:val="0"/>
+              <w:smallCaps w:val="0"/>
+              <w:strike w:val="0"/>
+              <w:color w:val="000000"/>
+              <w:sz w:val="22"/>
+              <w:szCs w:val="22"/>
+              <w:u w:val="none"/>
+              <w:shd w:fill="auto" w:val="clear"/>
+              <w:vertAlign w:val="baseline"/>
+            </w:rPr>
+          </w:pPr>
+          <w:hyperlink w:anchor="">
+            <w:r>
+              <w:rPr>
+                <w:rFonts w:ascii="Arial" w:cs="Arial" w:eastAsia="Arial" w:hAnsi="Arial"/>
+                <w:b w:val="1"/>
+                <w:bCs w:val="1"/>
+                <w:i w:val="0"/>
+                <w:iCs w:val="0"/>
+                <w:smallCaps w:val="0"/>
+                <w:strike w:val="0"/>
+                <w:color w:val="000000"/>
+                <w:sz w:val="22"/>
+                <w:szCs w:val="22"/>
+                <w:u w:val="none"/>
+                <w:shd w:fill="auto" w:val="clear"/>
+                <w:vertAlign w:val="baseline"/>
+                <w:rtl w:val="0"/>
+              </w:rPr>
+              <w:t xml:space="preserve">Organización del equipo y metodología</w:t>
+              <w:tab/>
+              <w:t xml:space="preserve">21</w:t>
+            </w:r>
+          </w:hyperlink>
+          <w:r>
+            <w:rPr>
+              <w:rtl w:val="0"/>
+            </w:rPr>
+          </w:r>
+        </w:p>
+        <w:p>
+          <w:pPr>
+            <w:widowControl w:val="0"/>
+            <w:tabs>
+              <w:tab w:val="right" w:leader="none" w:pos="12000"/>
+            </w:tabs>
+            <w:spacing w:before="60" w:line="240" w:lineRule="auto"/>
+            <w:ind w:firstLine="0"/>
+            <w:rPr>
+              <w:rFonts w:ascii="Arial" w:cs="Arial" w:eastAsia="Arial" w:hAnsi="Arial"/>
+              <w:b w:val="1"/>
+              <w:bCs w:val="1"/>
+              <w:i w:val="0"/>
+              <w:iCs w:val="0"/>
+              <w:smallCaps w:val="0"/>
+              <w:strike w:val="0"/>
+              <w:color w:val="000000"/>
+              <w:sz w:val="22"/>
+              <w:szCs w:val="22"/>
+              <w:u w:val="none"/>
+              <w:shd w:fill="auto" w:val="clear"/>
+              <w:vertAlign w:val="baseline"/>
+            </w:rPr>
+          </w:pPr>
+          <w:hyperlink w:anchor="">
+            <w:r>
+              <w:rPr>
+                <w:rFonts w:ascii="Arial" w:cs="Arial" w:eastAsia="Arial" w:hAnsi="Arial"/>
+                <w:b w:val="1"/>
+                <w:bCs w:val="1"/>
+                <w:i w:val="0"/>
+                <w:iCs w:val="0"/>
+                <w:smallCaps w:val="0"/>
+                <w:strike w:val="0"/>
+                <w:color w:val="000000"/>
+                <w:sz w:val="22"/>
+                <w:szCs w:val="22"/>
+                <w:u w:val="none"/>
+                <w:shd w:fill="auto" w:val="clear"/>
+                <w:vertAlign w:val="baseline"/>
+                <w:rtl w:val="0"/>
+              </w:rPr>
+              <w:t xml:space="preserve">Conclusiones como equipo de desarrollo</w:t>
+              <w:tab/>
+              <w:t xml:space="preserve">22</w:t>
+            </w:r>
+          </w:hyperlink>
+          <w:r>
+            <w:rPr>
+              <w:rtl w:val="0"/>
+            </w:rPr>
+          </w:r>
+        </w:p>
+        <w:p>
+          <w:pPr>
+            <w:widowControl w:val="0"/>
+            <w:tabs>
+              <w:tab w:val="right" w:leader="none" w:pos="12000"/>
+            </w:tabs>
+            <w:spacing w:before="60" w:line="240" w:lineRule="auto"/>
+            <w:ind w:firstLine="0"/>
+            <w:rPr>
+              <w:rFonts w:ascii="Arial" w:cs="Arial" w:eastAsia="Arial" w:hAnsi="Arial"/>
+              <w:b w:val="1"/>
+              <w:bCs w:val="1"/>
+              <w:i w:val="0"/>
+              <w:iCs w:val="0"/>
+              <w:smallCaps w:val="0"/>
+              <w:strike w:val="0"/>
+              <w:color w:val="000000"/>
+              <w:sz w:val="22"/>
+              <w:szCs w:val="22"/>
+              <w:u w:val="none"/>
+              <w:shd w:fill="auto" w:val="clear"/>
+              <w:vertAlign w:val="baseline"/>
+            </w:rPr>
+          </w:pPr>
+          <w:hyperlink w:anchor="">
+            <w:r>
+              <w:rPr>
+                <w:rFonts w:ascii="Arial" w:cs="Arial" w:eastAsia="Arial" w:hAnsi="Arial"/>
+                <w:b w:val="1"/>
+                <w:bCs w:val="1"/>
+                <w:i w:val="0"/>
+                <w:iCs w:val="0"/>
+                <w:smallCaps w:val="0"/>
+                <w:strike w:val="0"/>
+                <w:color w:val="000000"/>
+                <w:sz w:val="22"/>
+                <w:szCs w:val="22"/>
+                <w:u w:val="none"/>
+                <w:shd w:fill="auto" w:val="clear"/>
+                <w:vertAlign w:val="baseline"/>
+                <w:rtl w:val="0"/>
+              </w:rPr>
+              <w:t xml:space="preserve">Reflexión final sobre el trabajo en equipo</w:t>
+              <w:tab/>
+              <w:t xml:space="preserve">23</w:t>
+            </w:r>
+          </w:hyperlink>
+          <w:r>
+            <w:rPr>
+              <w:rtl w:val="0"/>
+            </w:rPr>
+          </w:r>
+        </w:p>
+        <w:p>
+          <w:pPr>
+            <w:widowControl w:val="0"/>
+            <w:tabs>
+              <w:tab w:val="right" w:leader="none" w:pos="12000"/>
+            </w:tabs>
+            <w:spacing w:before="60" w:line="240" w:lineRule="auto"/>
+            <w:ind w:firstLine="0"/>
+            <w:rPr>
+              <w:rFonts w:ascii="Arial" w:cs="Arial" w:eastAsia="Arial" w:hAnsi="Arial"/>
+              <w:b w:val="1"/>
+              <w:bCs w:val="1"/>
+              <w:i w:val="0"/>
+              <w:iCs w:val="0"/>
+              <w:smallCaps w:val="0"/>
+              <w:strike w:val="0"/>
+              <w:color w:val="000000"/>
+              <w:sz w:val="22"/>
+              <w:szCs w:val="22"/>
+              <w:u w:val="none"/>
+              <w:shd w:fill="auto" w:val="clear"/>
+              <w:vertAlign w:val="baseline"/>
+            </w:rPr>
+          </w:pPr>
+          <w:hyperlink w:anchor="">
+            <w:r>
+              <w:rPr>
+                <w:rFonts w:ascii="Arial" w:cs="Arial" w:eastAsia="Arial" w:hAnsi="Arial"/>
+                <w:b w:val="1"/>
+                <w:bCs w:val="1"/>
+                <w:i w:val="0"/>
+                <w:iCs w:val="0"/>
+                <w:smallCaps w:val="0"/>
+                <w:strike w:val="0"/>
+                <w:color w:val="000000"/>
+                <w:sz w:val="22"/>
+                <w:szCs w:val="22"/>
+                <w:u w:val="none"/>
+                <w:shd w:fill="auto" w:val="clear"/>
+                <w:vertAlign w:val="baseline"/>
+                <w:rtl w:val="0"/>
+              </w:rPr>
+              <w:t xml:space="preserve">Referencias</w:t>
+              <w:tab/>
+              <w:t xml:space="preserve">24</w:t>
+            </w:r>
+          </w:hyperlink>
+          <w:r>
+            <w:rPr>
+              <w:rtl w:val="0"/>
+            </w:rPr>
+          </w:r>
+        </w:p>
+        <w:p>
+          <w:pPr>
+            <w:widowControl w:val="0"/>
+            <w:tabs>
+              <w:tab w:val="right" w:leader="none" w:pos="12000"/>
+            </w:tabs>
+            <w:spacing w:before="60" w:line="240" w:lineRule="auto"/>
+            <w:ind w:firstLine="0"/>
+            <w:rPr>
+              <w:rFonts w:ascii="Arial" w:cs="Arial" w:eastAsia="Arial" w:hAnsi="Arial"/>
+              <w:b w:val="1"/>
+              <w:bCs w:val="1"/>
+              <w:i w:val="0"/>
+              <w:iCs w:val="0"/>
+              <w:smallCaps w:val="0"/>
+              <w:strike w:val="0"/>
+              <w:color w:val="000000"/>
+              <w:sz w:val="22"/>
+              <w:szCs w:val="22"/>
+              <w:u w:val="none"/>
+              <w:shd w:fill="auto" w:val="clear"/>
+              <w:vertAlign w:val="baseline"/>
+            </w:rPr>
+          </w:pPr>
+          <w:hyperlink w:anchor="">
+            <w:r>
+              <w:rPr>
+                <w:rFonts w:ascii="Arial" w:cs="Arial" w:eastAsia="Arial" w:hAnsi="Arial"/>
+                <w:b w:val="1"/>
+                <w:bCs w:val="1"/>
+                <w:i w:val="0"/>
+                <w:iCs w:val="0"/>
+                <w:smallCaps w:val="0"/>
+                <w:strike w:val="0"/>
+                <w:color w:val="000000"/>
+                <w:sz w:val="22"/>
+                <w:szCs w:val="22"/>
+                <w:u w:val="none"/>
+                <w:shd w:fill="auto" w:val="clear"/>
+                <w:vertAlign w:val="baseline"/>
+                <w:rtl w:val="0"/>
+              </w:rPr>
+              <w:t xml:space="preserve">Anexo A. Matriz resumida de alcance</w:t>
+              <w:tab/>
+              <w:t xml:space="preserve">25</w:t>
+            </w:r>
+          </w:hyperlink>
+          <w:r>
+            <w:rPr>
+              <w:rtl w:val="0"/>
+            </w:rPr>
+          </w:r>
+        </w:p>
+        <w:p>
+          <w:pPr>
+            <w:widowControl w:val="0"/>
+            <w:tabs>
+              <w:tab w:val="right" w:leader="none" w:pos="12000"/>
+            </w:tabs>
+            <w:spacing w:before="60" w:line="240" w:lineRule="auto"/>
+            <w:ind w:firstLine="0"/>
+            <w:rPr>
+              <w:rFonts w:ascii="Arial" w:cs="Arial" w:eastAsia="Arial" w:hAnsi="Arial"/>
+              <w:b w:val="1"/>
+              <w:bCs w:val="1"/>
+              <w:i w:val="0"/>
+              <w:iCs w:val="0"/>
+              <w:smallCaps w:val="0"/>
+              <w:strike w:val="0"/>
+              <w:color w:val="000000"/>
+              <w:sz w:val="22"/>
+              <w:szCs w:val="22"/>
+              <w:u w:val="none"/>
+              <w:shd w:fill="auto" w:val="clear"/>
+              <w:vertAlign w:val="baseline"/>
+            </w:rPr>
+          </w:pPr>
+          <w:hyperlink w:anchor="">
+            <w:r>
+              <w:rPr>
+                <w:rFonts w:ascii="Arial" w:cs="Arial" w:eastAsia="Arial" w:hAnsi="Arial"/>
+                <w:b w:val="1"/>
+                <w:bCs w:val="1"/>
+                <w:i w:val="0"/>
+                <w:iCs w:val="0"/>
+                <w:smallCaps w:val="0"/>
+                <w:strike w:val="0"/>
+                <w:color w:val="000000"/>
+                <w:sz w:val="22"/>
+                <w:szCs w:val="22"/>
+                <w:u w:val="none"/>
+                <w:shd w:fill="auto" w:val="clear"/>
+                <w:vertAlign w:val="baseline"/>
+                <w:rtl w:val="0"/>
+              </w:rPr>
+              <w:t xml:space="preserve">Anexo B. Nota de revisión legal</w:t>
+              <w:tab/>
+              <w:t xml:space="preserve">25</w:t>
+            </w:r>
+          </w:hyperlink>
+          <w:r>
+            <w:rPr>
+              <w:rtl w:val="0"/>
+            </w:rPr>
           </w:r>
           <w:r>
             <w:fldChar w:fldCharType="end"/>
@@ -363,9 +2457,48 @@
         <w:t xml:space="preserve">Lista de tablas</w:t>
       </w:r>
     </w:p>
+    <w:p>
+      <w:pPr>
+        <w:spacing w:line="480" w:lineRule="auto"/>
+        <w:ind w:firstLine="0"/>
+        <w:rPr/>
+      </w:pPr>
+      <w:r>
+        <w:rPr>
+          <w:rtl w:val="0"/>
+        </w:rPr>
+      </w:r>
+    </w:p>
+    <w:p>
+      <w:pPr>
+        <w:rPr/>
+      </w:pPr>
+      <w:r>
+        <w:br w:type="page"/>
+      </w:r>
+      <w:r>
+        <w:rPr>
+          <w:rtl w:val="0"/>
+        </w:rPr>
+      </w:r>
+    </w:p>
+    <w:p>
+      <w:pPr>
+        <w:pStyle w:val="Heading1"/>
+        <w:spacing w:after="0" w:before="0" w:line="480" w:lineRule="auto"/>
+        <w:ind w:firstLine="0"/>
+        <w:rPr/>
+      </w:pPr>
+      <w:r>
+        <w:rPr>
+          <w:rtl w:val="0"/>
+        </w:rPr>
+        <w:t xml:space="preserve">Lista de ilustraciones</w:t>
+      </w:r>
+    </w:p>
     <w:sdt>
       <w:sdtPr>
-        <w:id w:val="1886993992"/>
+        <w:id w:val="197774207"/>
         <w:docPartObj>
           <w:docPartGallery w:val="Table of Contents"/>
           <w:docPartUnique w:val="1"/>
@@ -436,68 +2569,393 @@
     <w:p>
       <w:pPr>
         <w:pStyle w:val="Heading1"/>
-        <w:spacing w:after="0" w:before="0" w:line="480" w:lineRule="auto"/>
-        <w:ind w:firstLine="0"/>
-        <w:rPr/>
-      </w:pPr>
-      <w:r>
-        <w:rPr>
-          <w:rtl w:val="0"/>
-        </w:rPr>
-        <w:t xml:space="preserve">Lista de ilustraciones</w:t>
-      </w:r>
-    </w:p>
-    <w:sdt>
-      <w:sdtPr>
-        <w:id w:val="-1379754964"/>
-        <w:docPartObj>
-          <w:docPartGallery w:val="Table of Contents"/>
-          <w:docPartUnique w:val="1"/>
-        </w:docPartObj>
-      </w:sdtPr>
-      <w:sdtContent>
-        <w:p>
-          <w:pPr>
-            <w:keepNext w:val="0"/>
-            <w:keepLines w:val="0"/>
-            <w:pageBreakBefore w:val="0"/>
-            <w:widowControl w:val="0"/>
-            <w:pBdr>
-              <w:top w:space="0" w:sz="0" w:val="nil"/>
-              <w:left w:space="0" w:sz="0" w:val="nil"/>
-              <w:bottom w:space="0" w:sz="0" w:val="nil"/>
-              <w:right w:space="0" w:sz="0" w:val="nil"/>
-              <w:between w:space="0" w:sz="0" w:val="nil"/>
-            </w:pBdr>
-            <w:shd w:fill="auto" w:val="clear"/>
-            <w:spacing w:after="0" w:before="0" w:line="276" w:lineRule="auto"/>
-            <w:ind w:left="0" w:right="0" w:firstLine="0"/>
-            <w:jc w:val="left"/>
-            <w:rPr/>
-          </w:pPr>
-          <w:r>
-            <w:fldChar w:fldCharType="begin"/>
-            <w:instrText xml:space="preserve"> TOC \h \u \z \t "Heading 1,1,Heading 2,2,Heading 3,3,Heading 4,4,Heading 5,5,Heading 6,6,"</w:instrText>
-            <w:fldChar w:fldCharType="separate"/>
-          </w:r>
-          <w:r>
-            <w:rPr>
-              <w:rtl w:val="0"/>
-            </w:rPr>
-            <w:t xml:space="preserve">Actualizar campo en Word</w:t>
-          </w:r>
-          <w:r>
-            <w:fldChar w:fldCharType="end"/>
-          </w:r>
-        </w:p>
-      </w:sdtContent>
-    </w:sdt>
+        <w:rPr/>
+      </w:pPr>
+      <w:r>
+        <w:rPr>
+          <w:rtl w:val="0"/>
+        </w:rPr>
+        <w:t xml:space="preserve">Glosario</w:t>
+      </w:r>
+    </w:p>
     <w:p>
       <w:pPr>
         <w:spacing w:line="480" w:lineRule="auto"/>
         <w:ind w:firstLine="0"/>
         <w:rPr/>
       </w:pPr>
+      <w:r>
+        <w:rPr>
+          <w:rFonts w:ascii="Times New Roman" w:cs="Times New Roman" w:eastAsia="Times New Roman" w:hAnsi="Times New Roman"/>
+          <w:b w:val="1"/>
+          <w:bCs w:val="1"/>
+          <w:sz w:val="24"/>
+          <w:szCs w:val="24"/>
+          <w:rtl w:val="0"/>
+        </w:rPr>
+        <w:t xml:space="preserve">API. </w:t>
+      </w:r>
+      <w:r>
+        <w:rPr>
+          <w:rFonts w:ascii="Times New Roman" w:cs="Times New Roman" w:eastAsia="Times New Roman" w:hAnsi="Times New Roman"/>
+          <w:sz w:val="24"/>
+          <w:szCs w:val="24"/>
+          <w:rtl w:val="0"/>
+        </w:rPr>
+        <w:t xml:space="preserve">Interfaz que permite la comunicación entre componentes de software.</w:t>
+      </w:r>
+      <w:r>
+        <w:rPr>
+          <w:rtl w:val="0"/>
+        </w:rPr>
+      </w:r>
+    </w:p>
+    <w:p>
+      <w:pPr>
+        <w:spacing w:line="480" w:lineRule="auto"/>
+        <w:ind w:firstLine="0"/>
+        <w:rPr/>
+      </w:pPr>
+      <w:r>
+        <w:rPr>
+          <w:rFonts w:ascii="Times New Roman" w:cs="Times New Roman" w:eastAsia="Times New Roman" w:hAnsi="Times New Roman"/>
+          <w:b w:val="1"/>
+          <w:bCs w:val="1"/>
+          <w:sz w:val="24"/>
+          <w:szCs w:val="24"/>
+          <w:rtl w:val="0"/>
+        </w:rPr>
+        <w:t xml:space="preserve">Backend. </w:t>
+      </w:r>
+      <w:r>
+        <w:rPr>
+          <w:rFonts w:ascii="Times New Roman" w:cs="Times New Roman" w:eastAsia="Times New Roman" w:hAnsi="Times New Roman"/>
+          <w:sz w:val="24"/>
+          <w:szCs w:val="24"/>
+          <w:rtl w:val="0"/>
+        </w:rPr>
+        <w:t xml:space="preserve">Capa del sistema responsable de reglas de negocio, procesamiento y acceso a datos.</w:t>
+      </w:r>
+      <w:r>
+        <w:rPr>
+          <w:rtl w:val="0"/>
+        </w:rPr>
+      </w:r>
+    </w:p>
+    <w:p>
+      <w:pPr>
+        <w:spacing w:line="480" w:lineRule="auto"/>
+        <w:ind w:firstLine="0"/>
+        <w:rPr/>
+      </w:pPr>
+      <w:r>
+        <w:rPr>
+          <w:rFonts w:ascii="Times New Roman" w:cs="Times New Roman" w:eastAsia="Times New Roman" w:hAnsi="Times New Roman"/>
+          <w:b w:val="1"/>
+          <w:bCs w:val="1"/>
+          <w:sz w:val="24"/>
+          <w:szCs w:val="24"/>
+          <w:rtl w:val="0"/>
+        </w:rPr>
+        <w:t xml:space="preserve">Frontend. </w:t>
+      </w:r>
+      <w:r>
+        <w:rPr>
+          <w:rFonts w:ascii="Times New Roman" w:cs="Times New Roman" w:eastAsia="Times New Roman" w:hAnsi="Times New Roman"/>
+          <w:sz w:val="24"/>
+          <w:szCs w:val="24"/>
+          <w:rtl w:val="0"/>
+        </w:rPr>
+        <w:t xml:space="preserve">Capa de presentación con la que interactúa directamente la persona usuaria.</w:t>
+      </w:r>
+      <w:r>
+        <w:rPr>
+          <w:rtl w:val="0"/>
+        </w:rPr>
+      </w:r>
+    </w:p>
+    <w:p>
+      <w:pPr>
+        <w:spacing w:line="480" w:lineRule="auto"/>
+        <w:ind w:firstLine="0"/>
+        <w:rPr/>
+      </w:pPr>
+      <w:r>
+        <w:rPr>
+          <w:rFonts w:ascii="Times New Roman" w:cs="Times New Roman" w:eastAsia="Times New Roman" w:hAnsi="Times New Roman"/>
+          <w:b w:val="1"/>
+          <w:bCs w:val="1"/>
+          <w:sz w:val="24"/>
+          <w:szCs w:val="24"/>
+          <w:rtl w:val="0"/>
+        </w:rPr>
+        <w:t xml:space="preserve">CRUD. </w:t>
+      </w:r>
+      <w:r>
+        <w:rPr>
+          <w:rFonts w:ascii="Times New Roman" w:cs="Times New Roman" w:eastAsia="Times New Roman" w:hAnsi="Times New Roman"/>
+          <w:sz w:val="24"/>
+          <w:szCs w:val="24"/>
+          <w:rtl w:val="0"/>
+        </w:rPr>
+        <w:t xml:space="preserve">Operaciones básicas de creación, consulta, actualización y eliminación de datos.</w:t>
+      </w:r>
+      <w:r>
+        <w:rPr>
+          <w:rtl w:val="0"/>
+        </w:rPr>
+      </w:r>
+    </w:p>
+    <w:p>
+      <w:pPr>
+        <w:spacing w:line="480" w:lineRule="auto"/>
+        <w:ind w:firstLine="0"/>
+        <w:rPr/>
+      </w:pPr>
+      <w:r>
+        <w:rPr>
+          <w:rFonts w:ascii="Times New Roman" w:cs="Times New Roman" w:eastAsia="Times New Roman" w:hAnsi="Times New Roman"/>
+          <w:b w:val="1"/>
+          <w:bCs w:val="1"/>
+          <w:sz w:val="24"/>
+          <w:szCs w:val="24"/>
+          <w:rtl w:val="0"/>
+        </w:rPr>
+        <w:t xml:space="preserve">Despensa. </w:t>
+      </w:r>
+      <w:r>
+        <w:rPr>
+          <w:rFonts w:ascii="Times New Roman" w:cs="Times New Roman" w:eastAsia="Times New Roman" w:hAnsi="Times New Roman"/>
+          <w:sz w:val="24"/>
+          <w:szCs w:val="24"/>
+          <w:rtl w:val="0"/>
+        </w:rPr>
+        <w:t xml:space="preserve">Conjunto de ingredientes disponibles antes de generar una lista de mercado.</w:t>
+      </w:r>
+      <w:r>
+        <w:rPr>
+          <w:rtl w:val="0"/>
+        </w:rPr>
+      </w:r>
+    </w:p>
+    <w:p>
+      <w:pPr>
+        <w:spacing w:line="480" w:lineRule="auto"/>
+        <w:ind w:firstLine="0"/>
+        <w:rPr/>
+      </w:pPr>
+      <w:r>
+        <w:rPr>
+          <w:rFonts w:ascii="Times New Roman" w:cs="Times New Roman" w:eastAsia="Times New Roman" w:hAnsi="Times New Roman"/>
+          <w:b w:val="1"/>
+          <w:bCs w:val="1"/>
+          <w:sz w:val="24"/>
+          <w:szCs w:val="24"/>
+          <w:rtl w:val="0"/>
+        </w:rPr>
+        <w:t xml:space="preserve">Lista de mercado. </w:t>
+      </w:r>
+      <w:r>
+        <w:rPr>
+          <w:rFonts w:ascii="Times New Roman" w:cs="Times New Roman" w:eastAsia="Times New Roman" w:hAnsi="Times New Roman"/>
+          <w:sz w:val="24"/>
+          <w:szCs w:val="24"/>
+          <w:rtl w:val="0"/>
+        </w:rPr>
+        <w:t xml:space="preserve">Relación consolidada de ingredientes y cantidades que deben adquirirse.</w:t>
+      </w:r>
+      <w:r>
+        <w:rPr>
+          <w:rtl w:val="0"/>
+        </w:rPr>
+      </w:r>
+    </w:p>
+    <w:p>
+      <w:pPr>
+        <w:spacing w:line="480" w:lineRule="auto"/>
+        <w:ind w:firstLine="0"/>
+        <w:rPr/>
+      </w:pPr>
+      <w:r>
+        <w:rPr>
+          <w:rFonts w:ascii="Times New Roman" w:cs="Times New Roman" w:eastAsia="Times New Roman" w:hAnsi="Times New Roman"/>
+          <w:b w:val="1"/>
+          <w:bCs w:val="1"/>
+          <w:sz w:val="24"/>
+          <w:szCs w:val="24"/>
+          <w:rtl w:val="0"/>
+        </w:rPr>
+        <w:t xml:space="preserve">Plan de menú. </w:t>
+      </w:r>
+      <w:r>
+        <w:rPr>
+          <w:rFonts w:ascii="Times New Roman" w:cs="Times New Roman" w:eastAsia="Times New Roman" w:hAnsi="Times New Roman"/>
+          <w:sz w:val="24"/>
+          <w:szCs w:val="24"/>
+          <w:rtl w:val="0"/>
+        </w:rPr>
+        <w:t xml:space="preserve">Estructura semanal que organiza recetas por día y por tipo de comida.</w:t>
+      </w:r>
+      <w:r>
+        <w:rPr>
+          <w:rtl w:val="0"/>
+        </w:rPr>
+      </w:r>
+    </w:p>
+    <w:p>
+      <w:pPr>
+        <w:spacing w:line="480" w:lineRule="auto"/>
+        <w:ind w:firstLine="0"/>
+        <w:rPr/>
+      </w:pPr>
+      <w:r>
+        <w:rPr>
+          <w:rFonts w:ascii="Times New Roman" w:cs="Times New Roman" w:eastAsia="Times New Roman" w:hAnsi="Times New Roman"/>
+          <w:b w:val="1"/>
+          <w:bCs w:val="1"/>
+          <w:sz w:val="24"/>
+          <w:szCs w:val="24"/>
+          <w:rtl w:val="0"/>
+        </w:rPr>
+        <w:t xml:space="preserve">Receta. </w:t>
+      </w:r>
+      <w:r>
+        <w:rPr>
+          <w:rFonts w:ascii="Times New Roman" w:cs="Times New Roman" w:eastAsia="Times New Roman" w:hAnsi="Times New Roman"/>
+          <w:sz w:val="24"/>
+          <w:szCs w:val="24"/>
+          <w:rtl w:val="0"/>
+        </w:rPr>
+        <w:t xml:space="preserve">Conjunto de ingredientes, cantidades e instrucciones para preparar un plato.</w:t>
+      </w:r>
+      <w:r>
+        <w:rPr>
+          <w:rtl w:val="0"/>
+        </w:rPr>
+      </w:r>
+    </w:p>
+    <w:p>
+      <w:pPr>
+        <w:spacing w:line="480" w:lineRule="auto"/>
+        <w:ind w:firstLine="0"/>
+        <w:rPr/>
+      </w:pPr>
+      <w:r>
+        <w:rPr>
+          <w:rFonts w:ascii="Times New Roman" w:cs="Times New Roman" w:eastAsia="Times New Roman" w:hAnsi="Times New Roman"/>
+          <w:b w:val="1"/>
+          <w:bCs w:val="1"/>
+          <w:sz w:val="24"/>
+          <w:szCs w:val="24"/>
+          <w:rtl w:val="0"/>
+        </w:rPr>
+        <w:t xml:space="preserve">Sprint. </w:t>
+      </w:r>
+      <w:r>
+        <w:rPr>
+          <w:rFonts w:ascii="Times New Roman" w:cs="Times New Roman" w:eastAsia="Times New Roman" w:hAnsi="Times New Roman"/>
+          <w:sz w:val="24"/>
+          <w:szCs w:val="24"/>
+          <w:rtl w:val="0"/>
+        </w:rPr>
+        <w:t xml:space="preserve">Periodo de trabajo acotado utilizado para planificar y entregar incrementos del producto.</w:t>
+      </w:r>
+      <w:r>
+        <w:rPr>
+          <w:rtl w:val="0"/>
+        </w:rPr>
+      </w:r>
+    </w:p>
+    <w:p>
+      <w:pPr>
+        <w:spacing w:line="480" w:lineRule="auto"/>
+        <w:ind w:firstLine="0"/>
+        <w:rPr/>
+      </w:pPr>
+      <w:r>
+        <w:rPr>
+          <w:rFonts w:ascii="Times New Roman" w:cs="Times New Roman" w:eastAsia="Times New Roman" w:hAnsi="Times New Roman"/>
+          <w:b w:val="1"/>
+          <w:bCs w:val="1"/>
+          <w:sz w:val="24"/>
+          <w:szCs w:val="24"/>
+          <w:rtl w:val="0"/>
+        </w:rPr>
+        <w:t xml:space="preserve">Scrum Master. </w:t>
+      </w:r>
+      <w:r>
+        <w:rPr>
+          <w:rFonts w:ascii="Times New Roman" w:cs="Times New Roman" w:eastAsia="Times New Roman" w:hAnsi="Times New Roman"/>
+          <w:sz w:val="24"/>
+          <w:szCs w:val="24"/>
+          <w:rtl w:val="0"/>
+        </w:rPr>
+        <w:t xml:space="preserve">Rol que facilita el marco Scrum, remueve impedimentos y ayuda a que el equipo mantenga el proceso.</w:t>
+      </w:r>
+      <w:r>
+        <w:rPr>
+          <w:rtl w:val="0"/>
+        </w:rPr>
+      </w:r>
+    </w:p>
+    <w:p>
+      <w:pPr>
+        <w:spacing w:line="480" w:lineRule="auto"/>
+        <w:ind w:firstLine="0"/>
+        <w:rPr/>
+      </w:pPr>
+      <w:r>
+        <w:rPr>
+          <w:rFonts w:ascii="Times New Roman" w:cs="Times New Roman" w:eastAsia="Times New Roman" w:hAnsi="Times New Roman"/>
+          <w:b w:val="1"/>
+          <w:bCs w:val="1"/>
+          <w:sz w:val="24"/>
+          <w:szCs w:val="24"/>
+          <w:rtl w:val="0"/>
+        </w:rPr>
+        <w:t xml:space="preserve">SQL. </w:t>
+      </w:r>
+      <w:r>
+        <w:rPr>
+          <w:rFonts w:ascii="Times New Roman" w:cs="Times New Roman" w:eastAsia="Times New Roman" w:hAnsi="Times New Roman"/>
+          <w:sz w:val="24"/>
+          <w:szCs w:val="24"/>
+          <w:rtl w:val="0"/>
+        </w:rPr>
+        <w:t xml:space="preserve">Lenguaje utilizado para consultar y gestionar bases de datos relacionales.</w:t>
+      </w:r>
+      <w:r>
+        <w:rPr>
+          <w:rtl w:val="0"/>
+        </w:rPr>
+      </w:r>
+    </w:p>
+    <w:p>
+      <w:pPr>
+        <w:spacing w:line="480" w:lineRule="auto"/>
+        <w:ind w:firstLine="0"/>
+        <w:rPr/>
+      </w:pPr>
+      <w:r>
+        <w:rPr>
+          <w:rFonts w:ascii="Times New Roman" w:cs="Times New Roman" w:eastAsia="Times New Roman" w:hAnsi="Times New Roman"/>
+          <w:b w:val="1"/>
+          <w:bCs w:val="1"/>
+          <w:sz w:val="24"/>
+          <w:szCs w:val="24"/>
+          <w:rtl w:val="0"/>
+        </w:rPr>
+        <w:t xml:space="preserve">REST. </w:t>
+      </w:r>
+      <w:r>
+        <w:rPr>
+          <w:rFonts w:ascii="Times New Roman" w:cs="Times New Roman" w:eastAsia="Times New Roman" w:hAnsi="Times New Roman"/>
+          <w:sz w:val="24"/>
+          <w:szCs w:val="24"/>
+          <w:rtl w:val="0"/>
+        </w:rPr>
+        <w:t xml:space="preserve">Estilo arquitectónico utilizado para exponer recursos mediante servicios web.</w:t>
+      </w:r>
       <w:r>
         <w:rPr>
           <w:rtl w:val="0"/>
@@ -528,386 +2986,184 @@
         <w:rPr>
           <w:rtl w:val="0"/>
         </w:rPr>
-        <w:t xml:space="preserve">Glosario</w:t>
-      </w:r>
-    </w:p>
-    <w:p>
-      <w:pPr>
-        <w:spacing w:line="480" w:lineRule="auto"/>
+        <w:t xml:space="preserve">Objetivos</w:t>
+      </w:r>
+    </w:p>
+    <w:p>
+      <w:pPr>
+        <w:pStyle w:val="Heading2"/>
+        <w:spacing w:after="0" w:before="0" w:line="480" w:lineRule="auto"/>
         <w:ind w:firstLine="0"/>
         <w:rPr/>
       </w:pPr>
       <w:r>
         <w:rPr>
-          <w:rFonts w:ascii="Times New Roman" w:cs="Times New Roman" w:eastAsia="Times New Roman" w:hAnsi="Times New Roman"/>
-          <w:b w:val="1"/>
-          <w:bCs w:val="1"/>
-          <w:sz w:val="24"/>
-          <w:szCs w:val="24"/>
-          <w:rtl w:val="0"/>
-        </w:rPr>
-        <w:t xml:space="preserve">API. </w:t>
-      </w:r>
-      <w:r>
-        <w:rPr>
-          <w:rFonts w:ascii="Times New Roman" w:cs="Times New Roman" w:eastAsia="Times New Roman" w:hAnsi="Times New Roman"/>
-          <w:sz w:val="24"/>
-          <w:szCs w:val="24"/>
-          <w:rtl w:val="0"/>
-        </w:rPr>
-        <w:t xml:space="preserve">Interfaz que permite la comunicación entre componentes de software.</w:t>
-      </w:r>
-      <w:r>
-        <w:rPr>
-          <w:rtl w:val="0"/>
-        </w:rPr>
-      </w:r>
-    </w:p>
-    <w:p>
-      <w:pPr>
-        <w:spacing w:line="480" w:lineRule="auto"/>
+          <w:rtl w:val="0"/>
+        </w:rPr>
+        <w:t xml:space="preserve">Objetivo general</w:t>
+      </w:r>
+    </w:p>
+    <w:p>
+      <w:pPr>
+        <w:spacing w:after="0" w:line="480" w:lineRule="auto"/>
+        <w:ind w:firstLine="720"/>
+        <w:rPr/>
+      </w:pPr>
+      <w:r>
+        <w:rPr>
+          <w:rFonts w:ascii="Times New Roman" w:cs="Times New Roman" w:eastAsia="Times New Roman" w:hAnsi="Times New Roman"/>
+          <w:color w:val="000000"/>
+          <w:sz w:val="24"/>
+          <w:szCs w:val="24"/>
+          <w:rtl w:val="0"/>
+        </w:rPr>
+        <w:t xml:space="preserve">Definir, documentar y estructurar los requisitos funcionales, no funcionales, técnicos, de alcance y legales para el desarrollo de un Planificador de Menús y Lista de Mercado que permita organizar recetas durante una semana, consolidar ingredientes, descontar existencias disponibles en la despensa y generar una lista de mercado lista para su uso.</w:t>
+      </w:r>
+      <w:r>
+        <w:rPr>
+          <w:rtl w:val="0"/>
+        </w:rPr>
+      </w:r>
+    </w:p>
+    <w:p>
+      <w:pPr>
+        <w:pStyle w:val="Heading2"/>
+        <w:spacing w:after="0" w:before="0" w:line="480" w:lineRule="auto"/>
         <w:ind w:firstLine="0"/>
         <w:rPr/>
       </w:pPr>
       <w:r>
         <w:rPr>
-          <w:rFonts w:ascii="Times New Roman" w:cs="Times New Roman" w:eastAsia="Times New Roman" w:hAnsi="Times New Roman"/>
-          <w:b w:val="1"/>
-          <w:bCs w:val="1"/>
-          <w:sz w:val="24"/>
-          <w:szCs w:val="24"/>
-          <w:rtl w:val="0"/>
-        </w:rPr>
-        <w:t xml:space="preserve">Backend. </w:t>
-      </w:r>
-      <w:r>
-        <w:rPr>
-          <w:rFonts w:ascii="Times New Roman" w:cs="Times New Roman" w:eastAsia="Times New Roman" w:hAnsi="Times New Roman"/>
-          <w:sz w:val="24"/>
-          <w:szCs w:val="24"/>
-          <w:rtl w:val="0"/>
-        </w:rPr>
-        <w:t xml:space="preserve">Capa del sistema responsable de reglas de negocio, procesamiento y acceso a datos.</w:t>
-      </w:r>
-      <w:r>
-        <w:rPr>
-          <w:rtl w:val="0"/>
-        </w:rPr>
-      </w:r>
-    </w:p>
-    <w:p>
-      <w:pPr>
-        <w:spacing w:line="480" w:lineRule="auto"/>
-        <w:ind w:firstLine="0"/>
-        <w:rPr/>
-      </w:pPr>
-      <w:r>
-        <w:rPr>
-          <w:rFonts w:ascii="Times New Roman" w:cs="Times New Roman" w:eastAsia="Times New Roman" w:hAnsi="Times New Roman"/>
-          <w:b w:val="1"/>
-          <w:bCs w:val="1"/>
-          <w:sz w:val="24"/>
-          <w:szCs w:val="24"/>
-          <w:rtl w:val="0"/>
-        </w:rPr>
-        <w:t xml:space="preserve">Frontend. </w:t>
-      </w:r>
-      <w:r>
-        <w:rPr>
-          <w:rFonts w:ascii="Times New Roman" w:cs="Times New Roman" w:eastAsia="Times New Roman" w:hAnsi="Times New Roman"/>
-          <w:sz w:val="24"/>
-          <w:szCs w:val="24"/>
-          <w:rtl w:val="0"/>
-        </w:rPr>
-        <w:t xml:space="preserve">Capa de presentación con la que interactúa directamente la persona usuaria.</w:t>
-      </w:r>
-      <w:r>
-        <w:rPr>
-          <w:rtl w:val="0"/>
-        </w:rPr>
-      </w:r>
-    </w:p>
-    <w:p>
-      <w:pPr>
-        <w:spacing w:line="480" w:lineRule="auto"/>
-        <w:ind w:firstLine="0"/>
-        <w:rPr/>
-      </w:pPr>
-      <w:r>
-        <w:rPr>
-          <w:rFonts w:ascii="Times New Roman" w:cs="Times New Roman" w:eastAsia="Times New Roman" w:hAnsi="Times New Roman"/>
-          <w:b w:val="1"/>
-          <w:bCs w:val="1"/>
-          <w:sz w:val="24"/>
-          <w:szCs w:val="24"/>
-          <w:rtl w:val="0"/>
-        </w:rPr>
-        <w:t xml:space="preserve">CRUD. </w:t>
-      </w:r>
-      <w:r>
-        <w:rPr>
-          <w:rFonts w:ascii="Times New Roman" w:cs="Times New Roman" w:eastAsia="Times New Roman" w:hAnsi="Times New Roman"/>
-          <w:sz w:val="24"/>
-          <w:szCs w:val="24"/>
-          <w:rtl w:val="0"/>
-        </w:rPr>
-        <w:t xml:space="preserve">Operaciones básicas de creación, consulta, actualización y eliminación de datos.</w:t>
-      </w:r>
-      <w:r>
-        <w:rPr>
-          <w:rtl w:val="0"/>
-        </w:rPr>
-      </w:r>
-    </w:p>
-    <w:p>
-      <w:pPr>
-        <w:spacing w:line="480" w:lineRule="auto"/>
-        <w:ind w:firstLine="0"/>
-        <w:rPr/>
-      </w:pPr>
-      <w:r>
-        <w:rPr>
-          <w:rFonts w:ascii="Times New Roman" w:cs="Times New Roman" w:eastAsia="Times New Roman" w:hAnsi="Times New Roman"/>
-          <w:b w:val="1"/>
-          <w:bCs w:val="1"/>
-          <w:sz w:val="24"/>
-          <w:szCs w:val="24"/>
-          <w:rtl w:val="0"/>
-        </w:rPr>
-        <w:t xml:space="preserve">Despensa. </w:t>
-      </w:r>
-      <w:r>
-        <w:rPr>
-          <w:rFonts w:ascii="Times New Roman" w:cs="Times New Roman" w:eastAsia="Times New Roman" w:hAnsi="Times New Roman"/>
-          <w:sz w:val="24"/>
-          <w:szCs w:val="24"/>
-          <w:rtl w:val="0"/>
-        </w:rPr>
-        <w:t xml:space="preserve">Conjunto de ingredientes disponibles antes de generar una lista de mercado.</w:t>
-      </w:r>
-      <w:r>
-        <w:rPr>
-          <w:rtl w:val="0"/>
-        </w:rPr>
-      </w:r>
-    </w:p>
-    <w:p>
-      <w:pPr>
-        <w:spacing w:line="480" w:lineRule="auto"/>
-        <w:ind w:firstLine="0"/>
-        <w:rPr/>
-      </w:pPr>
-      <w:r>
-        <w:rPr>
-          <w:rFonts w:ascii="Times New Roman" w:cs="Times New Roman" w:eastAsia="Times New Roman" w:hAnsi="Times New Roman"/>
-          <w:b w:val="1"/>
-          <w:bCs w:val="1"/>
-          <w:sz w:val="24"/>
-          <w:szCs w:val="24"/>
-          <w:rtl w:val="0"/>
-        </w:rPr>
-        <w:t xml:space="preserve">Lista de mercado. </w:t>
-      </w:r>
-      <w:r>
-        <w:rPr>
-          <w:rFonts w:ascii="Times New Roman" w:cs="Times New Roman" w:eastAsia="Times New Roman" w:hAnsi="Times New Roman"/>
-          <w:sz w:val="24"/>
-          <w:szCs w:val="24"/>
-          <w:rtl w:val="0"/>
-        </w:rPr>
-        <w:t xml:space="preserve">Relación consolidada de ingredientes y cantidades que deben adquirirse.</w:t>
-      </w:r>
-      <w:r>
-        <w:rPr>
-          <w:rtl w:val="0"/>
-        </w:rPr>
-      </w:r>
-    </w:p>
-    <w:p>
-      <w:pPr>
-        <w:spacing w:line="480" w:lineRule="auto"/>
-        <w:ind w:firstLine="0"/>
-        <w:rPr/>
-      </w:pPr>
-      <w:r>
-        <w:rPr>
-          <w:rFonts w:ascii="Times New Roman" w:cs="Times New Roman" w:eastAsia="Times New Roman" w:hAnsi="Times New Roman"/>
-          <w:b w:val="1"/>
-          <w:bCs w:val="1"/>
-          <w:sz w:val="24"/>
-          <w:szCs w:val="24"/>
-          <w:rtl w:val="0"/>
-        </w:rPr>
-        <w:t xml:space="preserve">Plan de menú. </w:t>
-      </w:r>
-      <w:r>
-        <w:rPr>
-          <w:rFonts w:ascii="Times New Roman" w:cs="Times New Roman" w:eastAsia="Times New Roman" w:hAnsi="Times New Roman"/>
-          <w:sz w:val="24"/>
-          <w:szCs w:val="24"/>
-          <w:rtl w:val="0"/>
-        </w:rPr>
-        <w:t xml:space="preserve">Estructura semanal que organiza recetas por día y por tipo de comida.</w:t>
-      </w:r>
-      <w:r>
-        <w:rPr>
-          <w:rtl w:val="0"/>
-        </w:rPr>
-      </w:r>
-    </w:p>
-    <w:p>
-      <w:pPr>
-        <w:spacing w:line="480" w:lineRule="auto"/>
-        <w:ind w:firstLine="0"/>
-        <w:rPr/>
-      </w:pPr>
-      <w:r>
-        <w:rPr>
-          <w:rFonts w:ascii="Times New Roman" w:cs="Times New Roman" w:eastAsia="Times New Roman" w:hAnsi="Times New Roman"/>
-          <w:b w:val="1"/>
-          <w:bCs w:val="1"/>
-          <w:sz w:val="24"/>
-          <w:szCs w:val="24"/>
-          <w:rtl w:val="0"/>
-        </w:rPr>
-        <w:t xml:space="preserve">Receta. </w:t>
-      </w:r>
-      <w:r>
-        <w:rPr>
-          <w:rFonts w:ascii="Times New Roman" w:cs="Times New Roman" w:eastAsia="Times New Roman" w:hAnsi="Times New Roman"/>
-          <w:sz w:val="24"/>
-          <w:szCs w:val="24"/>
-          <w:rtl w:val="0"/>
-        </w:rPr>
-        <w:t xml:space="preserve">Conjunto de ingredientes, cantidades e instrucciones para preparar un plato.</w:t>
-      </w:r>
-      <w:r>
-        <w:rPr>
-          <w:rtl w:val="0"/>
-        </w:rPr>
-      </w:r>
-    </w:p>
-    <w:p>
-      <w:pPr>
-        <w:spacing w:line="480" w:lineRule="auto"/>
-        <w:ind w:firstLine="0"/>
-        <w:rPr/>
-      </w:pPr>
-      <w:r>
-        <w:rPr>
-          <w:rFonts w:ascii="Times New Roman" w:cs="Times New Roman" w:eastAsia="Times New Roman" w:hAnsi="Times New Roman"/>
-          <w:b w:val="1"/>
-          <w:bCs w:val="1"/>
-          <w:sz w:val="24"/>
-          <w:szCs w:val="24"/>
-          <w:rtl w:val="0"/>
-        </w:rPr>
-        <w:t xml:space="preserve">Sprint. </w:t>
-      </w:r>
-      <w:r>
-        <w:rPr>
-          <w:rFonts w:ascii="Times New Roman" w:cs="Times New Roman" w:eastAsia="Times New Roman" w:hAnsi="Times New Roman"/>
-          <w:sz w:val="24"/>
-          <w:szCs w:val="24"/>
-          <w:rtl w:val="0"/>
-        </w:rPr>
-        <w:t xml:space="preserve">Periodo de trabajo acotado utilizado para planificar y entregar incrementos del producto.</w:t>
-      </w:r>
-      <w:r>
-        <w:rPr>
-          <w:rtl w:val="0"/>
-        </w:rPr>
-      </w:r>
-    </w:p>
-    <w:p>
-      <w:pPr>
-        <w:spacing w:line="480" w:lineRule="auto"/>
-        <w:ind w:firstLine="0"/>
-        <w:rPr/>
-      </w:pPr>
-      <w:r>
-        <w:rPr>
-          <w:rFonts w:ascii="Times New Roman" w:cs="Times New Roman" w:eastAsia="Times New Roman" w:hAnsi="Times New Roman"/>
-          <w:b w:val="1"/>
-          <w:bCs w:val="1"/>
-          <w:sz w:val="24"/>
-          <w:szCs w:val="24"/>
-          <w:rtl w:val="0"/>
-        </w:rPr>
-        <w:t xml:space="preserve">Scrum Master. </w:t>
-      </w:r>
-      <w:r>
-        <w:rPr>
-          <w:rFonts w:ascii="Times New Roman" w:cs="Times New Roman" w:eastAsia="Times New Roman" w:hAnsi="Times New Roman"/>
-          <w:sz w:val="24"/>
-          <w:szCs w:val="24"/>
-          <w:rtl w:val="0"/>
-        </w:rPr>
-        <w:t xml:space="preserve">Rol que facilita el marco Scrum, remueve impedimentos y ayuda a que el equipo mantenga el proceso.</w:t>
-      </w:r>
-      <w:r>
-        <w:rPr>
-          <w:rtl w:val="0"/>
-        </w:rPr>
-      </w:r>
-    </w:p>
-    <w:p>
-      <w:pPr>
-        <w:spacing w:line="480" w:lineRule="auto"/>
-        <w:ind w:firstLine="0"/>
-        <w:rPr/>
-      </w:pPr>
-      <w:r>
-        <w:rPr>
-          <w:rFonts w:ascii="Times New Roman" w:cs="Times New Roman" w:eastAsia="Times New Roman" w:hAnsi="Times New Roman"/>
-          <w:b w:val="1"/>
-          <w:bCs w:val="1"/>
-          <w:sz w:val="24"/>
-          <w:szCs w:val="24"/>
-          <w:rtl w:val="0"/>
-        </w:rPr>
-        <w:t xml:space="preserve">SQL. </w:t>
-      </w:r>
-      <w:r>
-        <w:rPr>
-          <w:rFonts w:ascii="Times New Roman" w:cs="Times New Roman" w:eastAsia="Times New Roman" w:hAnsi="Times New Roman"/>
-          <w:sz w:val="24"/>
-          <w:szCs w:val="24"/>
-          <w:rtl w:val="0"/>
-        </w:rPr>
-        <w:t xml:space="preserve">Lenguaje utilizado para consultar y gestionar bases de datos relacionales.</w:t>
-      </w:r>
-      <w:r>
-        <w:rPr>
-          <w:rtl w:val="0"/>
-        </w:rPr>
-      </w:r>
-    </w:p>
-    <w:p>
-      <w:pPr>
-        <w:spacing w:line="480" w:lineRule="auto"/>
-        <w:ind w:firstLine="0"/>
-        <w:rPr/>
-      </w:pPr>
-      <w:r>
-        <w:rPr>
-          <w:rFonts w:ascii="Times New Roman" w:cs="Times New Roman" w:eastAsia="Times New Roman" w:hAnsi="Times New Roman"/>
-          <w:b w:val="1"/>
-          <w:bCs w:val="1"/>
-          <w:sz w:val="24"/>
-          <w:szCs w:val="24"/>
-          <w:rtl w:val="0"/>
-        </w:rPr>
-        <w:t xml:space="preserve">REST. </w:t>
-      </w:r>
-      <w:r>
-        <w:rPr>
-          <w:rFonts w:ascii="Times New Roman" w:cs="Times New Roman" w:eastAsia="Times New Roman" w:hAnsi="Times New Roman"/>
-          <w:sz w:val="24"/>
-          <w:szCs w:val="24"/>
-          <w:rtl w:val="0"/>
-        </w:rPr>
-        <w:t xml:space="preserve">Estilo arquitectónico utilizado para exponer recursos mediante servicios web.</w:t>
+          <w:rtl w:val="0"/>
+        </w:rPr>
+        <w:t xml:space="preserve">Objetivos específicos</w:t>
+      </w:r>
+    </w:p>
+    <w:p>
+      <w:pPr>
+        <w:spacing w:after="0" w:line="480" w:lineRule="auto"/>
+        <w:ind w:firstLine="720"/>
+        <w:rPr/>
+      </w:pPr>
+      <w:r>
+        <w:rPr>
+          <w:rFonts w:ascii="Times New Roman" w:cs="Times New Roman" w:eastAsia="Times New Roman" w:hAnsi="Times New Roman"/>
+          <w:color w:val="000000"/>
+          <w:sz w:val="24"/>
+          <w:szCs w:val="24"/>
+          <w:rtl w:val="0"/>
+        </w:rPr>
+        <w:t xml:space="preserve">• Identificar la necesidad que origina el producto y describir la situación actual que se busca mejorar.</w:t>
+      </w:r>
+      <w:r>
+        <w:rPr>
+          <w:rtl w:val="0"/>
+        </w:rPr>
+      </w:r>
+    </w:p>
+    <w:p>
+      <w:pPr>
+        <w:spacing w:after="0" w:line="480" w:lineRule="auto"/>
+        <w:ind w:firstLine="720"/>
+        <w:rPr/>
+      </w:pPr>
+      <w:r>
+        <w:rPr>
+          <w:rFonts w:ascii="Times New Roman" w:cs="Times New Roman" w:eastAsia="Times New Roman" w:hAnsi="Times New Roman"/>
+          <w:color w:val="000000"/>
+          <w:sz w:val="24"/>
+          <w:szCs w:val="24"/>
+          <w:rtl w:val="0"/>
+        </w:rPr>
+        <w:t xml:space="preserve">• Definir los actores, casos de uso y reglas de negocio principales del sistema.</w:t>
+      </w:r>
+      <w:r>
+        <w:rPr>
+          <w:rtl w:val="0"/>
+        </w:rPr>
+      </w:r>
+    </w:p>
+    <w:p>
+      <w:pPr>
+        <w:spacing w:after="0" w:line="480" w:lineRule="auto"/>
+        <w:ind w:firstLine="720"/>
+        <w:rPr/>
+      </w:pPr>
+      <w:r>
+        <w:rPr>
+          <w:rFonts w:ascii="Times New Roman" w:cs="Times New Roman" w:eastAsia="Times New Roman" w:hAnsi="Times New Roman"/>
+          <w:color w:val="000000"/>
+          <w:sz w:val="24"/>
+          <w:szCs w:val="24"/>
+          <w:rtl w:val="0"/>
+        </w:rPr>
+        <w:t xml:space="preserve">• Establecer una arquitectura básica de frontend, backend y base de datos que sea viable para un proyecto académico.</w:t>
+      </w:r>
+      <w:r>
+        <w:rPr>
+          <w:rtl w:val="0"/>
+        </w:rPr>
+      </w:r>
+    </w:p>
+    <w:p>
+      <w:pPr>
+        <w:spacing w:after="0" w:line="480" w:lineRule="auto"/>
+        <w:ind w:firstLine="720"/>
+        <w:rPr/>
+      </w:pPr>
+      <w:r>
+        <w:rPr>
+          <w:rFonts w:ascii="Times New Roman" w:cs="Times New Roman" w:eastAsia="Times New Roman" w:hAnsi="Times New Roman"/>
+          <w:color w:val="000000"/>
+          <w:sz w:val="24"/>
+          <w:szCs w:val="24"/>
+          <w:rtl w:val="0"/>
+        </w:rPr>
+        <w:t xml:space="preserve">• Modelar cinco tablas relacionales capaces de sostener la planificación semanal, la relación entre recetas e ingredientes y el cálculo de compras.</w:t>
+      </w:r>
+      <w:r>
+        <w:rPr>
+          <w:rtl w:val="0"/>
+        </w:rPr>
+      </w:r>
+    </w:p>
+    <w:p>
+      <w:pPr>
+        <w:spacing w:after="0" w:line="480" w:lineRule="auto"/>
+        <w:ind w:firstLine="720"/>
+        <w:rPr/>
+      </w:pPr>
+      <w:r>
+        <w:rPr>
+          <w:rFonts w:ascii="Times New Roman" w:cs="Times New Roman" w:eastAsia="Times New Roman" w:hAnsi="Times New Roman"/>
+          <w:color w:val="000000"/>
+          <w:sz w:val="24"/>
+          <w:szCs w:val="24"/>
+          <w:rtl w:val="0"/>
+        </w:rPr>
+        <w:t xml:space="preserve">• Documentar el alcance, las inclusiones, las exclusiones y el entregable final correspondiente a la Célula 5.</w:t>
+      </w:r>
+      <w:r>
+        <w:rPr>
+          <w:rtl w:val="0"/>
+        </w:rPr>
+      </w:r>
+    </w:p>
+    <w:p>
+      <w:pPr>
+        <w:spacing w:after="0" w:line="480" w:lineRule="auto"/>
+        <w:ind w:firstLine="720"/>
+        <w:rPr/>
+      </w:pPr>
+      <w:r>
+        <w:rPr>
+          <w:rFonts w:ascii="Times New Roman" w:cs="Times New Roman" w:eastAsia="Times New Roman" w:hAnsi="Times New Roman"/>
+          <w:color w:val="000000"/>
+          <w:sz w:val="24"/>
+          <w:szCs w:val="24"/>
+          <w:rtl w:val="0"/>
+        </w:rPr>
+        <w:t xml:space="preserve">• Establecer condiciones legales y de propiedad intelectual que eviten la asociación no autorizada del proyecto con marcas, identidad corporativa, activos o información reservada de terceros.</w:t>
       </w:r>
       <w:r>
         <w:rPr>
@@ -939,7 +3195,127 @@
         <w:rPr>
           <w:rtl w:val="0"/>
         </w:rPr>
-        <w:t xml:space="preserve">Objetivos</w:t>
+        <w:t xml:space="preserve">Introducción</w:t>
+      </w:r>
+    </w:p>
+    <w:p>
+      <w:pPr>
+        <w:spacing w:after="0" w:line="480" w:lineRule="auto"/>
+        <w:ind w:firstLine="720"/>
+        <w:rPr/>
+      </w:pPr>
+      <w:r>
+        <w:rPr>
+          <w:rFonts w:ascii="Times New Roman" w:cs="Times New Roman" w:eastAsia="Times New Roman" w:hAnsi="Times New Roman"/>
+          <w:color w:val="000000"/>
+          <w:sz w:val="24"/>
+          <w:szCs w:val="24"/>
+          <w:rtl w:val="0"/>
+        </w:rPr>
+        <w:t xml:space="preserve">El presente Informe de Requisitos establece la base funcional, técnica y documental para el desarrollo de un sistema denominado Planificador de Menús y Lista de Mercado. La propuesta parte de una necesidad cotidiana: pasar de una receta aislada a una planificación semanal que permita decidir qué preparar, identificar los ingredientes requeridos y determinar qué hace falta comprar.</w:t>
+      </w:r>
+      <w:r>
+        <w:rPr>
+          <w:rtl w:val="0"/>
+        </w:rPr>
+      </w:r>
+    </w:p>
+    <w:p>
+      <w:pPr>
+        <w:spacing w:after="0" w:line="480" w:lineRule="auto"/>
+        <w:ind w:firstLine="720"/>
+        <w:rPr>
+          <w:rFonts w:ascii="Times New Roman" w:cs="Times New Roman" w:eastAsia="Times New Roman" w:hAnsi="Times New Roman"/>
+          <w:color w:val="000000"/>
+          <w:sz w:val="24"/>
+          <w:szCs w:val="24"/>
+        </w:rPr>
+      </w:pPr>
+      <w:r>
+        <w:rPr>
+          <w:rFonts w:ascii="Times New Roman" w:cs="Times New Roman" w:eastAsia="Times New Roman" w:hAnsi="Times New Roman"/>
+          <w:color w:val="000000"/>
+          <w:sz w:val="24"/>
+          <w:szCs w:val="24"/>
+          <w:rtl w:val="0"/>
+        </w:rPr>
+        <w:t xml:space="preserve">La solución se plantea como una aplicación web con un frontend desarrollado en React y un backend desarrollado en Spring Boot, apoyados por una base de datos relacional. El frontend ofrecerá un calendario semanal con interacción de arrastrar y soltar para </w:t>
+      </w:r>
+      <w:r>
+        <w:rPr>
+          <w:rtl w:val="0"/>
+        </w:rPr>
+        <w:t xml:space="preserve">buscar</w:t>
+      </w:r>
+      <w:r>
+        <w:rPr>
+          <w:rFonts w:ascii="Times New Roman" w:cs="Times New Roman" w:eastAsia="Times New Roman" w:hAnsi="Times New Roman"/>
+          <w:color w:val="000000"/>
+          <w:sz w:val="24"/>
+          <w:szCs w:val="24"/>
+          <w:rtl w:val="0"/>
+        </w:rPr>
+        <w:t xml:space="preserve"> recetas por día y comida, además de una lista de mercado agrupada por categorías con posibilidad de marcar elementos como comprados. El backend será responsable de la creación de planes, consolidación de ingredientes, cálculo de cantidades faltantes y generación de la lista.</w:t>
+      </w:r>
+    </w:p>
+    <w:p>
+      <w:pPr>
+        <w:rPr/>
+      </w:pPr>
+      <w:r>
+        <w:rPr>
+          <w:rtl w:val="0"/>
+        </w:rPr>
+        <w:t xml:space="preserve">Dentro del marco del desarrollo de software bajo metodologías ágiles, la planificación técnica y la estructuración de los datos constituyen un pilar fundamental para garantizar la escalabilidad, mantenibilidad y correcta integración entre los componentes del sistema. El presente documento detalla el diseño del modelo de base de datos relacional correspondiente al Lote 05, enfocado en el "Planificador de Menús y Lista de Mercado" (Célula 5). Este módulo permite evolucionar desde la selección individual de recetas hasta la estructuración de un plan semanal automatizado, calculando faltantes de despensa y generando de forma inteligente la lista de compras.</w:t>
+      </w:r>
+    </w:p>
+    <w:p>
+      <w:pPr>
+        <w:spacing w:after="0" w:line="480" w:lineRule="auto"/>
+        <w:ind w:firstLine="720"/>
+        <w:rPr/>
+      </w:pPr>
+      <w:r>
+        <w:rPr>
+          <w:rFonts w:ascii="Times New Roman" w:cs="Times New Roman" w:eastAsia="Times New Roman" w:hAnsi="Times New Roman"/>
+          <w:color w:val="000000"/>
+          <w:sz w:val="24"/>
+          <w:szCs w:val="24"/>
+          <w:rtl w:val="0"/>
+        </w:rPr>
+        <w:t xml:space="preserve">El documento también establece el alcance del entregable de la Célula 5, la propuesta de modelo de datos, los diagramas de casos de uso y modelo relacional, el stack tecnológico, los criterios de despliegue y las condiciones legales aplicables. En particular, se establece una separación explícita entre un proyecto académico y cualquier empresa, marca o identidad corporativa que pueda haber servido como referencia inicial.</w:t>
+      </w:r>
+      <w:r>
+        <w:rPr>
+          <w:rtl w:val="0"/>
+        </w:rPr>
+      </w:r>
+    </w:p>
+    <w:p>
+      <w:pPr>
+        <w:rPr/>
+      </w:pPr>
+      <w:r>
+        <w:br w:type="page"/>
+      </w:r>
+      <w:r>
+        <w:rPr>
+          <w:rtl w:val="0"/>
+        </w:rPr>
+      </w:r>
+    </w:p>
+    <w:p>
+      <w:pPr>
+        <w:pStyle w:val="Heading1"/>
+        <w:spacing w:after="0" w:before="0" w:line="480" w:lineRule="auto"/>
+        <w:ind w:firstLine="0"/>
+        <w:rPr/>
+      </w:pPr>
+      <w:r>
+        <w:rPr>
+          <w:rtl w:val="0"/>
+        </w:rPr>
+        <w:t xml:space="preserve">Planteamiento del problema</w:t>
       </w:r>
     </w:p>
     <w:p>
@@ -953,7 +3329,7 @@
         <w:rPr>
           <w:rtl w:val="0"/>
         </w:rPr>
-        <w:t xml:space="preserve">Objetivo general</w:t>
+        <w:t xml:space="preserve">Necesidad</w:t>
       </w:r>
     </w:p>
     <w:p>
@@ -970,7 +3346,7 @@
           <w:szCs w:val="24"/>
           <w:rtl w:val="0"/>
         </w:rPr>
-        <w:t xml:space="preserve">Definir, documentar y estructurar los requisitos funcionales, no funcionales, técnicos, de alcance y legales para el desarrollo de un Planificador de Menús y Lista de Mercado que permita organizar recetas durante una semana, consolidar ingredientes, descontar existencias disponibles en la despensa y generar una lista de mercado lista para su uso.</w:t>
+        <w:t xml:space="preserve">Las personas que preparan alimentos durante la semana suelen trabajar con recetas independientes y decisiones tomadas día a día. Este enfoque puede producir duplicidad de compras, olvidos de ingredientes, dificultad para calcular cantidades y poca visibilidad sobre lo que ya existe en la despensa.</w:t>
       </w:r>
       <w:r>
         <w:rPr>
@@ -989,7 +3365,7 @@
         <w:rPr>
           <w:rtl w:val="0"/>
         </w:rPr>
-        <w:t xml:space="preserve">Objetivos específicos</w:t>
+        <w:t xml:space="preserve">Manejo actual</w:t>
       </w:r>
     </w:p>
     <w:p>
@@ -1006,242 +3382,12 @@
           <w:szCs w:val="24"/>
           <w:rtl w:val="0"/>
         </w:rPr>
-        <w:t xml:space="preserve">• Identificar la necesidad que origina el producto y describir la situación actual que se busca mejorar.</w:t>
-      </w:r>
-      <w:r>
-        <w:rPr>
-          <w:rtl w:val="0"/>
-        </w:rPr>
-      </w:r>
-    </w:p>
-    <w:p>
-      <w:pPr>
-        <w:spacing w:after="0" w:line="480" w:lineRule="auto"/>
-        <w:ind w:firstLine="720"/>
-        <w:rPr/>
-      </w:pPr>
-      <w:r>
-        <w:rPr>
-          <w:rFonts w:ascii="Times New Roman" w:cs="Times New Roman" w:eastAsia="Times New Roman" w:hAnsi="Times New Roman"/>
-          <w:color w:val="000000"/>
-          <w:sz w:val="24"/>
-          <w:szCs w:val="24"/>
-          <w:rtl w:val="0"/>
-        </w:rPr>
-        <w:t xml:space="preserve">• Definir los actores, casos de uso y reglas de negocio principales del sistema.</w:t>
-      </w:r>
-      <w:r>
-        <w:rPr>
-          <w:rtl w:val="0"/>
-        </w:rPr>
-      </w:r>
-    </w:p>
-    <w:p>
-      <w:pPr>
-        <w:spacing w:after="0" w:line="480" w:lineRule="auto"/>
-        <w:ind w:firstLine="720"/>
-        <w:rPr/>
-      </w:pPr>
-      <w:r>
-        <w:rPr>
-          <w:rFonts w:ascii="Times New Roman" w:cs="Times New Roman" w:eastAsia="Times New Roman" w:hAnsi="Times New Roman"/>
-          <w:color w:val="000000"/>
-          <w:sz w:val="24"/>
-          <w:szCs w:val="24"/>
-          <w:rtl w:val="0"/>
-        </w:rPr>
-        <w:t xml:space="preserve">• Establecer una arquitectura básica de frontend, backend y base de datos que sea viable para un proyecto académico.</w:t>
-      </w:r>
-      <w:r>
-        <w:rPr>
-          <w:rtl w:val="0"/>
-        </w:rPr>
-      </w:r>
-    </w:p>
-    <w:p>
-      <w:pPr>
-        <w:spacing w:after="0" w:line="480" w:lineRule="auto"/>
-        <w:ind w:firstLine="720"/>
-        <w:rPr/>
-      </w:pPr>
-      <w:r>
-        <w:rPr>
-          <w:rFonts w:ascii="Times New Roman" w:cs="Times New Roman" w:eastAsia="Times New Roman" w:hAnsi="Times New Roman"/>
-          <w:color w:val="000000"/>
-          <w:sz w:val="24"/>
-          <w:szCs w:val="24"/>
-          <w:rtl w:val="0"/>
-        </w:rPr>
-        <w:t xml:space="preserve">• Modelar cinco tablas relacionales capaces de sostener la planificación semanal, la relación entre recetas e ingredientes y el cálculo de compras.</w:t>
-      </w:r>
-      <w:r>
-        <w:rPr>
-          <w:rtl w:val="0"/>
-        </w:rPr>
-      </w:r>
-    </w:p>
-    <w:p>
-      <w:pPr>
-        <w:spacing w:after="0" w:line="480" w:lineRule="auto"/>
-        <w:ind w:firstLine="720"/>
-        <w:rPr/>
-      </w:pPr>
-      <w:r>
-        <w:rPr>
-          <w:rFonts w:ascii="Times New Roman" w:cs="Times New Roman" w:eastAsia="Times New Roman" w:hAnsi="Times New Roman"/>
-          <w:color w:val="000000"/>
-          <w:sz w:val="24"/>
-          <w:szCs w:val="24"/>
-          <w:rtl w:val="0"/>
-        </w:rPr>
-        <w:t xml:space="preserve">• Documentar el alcance, las inclusiones, las exclusiones y el entregable final correspondiente a la Célula 5.</w:t>
-      </w:r>
-      <w:r>
-        <w:rPr>
-          <w:rtl w:val="0"/>
-        </w:rPr>
-      </w:r>
-    </w:p>
-    <w:p>
-      <w:pPr>
-        <w:spacing w:after="0" w:line="480" w:lineRule="auto"/>
-        <w:ind w:firstLine="720"/>
-        <w:rPr/>
-      </w:pPr>
-      <w:r>
-        <w:rPr>
-          <w:rFonts w:ascii="Times New Roman" w:cs="Times New Roman" w:eastAsia="Times New Roman" w:hAnsi="Times New Roman"/>
-          <w:color w:val="000000"/>
-          <w:sz w:val="24"/>
-          <w:szCs w:val="24"/>
-          <w:rtl w:val="0"/>
-        </w:rPr>
-        <w:t xml:space="preserve">• Establecer condiciones legales y de propiedad intelectual que eviten la asociación no autorizada del proyecto con marcas, identidad corporativa, activos o información reservada de terceros.</w:t>
-      </w:r>
-      <w:r>
-        <w:rPr>
-          <w:rtl w:val="0"/>
-        </w:rPr>
-      </w:r>
-    </w:p>
-    <w:p>
-      <w:pPr>
-        <w:rPr/>
-      </w:pPr>
-      <w:r>
-        <w:br w:type="page"/>
-      </w:r>
-      <w:r>
-        <w:rPr>
-          <w:rtl w:val="0"/>
-        </w:rPr>
-      </w:r>
-    </w:p>
-    <w:p>
-      <w:pPr>
-        <w:pStyle w:val="Heading1"/>
-        <w:spacing w:after="0" w:before="0" w:line="480" w:lineRule="auto"/>
-        <w:ind w:firstLine="0"/>
-        <w:rPr/>
-      </w:pPr>
-      <w:r>
-        <w:rPr>
-          <w:rtl w:val="0"/>
-        </w:rPr>
-        <w:t xml:space="preserve">Introducción</w:t>
-      </w:r>
-    </w:p>
-    <w:p>
-      <w:pPr>
-        <w:spacing w:after="0" w:line="480" w:lineRule="auto"/>
-        <w:ind w:firstLine="720"/>
-        <w:rPr/>
-      </w:pPr>
-      <w:r>
-        <w:rPr>
-          <w:rFonts w:ascii="Times New Roman" w:cs="Times New Roman" w:eastAsia="Times New Roman" w:hAnsi="Times New Roman"/>
-          <w:color w:val="000000"/>
-          <w:sz w:val="24"/>
-          <w:szCs w:val="24"/>
-          <w:rtl w:val="0"/>
-        </w:rPr>
-        <w:t xml:space="preserve">El presente Informe de Requisitos establece la base funcional, técnica y documental para el desarrollo de un sistema denominado Planificador de Menús y Lista de Mercado. La propuesta parte de una necesidad cotidiana: pasar de una receta aislada a una planificación semanal que permita decidir qué preparar, identificar los ingredientes requeridos y determinar qué hace falta comprar.</w:t>
-      </w:r>
-      <w:r>
-        <w:rPr>
-          <w:rtl w:val="0"/>
-        </w:rPr>
-      </w:r>
-    </w:p>
-    <w:p>
-      <w:pPr>
-        <w:spacing w:after="0" w:line="480" w:lineRule="auto"/>
-        <w:ind w:firstLine="720"/>
-        <w:rPr/>
-      </w:pPr>
-      <w:r>
-        <w:rPr>
-          <w:rFonts w:ascii="Times New Roman" w:cs="Times New Roman" w:eastAsia="Times New Roman" w:hAnsi="Times New Roman"/>
-          <w:color w:val="000000"/>
-          <w:sz w:val="24"/>
-          <w:szCs w:val="24"/>
-          <w:rtl w:val="0"/>
-        </w:rPr>
-        <w:t xml:space="preserve">La solución se plantea como una aplicación web con un frontend desarrollado en React y un backend desarrollado en Spring Boot, apoyados por una base de datos relacional. El frontend ofrecerá un calendario semanal con interacción de arrastrar y soltar para ubicar recetas por día y comida, además de una lista de mercado agrupada por categorías con posibilidad de marcar elementos como comprados. El backend será responsable de la creación de planes, consolidación de ingredientes, cálculo de cantidades faltantes y generación de la lista.</w:t>
-      </w:r>
-      <w:r>
-        <w:rPr>
-          <w:rtl w:val="0"/>
-        </w:rPr>
-      </w:r>
-    </w:p>
-    <w:p>
-      <w:pPr>
-        <w:spacing w:after="0" w:line="480" w:lineRule="auto"/>
-        <w:ind w:firstLine="720"/>
-        <w:rPr/>
-      </w:pPr>
-      <w:r>
-        <w:rPr>
-          <w:rFonts w:ascii="Times New Roman" w:cs="Times New Roman" w:eastAsia="Times New Roman" w:hAnsi="Times New Roman"/>
-          <w:color w:val="000000"/>
-          <w:sz w:val="24"/>
-          <w:szCs w:val="24"/>
-          <w:rtl w:val="0"/>
-        </w:rPr>
-        <w:t xml:space="preserve">El documento también establece el alcance del entregable de la Célula 5, la propuesta de modelo de datos, los diagramas de casos de uso y modelo relacional, el stack tecnológico, los criterios de despliegue y las condiciones legales aplicables. En particular, se establece una separación explícita entre un proyecto académico y cualquier empresa, marca o identidad corporativa que pueda haber servido como referencia inicial.</w:t>
-      </w:r>
-      <w:r>
-        <w:rPr>
-          <w:rtl w:val="0"/>
-        </w:rPr>
-      </w:r>
-    </w:p>
-    <w:p>
-      <w:pPr>
-        <w:rPr/>
-      </w:pPr>
-      <w:r>
-        <w:br w:type="page"/>
-      </w:r>
-      <w:r>
-        <w:rPr>
-          <w:rtl w:val="0"/>
-        </w:rPr>
-      </w:r>
-    </w:p>
-    <w:p>
-      <w:pPr>
-        <w:pStyle w:val="Heading1"/>
-        <w:spacing w:after="0" w:before="0" w:line="480" w:lineRule="auto"/>
-        <w:ind w:firstLine="0"/>
-        <w:rPr/>
-      </w:pPr>
-      <w:r>
-        <w:rPr>
-          <w:rtl w:val="0"/>
-        </w:rPr>
-        <w:t xml:space="preserve">Planteamiento del problema</w:t>
+        <w:t xml:space="preserve">El manejo manual normalmente consiste en consultar recetas, escribir ingredientes en notas o aplicaciones separadas, revisar la despensa y construir una lista de mercado. Cuando existen varias recetas para diferentes días y comidas, el proceso exige consolidar manualmente ingredientes repetidos y ajustar las cantidades disponibles. Esta fragmentación aumenta el esfuerzo y dificulta mantener una relación consistente entre el menú y las compras.</w:t>
+      </w:r>
+      <w:r>
+        <w:rPr>
+          <w:rtl w:val="0"/>
+        </w:rPr>
       </w:r>
     </w:p>
     <w:p>
@@ -1255,7 +3401,7 @@
         <w:rPr>
           <w:rtl w:val="0"/>
         </w:rPr>
-        <w:t xml:space="preserve">Necesidad</w:t>
+        <w:t xml:space="preserve">Solución propuesta: Planificador de Menús y Lista de Mercado</w:t>
       </w:r>
     </w:p>
     <w:p>
@@ -1272,34 +3418,14 @@
           <w:szCs w:val="24"/>
           <w:rtl w:val="0"/>
         </w:rPr>
-        <w:t xml:space="preserve">Las personas que preparan alimentos durante la semana suelen trabajar con recetas independientes y decisiones tomadas día a día. Este enfoque puede producir duplicidad de compras, olvidos de ingredientes, dificultad para calcular cantidades y poca visibilidad sobre lo que ya existe en la despensa.</w:t>
-      </w:r>
-      <w:r>
-        <w:rPr>
-          <w:rtl w:val="0"/>
-        </w:rPr>
-      </w:r>
-    </w:p>
-    <w:p>
-      <w:pPr>
-        <w:pStyle w:val="Heading2"/>
-        <w:spacing w:after="0" w:before="0" w:line="480" w:lineRule="auto"/>
-        <w:ind w:firstLine="0"/>
-        <w:rPr/>
-      </w:pPr>
-      <w:r>
-        <w:rPr>
-          <w:rtl w:val="0"/>
-        </w:rPr>
-        <w:t xml:space="preserve">Manejo actual</w:t>
-      </w:r>
-    </w:p>
-    <w:p>
-      <w:pPr>
-        <w:spacing w:after="0" w:line="480" w:lineRule="auto"/>
-        <w:ind w:firstLine="720"/>
-        <w:rPr/>
-      </w:pPr>
+        <w:t xml:space="preserve">La solución propone transformar el flujo de trabajo de la receta suelta al plan de la semana: armar el menú, calcular lo que hace falta y salir con la lista de mercado lista. El usuario podrá </w:t>
+      </w:r>
+      <w:r>
+        <w:rPr>
+          <w:rtl w:val="0"/>
+        </w:rPr>
+        <w:t xml:space="preserve">buscar</w:t>
+      </w:r>
       <w:r>
         <w:rPr>
           <w:rFonts w:ascii="Times New Roman" w:cs="Times New Roman" w:eastAsia="Times New Roman" w:hAnsi="Times New Roman"/>
@@ -1308,43 +3434,7 @@
           <w:szCs w:val="24"/>
           <w:rtl w:val="0"/>
         </w:rPr>
-        <w:t xml:space="preserve">El manejo manual normalmente consiste en consultar recetas, escribir ingredientes en notas o aplicaciones separadas, revisar la despensa y construir una lista de mercado. Cuando existen varias recetas para diferentes días y comidas, el proceso exige consolidar manualmente ingredientes repetidos y ajustar las cantidades disponibles. Esta fragmentación aumenta el esfuerzo y dificulta mantener una relación consistente entre el menú y las compras.</w:t>
-      </w:r>
-      <w:r>
-        <w:rPr>
-          <w:rtl w:val="0"/>
-        </w:rPr>
-      </w:r>
-    </w:p>
-    <w:p>
-      <w:pPr>
-        <w:pStyle w:val="Heading2"/>
-        <w:spacing w:after="0" w:before="0" w:line="480" w:lineRule="auto"/>
-        <w:ind w:firstLine="0"/>
-        <w:rPr/>
-      </w:pPr>
-      <w:r>
-        <w:rPr>
-          <w:rtl w:val="0"/>
-        </w:rPr>
-        <w:t xml:space="preserve">Solución propuesta: Planificador de Menús y Lista de Mercado</w:t>
-      </w:r>
-    </w:p>
-    <w:p>
-      <w:pPr>
-        <w:spacing w:after="0" w:line="480" w:lineRule="auto"/>
-        <w:ind w:firstLine="720"/>
-        <w:rPr/>
-      </w:pPr>
-      <w:r>
-        <w:rPr>
-          <w:rFonts w:ascii="Times New Roman" w:cs="Times New Roman" w:eastAsia="Times New Roman" w:hAnsi="Times New Roman"/>
-          <w:color w:val="000000"/>
-          <w:sz w:val="24"/>
-          <w:szCs w:val="24"/>
-          <w:rtl w:val="0"/>
-        </w:rPr>
-        <w:t xml:space="preserve">La solución propone transformar el flujo de trabajo de la receta suelta al plan de la semana: armar el menú, calcular lo que hace falta y salir con la lista de mercado lista. El usuario podrá ubicar recetas por día y comida mediante un calendario semanal; el sistema consolidará los ingredientes de todas las recetas seleccionadas, tendrá en cuenta las cantidades disponibles en la despensa y generará la relación de compras pendiente, organizada por categorías.</w:t>
+        <w:t xml:space="preserve"> recetas por día y comida mediante un calendario semanal; el sistema va a consolidar los ingredientes de todas las recetas seleccionadas, tendrá en cuenta las cantidades disponibles en la despensa y generará la relación de compras pendiente, organizada por categorías.</w:t>
       </w:r>
       <w:r>
         <w:rPr>
@@ -1568,7 +3658,7 @@
               <w:rPr>
                 <w:rtl w:val="0"/>
               </w:rPr>
-              <w:t xml:space="preserve">Ubicar recetas por día y comida.</w:t>
+              <w:t xml:space="preserve">Buscar recetas por día y comida.</w:t>
             </w:r>
           </w:p>
         </w:tc>
@@ -2240,7 +4330,23 @@
           <w:szCs w:val="24"/>
           <w:rtl w:val="0"/>
         </w:rPr>
-        <w:t xml:space="preserve">Flujo principal: usuario → React → API REST de Spring Boot → capa de servicios → repositorios → base de datos. Para generar la lista de mercado, el backend obtiene las recetas del plan, consolida sus ingredientes, consulta las existencias registradas en la despensa y calcula la cantidad faltante. El resultado se devuelve al frontend para agruparlo y permitir marcar las compras.</w:t>
+        <w:t xml:space="preserve">Flujo principal: usuario → React → API REST de Spring Boot → capa de servicios → repositorios → base de datos. Para generar la lista de mercado, el backend obtiene las recetas del plan, consolida sus ingredientes, consulta las existencias registradas en la despensa y calcula la cantidad faltante. El resultado se devuelve al frontend para </w:t>
+      </w:r>
+      <w:r>
+        <w:rPr>
+          <w:rtl w:val="0"/>
+        </w:rPr>
+        <w:t xml:space="preserve">agrupar y</w:t>
+      </w:r>
+      <w:r>
+        <w:rPr>
+          <w:rFonts w:ascii="Times New Roman" w:cs="Times New Roman" w:eastAsia="Times New Roman" w:hAnsi="Times New Roman"/>
+          <w:color w:val="000000"/>
+          <w:sz w:val="24"/>
+          <w:szCs w:val="24"/>
+          <w:rtl w:val="0"/>
+        </w:rPr>
+        <w:t xml:space="preserve"> permitir marcar las compras.</w:t>
       </w:r>
       <w:r>
         <w:rPr>
@@ -2266,22 +4372,102 @@
       <w:pPr>
         <w:spacing w:after="0" w:line="480" w:lineRule="auto"/>
         <w:ind w:firstLine="720"/>
-        <w:rPr/>
-      </w:pPr>
-      <w:r>
         <w:rPr>
           <w:rFonts w:ascii="Times New Roman" w:cs="Times New Roman" w:eastAsia="Times New Roman" w:hAnsi="Times New Roman"/>
           <w:color w:val="000000"/>
           <w:sz w:val="24"/>
           <w:szCs w:val="24"/>
+        </w:rPr>
+      </w:pPr>
+      <w:r>
+        <w:rPr>
+          <w:rFonts w:ascii="Times New Roman" w:cs="Times New Roman" w:eastAsia="Times New Roman" w:hAnsi="Times New Roman"/>
+          <w:color w:val="000000"/>
+          <w:sz w:val="24"/>
+          <w:szCs w:val="24"/>
           <w:rtl w:val="0"/>
         </w:rPr>
         <w:t xml:space="preserve">Para el entregable académico se propone un despliegue compuesto por frontend, backend y base de datos. El frontend puede ser servido como archivos estáticos mediante un servidor web; Spring Boot ejecutará la API; y la base de datos estará aislada como servicio independiente. El despliegue podrá realizarse localmente o mediante contenedores Docker cuando el equipo lo requiera.</w:t>
       </w:r>
-      <w:r>
-        <w:rPr>
-          <w:rtl w:val="0"/>
-        </w:rPr>
+    </w:p>
+    <w:p>
+      <w:pPr>
+        <w:rPr/>
+      </w:pPr>
+      <w:r>
+        <w:rPr>
+          <w:rtl w:val="0"/>
+        </w:rPr>
+        <w:t xml:space="preserve">El sistema de la célula 5 integra tres capas fundamentales dentro de la arquitectura de desarrollo: Front-End en React, Back-End en Spring Boot, y una capa de persistencia basada en bases de datos relacionales. La funcionalidad central se divide en tres componentes clave descritos en la especificación del proyecto:</w:t>
+      </w:r>
+    </w:p>
+    <w:p>
+      <w:pPr>
+        <w:numPr>
+          <w:ilvl w:val="0"/>
+          <w:numId w:val="1"/>
+        </w:numPr>
+        <w:ind w:left="360" w:hanging="360"/>
+      </w:pPr>
+      <w:r>
+        <w:rPr>
+          <w:b w:val="1"/>
+          <w:bCs w:val="1"/>
+          <w:rtl w:val="0"/>
+        </w:rPr>
+        <w:t xml:space="preserve">Front-End (React): </w:t>
+      </w:r>
+      <w:r>
+        <w:rPr>
+          <w:rtl w:val="0"/>
+        </w:rPr>
+        <w:t xml:space="preserve">Calendario semanal interactivo con funcionalidad de arrastrar y soltar (drag and drop) de recetas por día y comida, acompañado de una lista de mercado agrupada por categoría con opción de marcar artículos comprados.</w:t>
+      </w:r>
+    </w:p>
+    <w:p>
+      <w:pPr>
+        <w:numPr>
+          <w:ilvl w:val="0"/>
+          <w:numId w:val="1"/>
+        </w:numPr>
+        <w:ind w:left="360" w:hanging="360"/>
+      </w:pPr>
+      <w:r>
+        <w:rPr>
+          <w:b w:val="1"/>
+          <w:bCs w:val="1"/>
+          <w:rtl w:val="0"/>
+        </w:rPr>
+        <w:t xml:space="preserve">Back-End (Spring Boot): </w:t>
+      </w:r>
+      <w:r>
+        <w:rPr>
+          <w:rtl w:val="0"/>
+        </w:rPr>
+        <w:t xml:space="preserve">Gestión y creación de planes de menú, consolidación de ingredientes provenientes de múltiples recetas, sustracción automatizada de los artículos disponibles en la despensa y generación final de la lista de compras.</w:t>
+      </w:r>
+    </w:p>
+    <w:p>
+      <w:pPr>
+        <w:numPr>
+          <w:ilvl w:val="0"/>
+          <w:numId w:val="1"/>
+        </w:numPr>
+        <w:ind w:left="360" w:hanging="360"/>
+      </w:pPr>
+      <w:r>
+        <w:rPr>
+          <w:b w:val="1"/>
+          <w:bCs w:val="1"/>
+          <w:rtl w:val="0"/>
+        </w:rPr>
+        <w:t xml:space="preserve">Base de Datos: </w:t>
+      </w:r>
+      <w:r>
+        <w:rPr>
+          <w:rtl w:val="0"/>
+        </w:rPr>
+        <w:t xml:space="preserve">Modelado relacional estructurado exactamente en cinco tablas principales en español que sostienen las operaciones lógicas de planificación, almacenamiento de recetas, inventario de despensa y consolidación de listas.</w:t>
       </w:r>
     </w:p>
     <w:p>
@@ -2726,7 +4912,7 @@
     <w:p>
       <w:pPr>
         <w:pStyle w:val="Heading1"/>
-        <w:spacing w:before="0" w:lineRule="auto"/>
+        <w:spacing w:after="0" w:before="0" w:line="480" w:lineRule="auto"/>
         <w:ind w:firstLine="0"/>
         <w:rPr/>
       </w:pPr>
@@ -2740,7 +4926,7 @@
     <w:p>
       <w:pPr>
         <w:pStyle w:val="Heading2"/>
-        <w:spacing w:before="0" w:lineRule="auto"/>
+        <w:spacing w:after="0" w:before="0" w:line="480" w:lineRule="auto"/>
         <w:ind w:firstLine="0"/>
         <w:rPr/>
       </w:pPr>
@@ -2753,25 +4939,40 @@
     </w:p>
     <w:p>
       <w:pPr>
-        <w:rPr/>
-      </w:pPr>
-      <w:r>
-        <w:rPr>
+        <w:spacing w:after="0" w:line="480" w:lineRule="auto"/>
+        <w:ind w:firstLine="720"/>
+        <w:rPr/>
+      </w:pPr>
+      <w:r>
+        <w:rPr>
+          <w:rFonts w:ascii="Times New Roman" w:cs="Times New Roman" w:eastAsia="Times New Roman" w:hAnsi="Times New Roman"/>
+          <w:color w:val="000000"/>
+          <w:sz w:val="24"/>
+          <w:szCs w:val="24"/>
           <w:rtl w:val="0"/>
         </w:rPr>
         <w:t xml:space="preserve">Actores: Usuario y Sistema. Casos de uso principales: crear plan semanal, consultar plan, agregar receta al día/comida, mover receta, gestionar recetas, gestionar ingredientes/despensa, consolidar ingredientes, generar lista de mercado y marcar producto como comprado.</w:t>
       </w:r>
-    </w:p>
-    <w:p>
-      <w:pPr>
+      <w:r>
+        <w:rPr>
+          <w:rtl w:val="0"/>
+        </w:rPr>
+      </w:r>
+    </w:p>
+    <w:p>
+      <w:pPr>
+        <w:spacing w:line="480" w:lineRule="auto"/>
         <w:ind w:firstLine="0"/>
         <w:jc w:val="center"/>
         <w:rPr/>
       </w:pPr>
       <w:r>
         <w:rPr>
+          <w:rFonts w:ascii="Times New Roman" w:cs="Times New Roman" w:eastAsia="Times New Roman" w:hAnsi="Times New Roman"/>
           <w:b w:val="1"/>
           <w:bCs w:val="1"/>
+          <w:sz w:val="24"/>
+          <w:szCs w:val="24"/>
           <w:rtl w:val="0"/>
         </w:rPr>
         <w:t xml:space="preserve">Ilustración 1. Casos de uso principales del sistema</w:t>
@@ -2797,12 +4998,12 @@
           <wp:inline distB="114300" distT="114300" distL="114300" distR="114300">
             <wp:extent cx="5943600" cy="3962400"/>
             <wp:effectExtent b="0" l="0" r="0" t="0"/>
-            <wp:docPr descr="Ilustración 1. Casos de uso principales del sistema&#10;" id="2" name="image1.png"/>
+            <wp:docPr descr="Ilustración 1. Casos de uso principales del sistema&#10;" id="2" name="image2.png"/>
             <a:graphic>
               <a:graphicData uri="http://schemas.openxmlformats.org/drawingml/2006/picture">
                 <pic:pic>
                   <pic:nvPicPr>
-                    <pic:cNvPr descr="Ilustración 1. Casos de uso principales del sistema&#10;" id="0" name="image1.png"/>
+                    <pic:cNvPr descr="Ilustración 1. Casos de uso principales del sistema&#10;" id="0" name="image2.png"/>
                     <pic:cNvPicPr preferRelativeResize="0"/>
                   </pic:nvPicPr>
                   <pic:blipFill>
@@ -2835,12 +5036,10 @@
     <w:p>
       <w:pPr>
         <w:pStyle w:val="Heading2"/>
-        <w:spacing w:before="0" w:lineRule="auto"/>
+        <w:spacing w:after="0" w:before="0" w:line="480" w:lineRule="auto"/>
         <w:ind w:firstLine="0"/>
         <w:rPr/>
       </w:pPr>
-      <w:bookmarkStart w:colFirst="0" w:colLast="0" w:name="_2gb6nlkzjyb7" w:id="0"/>
-      <w:bookmarkEnd w:id="0"/>
       <w:r>
         <w:rPr>
           <w:rtl w:val="0"/>
@@ -2850,10 +5049,21 @@
     </w:p>
     <w:p>
       <w:pPr>
-        <w:rPr/>
-      </w:pPr>
-      <w:r>
-        <w:rPr>
+        <w:spacing w:after="0" w:line="480" w:lineRule="auto"/>
+        <w:ind w:firstLine="720"/>
+        <w:rPr>
+          <w:rFonts w:ascii="Times New Roman" w:cs="Times New Roman" w:eastAsia="Times New Roman" w:hAnsi="Times New Roman"/>
+          <w:color w:val="000000"/>
+          <w:sz w:val="24"/>
+          <w:szCs w:val="24"/>
+        </w:rPr>
+      </w:pPr>
+      <w:r>
+        <w:rPr>
+          <w:rFonts w:ascii="Times New Roman" w:cs="Times New Roman" w:eastAsia="Times New Roman" w:hAnsi="Times New Roman"/>
+          <w:color w:val="000000"/>
+          <w:sz w:val="24"/>
+          <w:szCs w:val="24"/>
           <w:rtl w:val="0"/>
         </w:rPr>
         <w:t xml:space="preserve">Relaciones principales: plan_menu 1:N menu_item; receta 1:N menu_item; receta 1:N receta_ingrediente; ingrediente 1:N receta_ingrediente. La relación receta–ingrediente es de muchos a muchos y se resuelve mediante receta_ingrediente.</w:t>
@@ -2861,34 +5071,42 @@
     </w:p>
     <w:p>
       <w:pPr>
-        <w:rPr/>
-      </w:pPr>
-      <w:r>
-        <w:rPr>
-          <w:rtl w:val="0"/>
-        </w:rPr>
-      </w:r>
-    </w:p>
-    <w:p>
-      <w:pPr>
-        <w:rPr/>
-      </w:pPr>
-      <w:r>
-        <w:rPr>
-          <w:rtl w:val="0"/>
-        </w:rPr>
-      </w:r>
-    </w:p>
-    <w:p>
-      <w:pPr>
+        <w:spacing w:after="0" w:line="480" w:lineRule="auto"/>
+        <w:ind w:firstLine="720"/>
+        <w:rPr/>
+      </w:pPr>
+      <w:r>
+        <w:rPr>
+          <w:rtl w:val="0"/>
+        </w:rPr>
+      </w:r>
+    </w:p>
+    <w:p>
+      <w:pPr>
+        <w:spacing w:after="0" w:line="480" w:lineRule="auto"/>
+        <w:ind w:firstLine="720"/>
+        <w:rPr/>
+      </w:pPr>
+      <w:r>
+        <w:rPr>
+          <w:rtl w:val="0"/>
+        </w:rPr>
+      </w:r>
+    </w:p>
+    <w:p>
+      <w:pPr>
+        <w:spacing w:line="480" w:lineRule="auto"/>
         <w:ind w:firstLine="0"/>
         <w:jc w:val="center"/>
         <w:rPr/>
       </w:pPr>
       <w:r>
         <w:rPr>
+          <w:rFonts w:ascii="Times New Roman" w:cs="Times New Roman" w:eastAsia="Times New Roman" w:hAnsi="Times New Roman"/>
           <w:b w:val="1"/>
           <w:bCs w:val="1"/>
+          <w:sz w:val="24"/>
+          <w:szCs w:val="24"/>
           <w:rtl w:val="0"/>
         </w:rPr>
         <w:t xml:space="preserve">Ilustración 2. Modelo relacional de las cinco tablas</w:t>
@@ -2914,12 +5132,12 @@
           <wp:inline distB="114300" distT="114300" distL="114300" distR="114300">
             <wp:extent cx="5943600" cy="3962400"/>
             <wp:effectExtent b="0" l="0" r="0" t="0"/>
-            <wp:docPr descr="Ilustración 2. Modelo relacional de las cinco tablas&#10;" id="1" name="image2.png"/>
+            <wp:docPr descr="Ilustración 2. Modelo relacional de las cinco tablas&#10;" id="1" name="image1.png"/>
             <a:graphic>
               <a:graphicData uri="http://schemas.openxmlformats.org/drawingml/2006/picture">
                 <pic:pic>
                   <pic:nvPicPr>
-                    <pic:cNvPr descr="Ilustración 2. Modelo relacional de las cinco tablas&#10;" id="0" name="image2.png"/>
+                    <pic:cNvPr descr="Ilustración 2. Modelo relacional de las cinco tablas&#10;" id="0" name="image1.png"/>
                     <pic:cNvPicPr preferRelativeResize="0"/>
                   </pic:nvPicPr>
                   <pic:blipFill>
@@ -2956,16 +5174,6 @@
       <w:r>
         <w:br w:type="page"/>
       </w:r>
-      <w:r>
-        <w:rPr>
-          <w:rtl w:val="0"/>
-        </w:rPr>
-      </w:r>
-    </w:p>
-    <w:p>
-      <w:pPr>
-        <w:rPr/>
-      </w:pPr>
       <w:r>
         <w:rPr>
           <w:rtl w:val="0"/>
@@ -3863,6 +6071,38 @@
           </w:p>
         </w:tc>
       </w:tr>
+      <w:tr>
+        <w:trPr>
+          <w:cantSplit w:val="0"/>
+          <w:tblHeader w:val="0"/>
+        </w:trPr>
+        <w:tc>
+          <w:tcPr/>
+          <w:p>
+            <w:pPr>
+              <w:rPr/>
+            </w:pPr>
+            <w:r>
+              <w:rPr>
+                <w:rtl w:val="0"/>
+              </w:rPr>
+            </w:r>
+          </w:p>
+        </w:tc>
+        <w:tc>
+          <w:tcPr/>
+          <w:p>
+            <w:pPr>
+              <w:rPr/>
+            </w:pPr>
+            <w:r>
+              <w:rPr>
+                <w:rtl w:val="0"/>
+              </w:rPr>
+            </w:r>
+          </w:p>
+        </w:tc>
+      </w:tr>
     </w:tbl>
     <w:p>
       <w:pPr>
@@ -4759,7 +6999,8 @@
       </w:r>
     </w:p>
     <w:sectPr>
-      <w:footerReference r:id="rId8" w:type="default"/>
+      <w:headerReference r:id="rId8" w:type="default"/>
+      <w:footerReference r:id="rId9" w:type="default"/>
       <w:pgSz w:h="15840" w:w="12240" w:orient="portrait"/>
       <w:pgMar w:bottom="1440" w:top="1440" w:left="1440" w:right="1440" w:header="720" w:footer="720"/>
       <w:pgNumType w:start="1"/>
@@ -4837,8 +7078,121 @@
 </w:ftr>
 </file>
 
+<file path=word/header1.xml><?xml version="1.0" encoding="utf-8"?>
+<w:hdr xmlns:mc="http://schemas.openxmlformats.org/markup-compatibility/2006" xmlns:o="urn:schemas-microsoft-com:office:office" xmlns:r="http://schemas.openxmlformats.org/officeDocument/2006/relationships" xmlns:m="http://schemas.openxmlformats.org/officeDocument/2006/math" xmlns:v="urn:schemas-microsoft-com:vml" xmlns:wp="http://schemas.openxmlformats.org/drawingml/2006/wordprocessingDrawing" xmlns:w10="urn:schemas-microsoft-com:office:word" xmlns:w="http://schemas.openxmlformats.org/wordprocessingml/2006/main" xmlns:wne="http://schemas.microsoft.com/office/word/2006/wordml" xmlns:sl="http://schemas.openxmlformats.org/schemaLibrary/2006/main" xmlns:a="http://schemas.openxmlformats.org/drawingml/2006/main" xmlns:pic="http://schemas.openxmlformats.org/drawingml/2006/picture" xmlns:c="http://schemas.openxmlformats.org/drawingml/2006/chart" xmlns:lc="http://schemas.openxmlformats.org/drawingml/2006/lockedCanvas" xmlns:dgm="http://schemas.openxmlformats.org/drawingml/2006/diagram" xmlns:wps="http://schemas.microsoft.com/office/word/2010/wordprocessingShape" xmlns:wpg="http://schemas.microsoft.com/office/word/2010/wordprocessingGroup" xmlns:w14="http://schemas.microsoft.com/office/word/2010/wordml" xmlns:w15="http://schemas.microsoft.com/office/word/2012/wordml" xmlns:w16="http://schemas.microsoft.com/office/word/2018/wordml" xmlns:w16cex="http://schemas.microsoft.com/office/word/2018/wordml/cex" xmlns:w16cid="http://schemas.microsoft.com/office/word/2016/wordml/cid" xmlns="http://schemas.microsoft.com/office/tasks/2019/documenttasks" xmlns:cr="http://schemas.microsoft.com/office/comments/2020/reactions">
+  <w:p>
+    <w:pPr>
+      <w:rPr/>
+    </w:pPr>
+    <w:r>
+      <w:rPr>
+        <w:rtl w:val="0"/>
+      </w:rPr>
+    </w:r>
+  </w:p>
+</w:hdr>
+</file>
+
 <file path=word/numbering.xml><?xml version="1.0" encoding="utf-8"?>
-<w:numbering xmlns:mc="http://schemas.openxmlformats.org/markup-compatibility/2006" xmlns:o="urn:schemas-microsoft-com:office:office" xmlns:r="http://schemas.openxmlformats.org/officeDocument/2006/relationships" xmlns:m="http://schemas.openxmlformats.org/officeDocument/2006/math" xmlns:v="urn:schemas-microsoft-com:vml" xmlns:wp="http://schemas.openxmlformats.org/drawingml/2006/wordprocessingDrawing" xmlns:w10="urn:schemas-microsoft-com:office:word" xmlns:w="http://schemas.openxmlformats.org/wordprocessingml/2006/main" xmlns:wne="http://schemas.microsoft.com/office/word/2006/wordml" xmlns:sl="http://schemas.openxmlformats.org/schemaLibrary/2006/main" xmlns:a="http://schemas.openxmlformats.org/drawingml/2006/main" xmlns:pic="http://schemas.openxmlformats.org/drawingml/2006/picture" xmlns:c="http://schemas.openxmlformats.org/drawingml/2006/chart" xmlns:lc="http://schemas.openxmlformats.org/drawingml/2006/lockedCanvas" xmlns:dgm="http://schemas.openxmlformats.org/drawingml/2006/diagram" xmlns:wps="http://schemas.microsoft.com/office/word/2010/wordprocessingShape" xmlns:wpg="http://schemas.microsoft.com/office/word/2010/wordprocessingGroup" xmlns:w14="http://schemas.microsoft.com/office/word/2010/wordml" xmlns:w15="http://schemas.microsoft.com/office/word/2012/wordml" xmlns:w16="http://schemas.microsoft.com/office/word/2018/wordml" xmlns:w16cex="http://schemas.microsoft.com/office/word/2018/wordml/cex" xmlns:w16cid="http://schemas.microsoft.com/office/word/2016/wordml/cid" xmlns="http://schemas.microsoft.com/office/tasks/2019/documenttasks" xmlns:cr="http://schemas.microsoft.com/office/comments/2020/reactions"/>
+<w:numbering xmlns:mc="http://schemas.openxmlformats.org/markup-compatibility/2006" xmlns:o="urn:schemas-microsoft-com:office:office" xmlns:r="http://schemas.openxmlformats.org/officeDocument/2006/relationships" xmlns:m="http://schemas.openxmlformats.org/officeDocument/2006/math" xmlns:v="urn:schemas-microsoft-com:vml" xmlns:wp="http://schemas.openxmlformats.org/drawingml/2006/wordprocessingDrawing" xmlns:w10="urn:schemas-microsoft-com:office:word" xmlns:w="http://schemas.openxmlformats.org/wordprocessingml/2006/main" xmlns:wne="http://schemas.microsoft.com/office/word/2006/wordml" xmlns:sl="http://schemas.openxmlformats.org/schemaLibrary/2006/main" xmlns:a="http://schemas.openxmlformats.org/drawingml/2006/main" xmlns:pic="http://schemas.openxmlformats.org/drawingml/2006/picture" xmlns:c="http://schemas.openxmlformats.org/drawingml/2006/chart" xmlns:lc="http://schemas.openxmlformats.org/drawingml/2006/lockedCanvas" xmlns:dgm="http://schemas.openxmlformats.org/drawingml/2006/diagram" xmlns:wps="http://schemas.microsoft.com/office/word/2010/wordprocessingShape" xmlns:wpg="http://schemas.microsoft.com/office/word/2010/wordprocessingGroup" xmlns:w14="http://schemas.microsoft.com/office/word/2010/wordml" xmlns:w15="http://schemas.microsoft.com/office/word/2012/wordml" xmlns:w16="http://schemas.microsoft.com/office/word/2018/wordml" xmlns:w16cex="http://schemas.microsoft.com/office/word/2018/wordml/cex" xmlns:w16cid="http://schemas.microsoft.com/office/word/2016/wordml/cid" xmlns="http://schemas.microsoft.com/office/tasks/2019/documenttasks" xmlns:cr="http://schemas.microsoft.com/office/comments/2020/reactions">
+  <w:abstractNum w:abstractNumId="1">
+    <w:lvl w:ilvl="0">
+      <w:start w:val="1"/>
+      <w:numFmt w:val="bullet"/>
+      <w:lvlText w:val="●"/>
+      <w:lvlJc w:val="left"/>
+      <w:pPr>
+        <w:ind w:left="360" w:hanging="360"/>
+      </w:pPr>
+      <w:rPr>
+        <w:rFonts w:ascii="Noto Sans Symbols" w:cs="Noto Sans Symbols" w:eastAsia="Noto Sans Symbols" w:hAnsi="Noto Sans Symbols"/>
+      </w:rPr>
+    </w:lvl>
+    <w:lvl w:ilvl="1">
+      <w:start w:val="1"/>
+      <w:numFmt w:val="bullet"/>
+      <w:lvlText w:val=""/>
+      <w:lvlJc w:val="left"/>
+      <w:pPr>
+        <w:ind w:left="0" w:firstLine="0"/>
+      </w:pPr>
+      <w:rPr/>
+    </w:lvl>
+    <w:lvl w:ilvl="2">
+      <w:start w:val="1"/>
+      <w:numFmt w:val="bullet"/>
+      <w:lvlText w:val=""/>
+      <w:lvlJc w:val="left"/>
+      <w:pPr>
+        <w:ind w:left="0" w:firstLine="0"/>
+      </w:pPr>
+      <w:rPr/>
+    </w:lvl>
+    <w:lvl w:ilvl="3">
+      <w:start w:val="1"/>
+      <w:numFmt w:val="bullet"/>
+      <w:lvlText w:val=""/>
+      <w:lvlJc w:val="left"/>
+      <w:pPr>
+        <w:ind w:left="0" w:firstLine="0"/>
+      </w:pPr>
+      <w:rPr/>
+    </w:lvl>
+    <w:lvl w:ilvl="4">
+      <w:start w:val="1"/>
+      <w:numFmt w:val="bullet"/>
+      <w:lvlText w:val=""/>
+      <w:lvlJc w:val="left"/>
+      <w:pPr>
+        <w:ind w:left="0" w:firstLine="0"/>
+      </w:pPr>
+      <w:rPr/>
+    </w:lvl>
+    <w:lvl w:ilvl="5">
+      <w:start w:val="1"/>
+      <w:numFmt w:val="bullet"/>
+      <w:lvlText w:val=""/>
+      <w:lvlJc w:val="left"/>
+      <w:pPr>
+        <w:ind w:left="0" w:firstLine="0"/>
+      </w:pPr>
+      <w:rPr/>
+    </w:lvl>
+    <w:lvl w:ilvl="6">
+      <w:start w:val="1"/>
+      <w:numFmt w:val="bullet"/>
+      <w:lvlText w:val=""/>
+      <w:lvlJc w:val="left"/>
+      <w:pPr>
+        <w:ind w:left="0" w:firstLine="0"/>
+      </w:pPr>
+      <w:rPr/>
+    </w:lvl>
+    <w:lvl w:ilvl="7">
+      <w:start w:val="1"/>
+      <w:numFmt w:val="bullet"/>
+      <w:lvlText w:val=""/>
+      <w:lvlJc w:val="left"/>
+      <w:pPr>
+        <w:ind w:left="0" w:firstLine="0"/>
+      </w:pPr>
+      <w:rPr/>
+    </w:lvl>
+    <w:lvl w:ilvl="8">
+      <w:start w:val="1"/>
+      <w:numFmt w:val="bullet"/>
+      <w:lvlText w:val=""/>
+      <w:lvlJc w:val="left"/>
+      <w:pPr>
+        <w:ind w:left="0" w:firstLine="0"/>
+      </w:pPr>
+      <w:rPr/>
+    </w:lvl>
+  </w:abstractNum>
+  <w:num w:numId="1">
+    <w:abstractNumId w:val="1"/>
+  </w:num>
+</w:numbering>
 </file>
 
 <file path=word/styles.xml><?xml version="1.0" encoding="utf-8"?>
@@ -4879,15 +7233,11 @@
     <w:pPr>
       <w:keepNext w:val="1"/>
       <w:keepLines w:val="1"/>
-      <w:spacing w:after="0" w:before="480" w:lineRule="auto"/>
+      <w:ind w:firstLine="0"/>
     </w:pPr>
     <w:rPr>
-      <w:rFonts w:ascii="Times New Roman" w:cs="Times New Roman" w:eastAsia="Times New Roman" w:hAnsi="Times New Roman"/>
       <w:b w:val="1"/>
       <w:bCs w:val="1"/>
-      <w:color w:val="000000"/>
-      <w:sz w:val="24"/>
-      <w:szCs w:val="24"/>
     </w:rPr>
   </w:style>
   <w:style w:type="paragraph" w:styleId="Heading2">

</xml_diff>

<commit_message>
feat: Update Informe de Requistos con contexto y requerimientos del sistema
</commit_message>
<xml_diff>
--- a/INFORME_REQUISITOS.docx
+++ b/INFORME_REQUISITOS.docx
@@ -297,7 +297,7 @@
     </w:p>
     <w:sdt>
       <w:sdtPr>
-        <w:id w:val="-418000486"/>
+        <w:id w:val="-1738503711"/>
         <w:docPartObj>
           <w:docPartGallery w:val="Table of Contents"/>
           <w:docPartUnique w:val="1"/>
@@ -2498,7 +2498,7 @@
     </w:p>
     <w:sdt>
       <w:sdtPr>
-        <w:id w:val="197774207"/>
+        <w:id w:val="895550477"/>
         <w:docPartObj>
           <w:docPartGallery w:val="Table of Contents"/>
           <w:docPartUnique w:val="1"/>
@@ -5087,6 +5087,25 @@
         <w:ind w:firstLine="720"/>
         <w:rPr/>
       </w:pPr>
+      <w:r>
+        <w:rPr>
+          <w:rtl w:val="0"/>
+        </w:rPr>
+      </w:r>
+    </w:p>
+    <w:p>
+      <w:pPr>
+        <w:rPr>
+          <w:b w:val="1"/>
+          <w:bCs w:val="1"/>
+        </w:rPr>
+      </w:pPr>
+      <w:r>
+        <w:rPr>
+          <w:rtl w:val="0"/>
+        </w:rPr>
+        <w:t xml:space="preserve">El siguiente diagrama esquemático ilustra la arquitectura relacional y el flujo de conexión entre las cinco tablas principales. Se detallan las claves primarias (PK), claves foráneas (FK) y las cardinalidades que permiten el funcionamiento del planificador y la generación automática de la lista de mercado:</w:t>
+      </w:r>
       <w:r>
         <w:rPr>
           <w:rtl w:val="0"/>

</xml_diff>

<commit_message>
feat: Added bibliografic references to the report document
</commit_message>
<xml_diff>
--- a/INFORME_REQUISITOS.docx
+++ b/INFORME_REQUISITOS.docx
@@ -297,7 +297,7 @@
     </w:p>
     <w:sdt>
       <w:sdtPr>
-        <w:id w:val="-1738503711"/>
+        <w:id w:val="-1007689691"/>
         <w:docPartObj>
           <w:docPartGallery w:val="Table of Contents"/>
           <w:docPartUnique w:val="1"/>
@@ -392,13 +392,21 @@
                 <w:rFonts w:ascii="Arial" w:cs="Arial" w:eastAsia="Arial" w:hAnsi="Arial"/>
                 <w:b w:val="1"/>
                 <w:bCs w:val="1"/>
-                <w:color w:val="1155cc"/>
+                <w:i w:val="0"/>
+                <w:iCs w:val="0"/>
+                <w:smallCaps w:val="0"/>
+                <w:strike w:val="0"/>
+                <w:color w:val="000000"/>
                 <w:sz w:val="22"/>
                 <w:szCs w:val="22"/>
-                <w:u w:val="single"/>
-                <w:rtl w:val="0"/>
-              </w:rPr>
-              <w:t xml:space="preserve">Lista de tablas 3</w:t>
+                <w:u w:val="none"/>
+                <w:shd w:fill="auto" w:val="clear"/>
+                <w:vertAlign w:val="baseline"/>
+                <w:rtl w:val="0"/>
+              </w:rPr>
+              <w:t xml:space="preserve">Lista de tablas</w:t>
+              <w:tab/>
+              <w:t xml:space="preserve">4</w:t>
             </w:r>
           </w:hyperlink>
           <w:r>
@@ -437,13 +445,21 @@
                 <w:rFonts w:ascii="Arial" w:cs="Arial" w:eastAsia="Arial" w:hAnsi="Arial"/>
                 <w:b w:val="1"/>
                 <w:bCs w:val="1"/>
-                <w:color w:val="1155cc"/>
+                <w:i w:val="0"/>
+                <w:iCs w:val="0"/>
+                <w:smallCaps w:val="0"/>
+                <w:strike w:val="0"/>
+                <w:color w:val="000000"/>
                 <w:sz w:val="22"/>
                 <w:szCs w:val="22"/>
-                <w:u w:val="single"/>
-                <w:rtl w:val="0"/>
-              </w:rPr>
-              <w:t xml:space="preserve">Lista de ilustraciones 4</w:t>
+                <w:u w:val="none"/>
+                <w:shd w:fill="auto" w:val="clear"/>
+                <w:vertAlign w:val="baseline"/>
+                <w:rtl w:val="0"/>
+              </w:rPr>
+              <w:t xml:space="preserve">Lista de ilustraciones</w:t>
+              <w:tab/>
+              <w:t xml:space="preserve">5</w:t>
             </w:r>
           </w:hyperlink>
           <w:r>
@@ -496,7 +512,7 @@
               </w:rPr>
               <w:t xml:space="preserve">Glosario</w:t>
               <w:tab/>
-              <w:t xml:space="preserve">5</w:t>
+              <w:t xml:space="preserve">6</w:t>
             </w:r>
           </w:hyperlink>
           <w:r>
@@ -549,7 +565,7 @@
               </w:rPr>
               <w:t xml:space="preserve">Objetivos</w:t>
               <w:tab/>
-              <w:t xml:space="preserve">6</w:t>
+              <w:t xml:space="preserve">7</w:t>
             </w:r>
           </w:hyperlink>
           <w:r>
@@ -586,8 +602,8 @@
             <w:r>
               <w:rPr>
                 <w:rFonts w:ascii="Arial" w:cs="Arial" w:eastAsia="Arial" w:hAnsi="Arial"/>
-                <w:b w:val="0"/>
-                <w:bCs w:val="0"/>
+                <w:b w:val="1"/>
+                <w:bCs w:val="1"/>
                 <w:i w:val="0"/>
                 <w:iCs w:val="0"/>
                 <w:smallCaps w:val="0"/>
@@ -602,7 +618,7 @@
               </w:rPr>
               <w:t xml:space="preserve">Objetivo general</w:t>
               <w:tab/>
-              <w:t xml:space="preserve">6</w:t>
+              <w:t xml:space="preserve">7</w:t>
             </w:r>
           </w:hyperlink>
           <w:r>
@@ -639,8 +655,8 @@
             <w:r>
               <w:rPr>
                 <w:rFonts w:ascii="Arial" w:cs="Arial" w:eastAsia="Arial" w:hAnsi="Arial"/>
-                <w:b w:val="0"/>
-                <w:bCs w:val="0"/>
+                <w:b w:val="1"/>
+                <w:bCs w:val="1"/>
                 <w:i w:val="0"/>
                 <w:iCs w:val="0"/>
                 <w:smallCaps w:val="0"/>
@@ -655,7 +671,7 @@
               </w:rPr>
               <w:t xml:space="preserve">Objetivos específicos</w:t>
               <w:tab/>
-              <w:t xml:space="preserve">6</w:t>
+              <w:t xml:space="preserve">7</w:t>
             </w:r>
           </w:hyperlink>
           <w:r>
@@ -708,7 +724,7 @@
               </w:rPr>
               <w:t xml:space="preserve">Introducción</w:t>
               <w:tab/>
-              <w:t xml:space="preserve">7</w:t>
+              <w:t xml:space="preserve">8</w:t>
             </w:r>
           </w:hyperlink>
           <w:r>
@@ -761,7 +777,7 @@
               </w:rPr>
               <w:t xml:space="preserve">Planteamiento del problema</w:t>
               <w:tab/>
-              <w:t xml:space="preserve">8</w:t>
+              <w:t xml:space="preserve">10</w:t>
             </w:r>
           </w:hyperlink>
           <w:r>
@@ -798,8 +814,8 @@
             <w:r>
               <w:rPr>
                 <w:rFonts w:ascii="Arial" w:cs="Arial" w:eastAsia="Arial" w:hAnsi="Arial"/>
-                <w:b w:val="0"/>
-                <w:bCs w:val="0"/>
+                <w:b w:val="1"/>
+                <w:bCs w:val="1"/>
                 <w:i w:val="0"/>
                 <w:iCs w:val="0"/>
                 <w:smallCaps w:val="0"/>
@@ -814,7 +830,7 @@
               </w:rPr>
               <w:t xml:space="preserve">Necesidad</w:t>
               <w:tab/>
-              <w:t xml:space="preserve">8</w:t>
+              <w:t xml:space="preserve">10</w:t>
             </w:r>
           </w:hyperlink>
           <w:r>
@@ -851,8 +867,8 @@
             <w:r>
               <w:rPr>
                 <w:rFonts w:ascii="Arial" w:cs="Arial" w:eastAsia="Arial" w:hAnsi="Arial"/>
-                <w:b w:val="0"/>
-                <w:bCs w:val="0"/>
+                <w:b w:val="1"/>
+                <w:bCs w:val="1"/>
                 <w:i w:val="0"/>
                 <w:iCs w:val="0"/>
                 <w:smallCaps w:val="0"/>
@@ -867,7 +883,7 @@
               </w:rPr>
               <w:t xml:space="preserve">Manejo actual</w:t>
               <w:tab/>
-              <w:t xml:space="preserve">8</w:t>
+              <w:t xml:space="preserve">10</w:t>
             </w:r>
           </w:hyperlink>
           <w:r>
@@ -904,8 +920,8 @@
             <w:r>
               <w:rPr>
                 <w:rFonts w:ascii="Arial" w:cs="Arial" w:eastAsia="Arial" w:hAnsi="Arial"/>
-                <w:b w:val="0"/>
-                <w:bCs w:val="0"/>
+                <w:b w:val="1"/>
+                <w:bCs w:val="1"/>
                 <w:i w:val="0"/>
                 <w:iCs w:val="0"/>
                 <w:smallCaps w:val="0"/>
@@ -920,7 +936,7 @@
               </w:rPr>
               <w:t xml:space="preserve">Solución propuesta: Planificador de Menús y Lista de Mercado</w:t>
               <w:tab/>
-              <w:t xml:space="preserve">8</w:t>
+              <w:t xml:space="preserve">10</w:t>
             </w:r>
           </w:hyperlink>
           <w:r>
@@ -973,7 +989,7 @@
               </w:rPr>
               <w:t xml:space="preserve">Requisitos del sistema</w:t>
               <w:tab/>
-              <w:t xml:space="preserve">9</w:t>
+              <w:t xml:space="preserve">11</w:t>
             </w:r>
           </w:hyperlink>
           <w:r>
@@ -1010,8 +1026,8 @@
             <w:r>
               <w:rPr>
                 <w:rFonts w:ascii="Arial" w:cs="Arial" w:eastAsia="Arial" w:hAnsi="Arial"/>
-                <w:b w:val="0"/>
-                <w:bCs w:val="0"/>
+                <w:b w:val="1"/>
+                <w:bCs w:val="1"/>
                 <w:i w:val="0"/>
                 <w:iCs w:val="0"/>
                 <w:smallCaps w:val="0"/>
@@ -1026,7 +1042,7 @@
               </w:rPr>
               <w:t xml:space="preserve">Requisitos funcionales</w:t>
               <w:tab/>
-              <w:t xml:space="preserve">9</w:t>
+              <w:t xml:space="preserve">11</w:t>
             </w:r>
           </w:hyperlink>
           <w:r>
@@ -1063,8 +1079,8 @@
             <w:r>
               <w:rPr>
                 <w:rFonts w:ascii="Arial" w:cs="Arial" w:eastAsia="Arial" w:hAnsi="Arial"/>
-                <w:b w:val="0"/>
-                <w:bCs w:val="0"/>
+                <w:b w:val="1"/>
+                <w:bCs w:val="1"/>
                 <w:i w:val="0"/>
                 <w:iCs w:val="0"/>
                 <w:smallCaps w:val="0"/>
@@ -1079,7 +1095,7 @@
               </w:rPr>
               <w:t xml:space="preserve">Requisitos no funcionales</w:t>
               <w:tab/>
-              <w:t xml:space="preserve">10</w:t>
+              <w:t xml:space="preserve">12</w:t>
             </w:r>
           </w:hyperlink>
           <w:r>
@@ -1132,7 +1148,7 @@
               </w:rPr>
               <w:t xml:space="preserve">Arquitectura y relación Frontend–Backend</w:t>
               <w:tab/>
-              <w:t xml:space="preserve">11</w:t>
+              <w:t xml:space="preserve">13</w:t>
             </w:r>
           </w:hyperlink>
           <w:r>
@@ -1169,8 +1185,8 @@
             <w:r>
               <w:rPr>
                 <w:rFonts w:ascii="Arial" w:cs="Arial" w:eastAsia="Arial" w:hAnsi="Arial"/>
-                <w:b w:val="0"/>
-                <w:bCs w:val="0"/>
+                <w:b w:val="1"/>
+                <w:bCs w:val="1"/>
                 <w:i w:val="0"/>
                 <w:iCs w:val="0"/>
                 <w:smallCaps w:val="0"/>
@@ -1185,7 +1201,7 @@
               </w:rPr>
               <w:t xml:space="preserve">Despliegue</w:t>
               <w:tab/>
-              <w:t xml:space="preserve">11</w:t>
+              <w:t xml:space="preserve">13</w:t>
             </w:r>
           </w:hyperlink>
           <w:r>
@@ -1238,7 +1254,7 @@
               </w:rPr>
               <w:t xml:space="preserve">Modelo de base de datos</w:t>
               <w:tab/>
-              <w:t xml:space="preserve">12</w:t>
+              <w:t xml:space="preserve">15</w:t>
             </w:r>
           </w:hyperlink>
           <w:r>
@@ -1275,8 +1291,8 @@
             <w:r>
               <w:rPr>
                 <w:rFonts w:ascii="Arial" w:cs="Arial" w:eastAsia="Arial" w:hAnsi="Arial"/>
-                <w:b w:val="0"/>
-                <w:bCs w:val="0"/>
+                <w:b w:val="1"/>
+                <w:bCs w:val="1"/>
                 <w:i w:val="0"/>
                 <w:iCs w:val="0"/>
                 <w:smallCaps w:val="0"/>
@@ -1291,7 +1307,7 @@
               </w:rPr>
               <w:t xml:space="preserve">Regla de cálculo de la lista</w:t>
               <w:tab/>
-              <w:t xml:space="preserve">12</w:t>
+              <w:t xml:space="preserve">15</w:t>
             </w:r>
           </w:hyperlink>
           <w:r>
@@ -1344,7 +1360,7 @@
               </w:rPr>
               <w:t xml:space="preserve">Diagramación</w:t>
               <w:tab/>
-              <w:t xml:space="preserve">13</w:t>
+              <w:t xml:space="preserve">16</w:t>
             </w:r>
           </w:hyperlink>
           <w:r>
@@ -1381,8 +1397,8 @@
             <w:r>
               <w:rPr>
                 <w:rFonts w:ascii="Arial" w:cs="Arial" w:eastAsia="Arial" w:hAnsi="Arial"/>
-                <w:b w:val="0"/>
-                <w:bCs w:val="0"/>
+                <w:b w:val="1"/>
+                <w:bCs w:val="1"/>
                 <w:i w:val="0"/>
                 <w:iCs w:val="0"/>
                 <w:smallCaps w:val="0"/>
@@ -1397,7 +1413,7 @@
               </w:rPr>
               <w:t xml:space="preserve">Casos de uso</w:t>
               <w:tab/>
-              <w:t xml:space="preserve">13</w:t>
+              <w:t xml:space="preserve">16</w:t>
             </w:r>
           </w:hyperlink>
           <w:r>
@@ -1434,8 +1450,8 @@
             <w:r>
               <w:rPr>
                 <w:rFonts w:ascii="Arial" w:cs="Arial" w:eastAsia="Arial" w:hAnsi="Arial"/>
-                <w:b w:val="0"/>
-                <w:bCs w:val="0"/>
+                <w:b w:val="1"/>
+                <w:bCs w:val="1"/>
                 <w:i w:val="0"/>
                 <w:iCs w:val="0"/>
                 <w:smallCaps w:val="0"/>
@@ -1450,7 +1466,7 @@
               </w:rPr>
               <w:t xml:space="preserve">Modelo relacional</w:t>
               <w:tab/>
-              <w:t xml:space="preserve">13</w:t>
+              <w:t xml:space="preserve">16</w:t>
             </w:r>
           </w:hyperlink>
           <w:r>
@@ -1503,7 +1519,7 @@
               </w:rPr>
               <w:t xml:space="preserve">Alcance</w:t>
               <w:tab/>
-              <w:t xml:space="preserve">14</w:t>
+              <w:t xml:space="preserve">18</w:t>
             </w:r>
           </w:hyperlink>
           <w:r>
@@ -1540,8 +1556,8 @@
             <w:r>
               <w:rPr>
                 <w:rFonts w:ascii="Arial" w:cs="Arial" w:eastAsia="Arial" w:hAnsi="Arial"/>
-                <w:b w:val="0"/>
-                <w:bCs w:val="0"/>
+                <w:b w:val="1"/>
+                <w:bCs w:val="1"/>
                 <w:i w:val="0"/>
                 <w:iCs w:val="0"/>
                 <w:smallCaps w:val="0"/>
@@ -1556,7 +1572,7 @@
               </w:rPr>
               <w:t xml:space="preserve">Entregable final</w:t>
               <w:tab/>
-              <w:t xml:space="preserve">14</w:t>
+              <w:t xml:space="preserve">18</w:t>
             </w:r>
           </w:hyperlink>
           <w:r>
@@ -1593,8 +1609,8 @@
             <w:r>
               <w:rPr>
                 <w:rFonts w:ascii="Arial" w:cs="Arial" w:eastAsia="Arial" w:hAnsi="Arial"/>
-                <w:b w:val="0"/>
-                <w:bCs w:val="0"/>
+                <w:b w:val="1"/>
+                <w:bCs w:val="1"/>
                 <w:i w:val="0"/>
                 <w:iCs w:val="0"/>
                 <w:smallCaps w:val="0"/>
@@ -1609,7 +1625,7 @@
               </w:rPr>
               <w:t xml:space="preserve">Inclusiones</w:t>
               <w:tab/>
-              <w:t xml:space="preserve">14</w:t>
+              <w:t xml:space="preserve">18</w:t>
             </w:r>
           </w:hyperlink>
           <w:r>
@@ -1646,8 +1662,8 @@
             <w:r>
               <w:rPr>
                 <w:rFonts w:ascii="Arial" w:cs="Arial" w:eastAsia="Arial" w:hAnsi="Arial"/>
-                <w:b w:val="0"/>
-                <w:bCs w:val="0"/>
+                <w:b w:val="1"/>
+                <w:bCs w:val="1"/>
                 <w:i w:val="0"/>
                 <w:iCs w:val="0"/>
                 <w:smallCaps w:val="0"/>
@@ -1662,7 +1678,7 @@
               </w:rPr>
               <w:t xml:space="preserve">Exclusiones</w:t>
               <w:tab/>
-              <w:t xml:space="preserve">14</w:t>
+              <w:t xml:space="preserve">18</w:t>
             </w:r>
           </w:hyperlink>
           <w:r>
@@ -1715,7 +1731,7 @@
               </w:rPr>
               <w:t xml:space="preserve">Stack tecnológico</w:t>
               <w:tab/>
-              <w:t xml:space="preserve">16</w:t>
+              <w:t xml:space="preserve">20</w:t>
             </w:r>
           </w:hyperlink>
           <w:r>
@@ -1768,7 +1784,7 @@
               </w:rPr>
               <w:t xml:space="preserve">Implementación y condiciones legales</w:t>
               <w:tab/>
-              <w:t xml:space="preserve">17</w:t>
+              <w:t xml:space="preserve">21</w:t>
             </w:r>
           </w:hyperlink>
           <w:r>
@@ -1805,8 +1821,8 @@
             <w:r>
               <w:rPr>
                 <w:rFonts w:ascii="Arial" w:cs="Arial" w:eastAsia="Arial" w:hAnsi="Arial"/>
-                <w:b w:val="0"/>
-                <w:bCs w:val="0"/>
+                <w:b w:val="1"/>
+                <w:bCs w:val="1"/>
                 <w:i w:val="0"/>
                 <w:iCs w:val="0"/>
                 <w:smallCaps w:val="0"/>
@@ -1821,7 +1837,7 @@
               </w:rPr>
               <w:t xml:space="preserve">Naturaleza académica y delimitación de marca</w:t>
               <w:tab/>
-              <w:t xml:space="preserve">17</w:t>
+              <w:t xml:space="preserve">21</w:t>
             </w:r>
           </w:hyperlink>
           <w:r>
@@ -1858,8 +1874,8 @@
             <w:r>
               <w:rPr>
                 <w:rFonts w:ascii="Arial" w:cs="Arial" w:eastAsia="Arial" w:hAnsi="Arial"/>
-                <w:b w:val="0"/>
-                <w:bCs w:val="0"/>
+                <w:b w:val="1"/>
+                <w:bCs w:val="1"/>
                 <w:i w:val="0"/>
                 <w:iCs w:val="0"/>
                 <w:smallCaps w:val="0"/>
@@ -1874,7 +1890,7 @@
               </w:rPr>
               <w:t xml:space="preserve">Propiedad industrial y uso de signos distintivos</w:t>
               <w:tab/>
-              <w:t xml:space="preserve">17</w:t>
+              <w:t xml:space="preserve">21</w:t>
             </w:r>
           </w:hyperlink>
           <w:r>
@@ -1911,8 +1927,8 @@
             <w:r>
               <w:rPr>
                 <w:rFonts w:ascii="Arial" w:cs="Arial" w:eastAsia="Arial" w:hAnsi="Arial"/>
-                <w:b w:val="0"/>
-                <w:bCs w:val="0"/>
+                <w:b w:val="1"/>
+                <w:bCs w:val="1"/>
                 <w:i w:val="0"/>
                 <w:iCs w:val="0"/>
                 <w:smallCaps w:val="0"/>
@@ -1927,7 +1943,7 @@
               </w:rPr>
               <w:t xml:space="preserve">Posibles consecuencias jurídicas</w:t>
               <w:tab/>
-              <w:t xml:space="preserve">18</w:t>
+              <w:t xml:space="preserve">22</w:t>
             </w:r>
           </w:hyperlink>
           <w:r>
@@ -1964,8 +1980,8 @@
             <w:r>
               <w:rPr>
                 <w:rFonts w:ascii="Arial" w:cs="Arial" w:eastAsia="Arial" w:hAnsi="Arial"/>
-                <w:b w:val="0"/>
-                <w:bCs w:val="0"/>
+                <w:b w:val="1"/>
+                <w:bCs w:val="1"/>
                 <w:i w:val="0"/>
                 <w:iCs w:val="0"/>
                 <w:smallCaps w:val="0"/>
@@ -1980,7 +1996,7 @@
               </w:rPr>
               <w:t xml:space="preserve">Derechos de autor sobre el software</w:t>
               <w:tab/>
-              <w:t xml:space="preserve">19</w:t>
+              <w:t xml:space="preserve">23</w:t>
             </w:r>
           </w:hyperlink>
           <w:r>
@@ -2017,8 +2033,8 @@
             <w:r>
               <w:rPr>
                 <w:rFonts w:ascii="Arial" w:cs="Arial" w:eastAsia="Arial" w:hAnsi="Arial"/>
-                <w:b w:val="0"/>
-                <w:bCs w:val="0"/>
+                <w:b w:val="1"/>
+                <w:bCs w:val="1"/>
                 <w:i w:val="0"/>
                 <w:iCs w:val="0"/>
                 <w:smallCaps w:val="0"/>
@@ -2033,7 +2049,7 @@
               </w:rPr>
               <w:t xml:space="preserve">Responsabilidad de aprendices e institución</w:t>
               <w:tab/>
-              <w:t xml:space="preserve">19</w:t>
+              <w:t xml:space="preserve">23</w:t>
             </w:r>
           </w:hyperlink>
           <w:r>
@@ -2070,8 +2086,8 @@
             <w:r>
               <w:rPr>
                 <w:rFonts w:ascii="Arial" w:cs="Arial" w:eastAsia="Arial" w:hAnsi="Arial"/>
-                <w:b w:val="0"/>
-                <w:bCs w:val="0"/>
+                <w:b w:val="1"/>
+                <w:bCs w:val="1"/>
                 <w:i w:val="0"/>
                 <w:iCs w:val="0"/>
                 <w:smallCaps w:val="0"/>
@@ -2086,7 +2102,7 @@
               </w:rPr>
               <w:t xml:space="preserve">Cláusula de delimitación propuesta</w:t>
               <w:tab/>
-              <w:t xml:space="preserve">20</w:t>
+              <w:t xml:space="preserve">24</w:t>
             </w:r>
           </w:hyperlink>
           <w:r>
@@ -2139,7 +2155,7 @@
               </w:rPr>
               <w:t xml:space="preserve">Organización del equipo y metodología</w:t>
               <w:tab/>
-              <w:t xml:space="preserve">21</w:t>
+              <w:t xml:space="preserve">25</w:t>
             </w:r>
           </w:hyperlink>
           <w:r>
@@ -2192,7 +2208,7 @@
               </w:rPr>
               <w:t xml:space="preserve">Conclusiones como equipo de desarrollo</w:t>
               <w:tab/>
-              <w:t xml:space="preserve">22</w:t>
+              <w:t xml:space="preserve">26</w:t>
             </w:r>
           </w:hyperlink>
           <w:r>
@@ -2245,7 +2261,7 @@
               </w:rPr>
               <w:t xml:space="preserve">Reflexión final sobre el trabajo en equipo</w:t>
               <w:tab/>
-              <w:t xml:space="preserve">23</w:t>
+              <w:t xml:space="preserve">27</w:t>
             </w:r>
           </w:hyperlink>
           <w:r>
@@ -2296,9 +2312,9 @@
                 <w:vertAlign w:val="baseline"/>
                 <w:rtl w:val="0"/>
               </w:rPr>
-              <w:t xml:space="preserve">Referencias</w:t>
+              <w:t xml:space="preserve">Referencias:</w:t>
               <w:tab/>
-              <w:t xml:space="preserve">24</w:t>
+              <w:t xml:space="preserve">29</w:t>
             </w:r>
           </w:hyperlink>
           <w:r>
@@ -2351,7 +2367,7 @@
               </w:rPr>
               <w:t xml:space="preserve">Anexo A. Matriz resumida de alcance</w:t>
               <w:tab/>
-              <w:t xml:space="preserve">25</w:t>
+              <w:t xml:space="preserve">32</w:t>
             </w:r>
           </w:hyperlink>
           <w:r>
@@ -2404,7 +2420,7 @@
               </w:rPr>
               <w:t xml:space="preserve">Anexo B. Nota de revisión legal</w:t>
               <w:tab/>
-              <w:t xml:space="preserve">25</w:t>
+              <w:t xml:space="preserve">32</w:t>
             </w:r>
           </w:hyperlink>
           <w:r>
@@ -2498,7 +2514,7 @@
     </w:p>
     <w:sdt>
       <w:sdtPr>
-        <w:id w:val="895550477"/>
+        <w:id w:val="-1267647036"/>
         <w:docPartObj>
           <w:docPartGallery w:val="Table of Contents"/>
           <w:docPartUnique w:val="1"/>
@@ -6739,22 +6755,96 @@
       <w:pPr>
         <w:spacing w:after="0" w:line="480" w:lineRule="auto"/>
         <w:ind w:firstLine="720"/>
-        <w:rPr/>
-      </w:pPr>
-      <w:r>
         <w:rPr>
           <w:rFonts w:ascii="Times New Roman" w:cs="Times New Roman" w:eastAsia="Times New Roman" w:hAnsi="Times New Roman"/>
           <w:color w:val="000000"/>
           <w:sz w:val="24"/>
           <w:szCs w:val="24"/>
+        </w:rPr>
+      </w:pPr>
+      <w:r>
+        <w:rPr>
+          <w:rFonts w:ascii="Times New Roman" w:cs="Times New Roman" w:eastAsia="Times New Roman" w:hAnsi="Times New Roman"/>
+          <w:color w:val="000000"/>
+          <w:sz w:val="24"/>
+          <w:szCs w:val="24"/>
           <w:rtl w:val="0"/>
         </w:rPr>
         <w:t xml:space="preserve">En el contexto actual, aunque el equipo está compuesto por cinco personas, la ejecución efectiva está siendo asumida principalmente por un integrante. Esta situación representa un reto tanto técnico como de gestión: además de programar, es necesario organizar prioridades, mantener la documentación y procurar que el producto llegue a un estado demostrable.</w:t>
       </w:r>
-      <w:r>
-        <w:rPr>
-          <w:rtl w:val="0"/>
-        </w:rPr>
+    </w:p>
+    <w:p>
+      <w:pPr>
+        <w:spacing w:after="240" w:lineRule="auto"/>
+        <w:ind w:firstLine="0"/>
+        <w:rPr/>
+      </w:pPr>
+      <w:r>
+        <w:rPr>
+          <w:rtl w:val="0"/>
+        </w:rPr>
+        <w:t xml:space="preserve">El proyecto corresponde al </w:t>
+      </w:r>
+      <w:r>
+        <w:rPr>
+          <w:b w:val="1"/>
+          <w:bCs w:val="1"/>
+          <w:rtl w:val="0"/>
+        </w:rPr>
+        <w:t xml:space="preserve">Grupo 5 — Planificador de Menús y Lista de Mercado</w:t>
+      </w:r>
+      <w:r>
+        <w:rPr>
+          <w:rtl w:val="0"/>
+        </w:rPr>
+        <w:t xml:space="preserve">. Las responsabilidades se organizan de acuerdo con los roles establecidos en la metodología Scrum y con la estructura definida en los materiales académicos utilizados como referencia.</w:t>
+      </w:r>
+    </w:p>
+    <w:p>
+      <w:pPr>
+        <w:spacing w:after="240" w:before="240" w:lineRule="auto"/>
+        <w:ind w:firstLine="0"/>
+        <w:rPr/>
+      </w:pPr>
+      <w:r>
+        <w:rPr>
+          <w:rtl w:val="0"/>
+        </w:rPr>
+        <w:t xml:space="preserve">Durante el desarrollo se identificaron situaciones en las que algunas responsabilidades no quedaron claramente asignadas o comunicadas. Asimismo, se registraron solicitudes de revisión y seguimiento cuya respuesta no siempre permitió determinar una tarea concreta, responsable, criterio de aceptación o fecha de cumplimiento.</w:t>
+      </w:r>
+    </w:p>
+    <w:p>
+      <w:pPr>
+        <w:spacing w:after="240" w:before="240" w:lineRule="auto"/>
+        <w:ind w:firstLine="0"/>
+        <w:rPr/>
+      </w:pPr>
+      <w:r>
+        <w:rPr>
+          <w:rtl w:val="0"/>
+        </w:rPr>
+        <w:t xml:space="preserve">Por esta razón, el presente cuadro tiene como finalidad establecer una referencia documental de los integrantes y sus roles, facilitando posteriormente la trazabilidad de las contribuciones mediante evidencias como commits, documentos, mensajes del grupo, revisiones y entregables.</w:t>
+      </w:r>
+    </w:p>
+    <w:p>
+      <w:pPr>
+        <w:spacing w:after="240" w:before="240" w:lineRule="auto"/>
+        <w:ind w:left="600" w:right="600" w:firstLine="0"/>
+        <w:rPr/>
+      </w:pPr>
+      <w:r>
+        <w:rPr>
+          <w:b w:val="1"/>
+          <w:bCs w:val="1"/>
+          <w:rtl w:val="0"/>
+        </w:rPr>
+        <w:t xml:space="preserve">Nota:</w:t>
+      </w:r>
+      <w:r>
+        <w:rPr>
+          <w:rtl w:val="0"/>
+        </w:rPr>
+        <w:t xml:space="preserve"> La asignación de roles y responsabilidades debe contrastarse con el documento académico o material de referencia utilizado por el curso. Las actividades específicas de cada integrante deben determinarse mediante evidencia verificable del trabajo realizado y no únicamente mediante la denominación del rol.</w:t>
       </w:r>
     </w:p>
     <w:p>
@@ -6765,6 +6855,18 @@
       </w:pPr>
       <w:r>
         <w:rPr>
+          <w:rtl w:val="0"/>
+        </w:rPr>
+      </w:r>
+    </w:p>
+    <w:p>
+      <w:pPr>
+        <w:spacing w:after="0" w:line="480" w:lineRule="auto"/>
+        <w:ind w:firstLine="720"/>
+        <w:rPr/>
+      </w:pPr>
+      <w:r>
+        <w:rPr>
           <w:rFonts w:ascii="Times New Roman" w:cs="Times New Roman" w:eastAsia="Times New Roman" w:hAnsi="Times New Roman"/>
           <w:color w:val="000000"/>
           <w:sz w:val="24"/>
@@ -6797,13 +6899,174 @@
         <w:pStyle w:val="Heading1"/>
         <w:spacing w:after="0" w:before="0" w:line="480" w:lineRule="auto"/>
         <w:ind w:firstLine="0"/>
-        <w:rPr/>
-      </w:pPr>
-      <w:r>
-        <w:rPr>
-          <w:rtl w:val="0"/>
-        </w:rPr>
-        <w:t xml:space="preserve">Referencias</w:t>
+        <w:rPr>
+          <w:sz w:val="34"/>
+          <w:szCs w:val="34"/>
+        </w:rPr>
+      </w:pPr>
+      <w:r>
+        <w:rPr>
+          <w:rtl w:val="0"/>
+        </w:rPr>
+        <w:t xml:space="preserve">Referencias:</w:t>
+      </w:r>
+      <w:r>
+        <w:rPr>
+          <w:rtl w:val="0"/>
+        </w:rPr>
+      </w:r>
+    </w:p>
+    <w:p>
+      <w:pPr>
+        <w:spacing w:after="240" w:lineRule="auto"/>
+        <w:ind w:firstLine="0"/>
+        <w:rPr/>
+      </w:pPr>
+      <w:r>
+        <w:rPr>
+          <w:rtl w:val="0"/>
+        </w:rPr>
+        <w:t xml:space="preserve">El desarrollo de este proyecto contó con el apoyo de los materiales de instrucción, documentos, presentaciones, guías, ejemplos y orientaciones metodológicas proporcionados por el docente del curso y la institución educativa.</w:t>
+      </w:r>
+    </w:p>
+    <w:p>
+      <w:pPr>
+        <w:spacing w:after="240" w:before="240" w:lineRule="auto"/>
+        <w:ind w:firstLine="0"/>
+        <w:rPr/>
+      </w:pPr>
+      <w:r>
+        <w:rPr>
+          <w:rtl w:val="0"/>
+        </w:rPr>
+        <w:t xml:space="preserve">Estos materiales fueron utilizados como referencias académicas para la elaboración de la documentación de requisitos, la metodología Scrum, las historias de usuario, el diseño del sistema, las actividades de desarrollo de software y la documentación general del proyecto.</w:t>
+      </w:r>
+    </w:p>
+    <w:p>
+      <w:pPr>
+        <w:spacing w:after="240" w:before="240" w:lineRule="auto"/>
+        <w:ind w:left="600" w:right="600" w:firstLine="0"/>
+        <w:rPr/>
+      </w:pPr>
+      <w:r>
+        <w:rPr>
+          <w:b w:val="1"/>
+          <w:bCs w:val="1"/>
+          <w:rtl w:val="0"/>
+        </w:rPr>
+        <w:t xml:space="preserve">Nota:</w:t>
+      </w:r>
+      <w:r>
+        <w:rPr>
+          <w:rtl w:val="0"/>
+        </w:rPr>
+        <w:t xml:space="preserve"> La información bibliográfica específica de los materiales proporcionados por el docente deberá completarse utilizando el título, autor, institución, año y/o URL que aparezcan en los materiales originales.</w:t>
+      </w:r>
+    </w:p>
+    <w:p>
+      <w:pPr>
+        <w:spacing w:after="240" w:before="240" w:lineRule="auto"/>
+        <w:ind w:firstLine="0"/>
+        <w:rPr/>
+      </w:pPr>
+      <w:r>
+        <w:rPr>
+          <w:rtl w:val="0"/>
+        </w:rPr>
+        <w:t xml:space="preserve">La documentación del proyecto también reconoce el contexto contractual y académico aplicable mediante el documento:</w:t>
+      </w:r>
+    </w:p>
+    <w:p>
+      <w:pPr>
+        <w:spacing w:after="240" w:before="240" w:lineRule="auto"/>
+        <w:ind w:firstLine="0"/>
+        <w:rPr>
+          <w:b w:val="1"/>
+          <w:bCs w:val="1"/>
+        </w:rPr>
+      </w:pPr>
+      <w:r>
+        <w:rPr>
+          <w:b w:val="1"/>
+          <w:bCs w:val="1"/>
+          <w:rtl w:val="0"/>
+        </w:rPr>
+        <w:t xml:space="preserve">Contrato de Aprendizaje Laboral Especial a Término Fijo.</w:t>
+      </w:r>
+    </w:p>
+    <w:p>
+      <w:pPr>
+        <w:spacing w:after="240" w:before="240" w:lineRule="auto"/>
+        <w:ind w:firstLine="0"/>
+        <w:rPr/>
+      </w:pPr>
+      <w:r>
+        <w:rPr>
+          <w:rtl w:val="0"/>
+        </w:rPr>
+        <w:t xml:space="preserve">Este documento se incluye como referencia legal y contractual para el contexto en el cual se desarrollan las actividades de aprendizaje y prácticas asociadas al proyecto.</w:t>
+      </w:r>
+    </w:p>
+    <w:p>
+      <w:pPr>
+        <w:spacing w:after="240" w:before="240" w:lineRule="auto"/>
+        <w:ind w:firstLine="0"/>
+        <w:rPr/>
+      </w:pPr>
+      <w:r>
+        <w:rPr>
+          <w:rtl w:val="0"/>
+        </w:rPr>
+        <w:t xml:space="preserve">El documento contractual deberá ser citado de acuerdo con la versión oficial proporcionada por la institución, empresa o entidad contratante. Su fecha exacta, entidad emisora, versión y demás datos de identificación deberán conservarse conforme aparecen en el documento oficial, evitando reconstruir dicha información de memoria.</w:t>
+      </w:r>
+    </w:p>
+    <w:p>
+      <w:pPr>
+        <w:spacing w:after="240" w:before="240" w:lineRule="auto"/>
+        <w:ind w:firstLine="0"/>
+        <w:rPr/>
+      </w:pPr>
+      <w:r>
+        <w:rPr>
+          <w:rtl w:val="0"/>
+        </w:rPr>
+        <w:t xml:space="preserve">Las referencias incluidas en este documento tienen como finalidad proporcionar trazabilidad respecto de las fuentes utilizadas durante el desarrollo académico del proyecto.</w:t>
+      </w:r>
+    </w:p>
+    <w:p>
+      <w:pPr>
+        <w:spacing w:after="240" w:before="240" w:lineRule="auto"/>
+        <w:ind w:firstLine="0"/>
+        <w:rPr/>
+      </w:pPr>
+      <w:r>
+        <w:rPr>
+          <w:rtl w:val="0"/>
+        </w:rPr>
+        <w:t xml:space="preserve">Los materiales proporcionados por el docente, la documentación institucional, los documentos legales o contractuales y la documentación técnica deberán distinguirse de acuerdo con su respectiva naturaleza.</w:t>
+      </w:r>
+    </w:p>
+    <w:p>
+      <w:pPr>
+        <w:spacing w:after="240" w:before="240" w:lineRule="auto"/>
+        <w:ind w:firstLine="0"/>
+        <w:rPr/>
+      </w:pPr>
+      <w:r>
+        <w:rPr>
+          <w:rtl w:val="0"/>
+        </w:rPr>
+        <w:t xml:space="preserve">Ninguna fuente deberá presentarse como autoridad académica o legal sin que pueda verificarse su documento original y su información bibliográfica correspondiente.</w:t>
+      </w:r>
+    </w:p>
+    <w:p>
+      <w:pPr>
+        <w:rPr/>
+      </w:pPr>
+      <w:r>
+        <w:rPr>
+          <w:rtl w:val="0"/>
+        </w:rPr>
       </w:r>
     </w:p>
     <w:p>
@@ -6819,7 +7082,29 @@
           <w:szCs w:val="24"/>
           <w:rtl w:val="0"/>
         </w:rPr>
-        <w:t xml:space="preserve">Comunidad Andina. (2000). Decisión 486: Régimen común sobre propiedad industrial. https://www.comunidadandina.org/DocOficialesFiles/Gacetas/Gace600.pdf</w:t>
+        <w:t xml:space="preserve">Comunidad Andina. (2000). Decisión 486: Régimen común sobre propiedad industrial. </w:t>
+      </w:r>
+      <w:hyperlink r:id="rId8">
+        <w:r>
+          <w:rPr>
+            <w:rFonts w:ascii="Times New Roman" w:cs="Times New Roman" w:eastAsia="Times New Roman" w:hAnsi="Times New Roman"/>
+            <w:color w:val="1155cc"/>
+            <w:sz w:val="24"/>
+            <w:szCs w:val="24"/>
+            <w:u w:val="single"/>
+            <w:rtl w:val="0"/>
+          </w:rPr>
+          <w:t xml:space="preserve">https://www.comunidadandina.org/DocOficialesFiles/Gacetas/Gace600.pdf</w:t>
+        </w:r>
+      </w:hyperlink>
+      <w:r>
+        <w:rPr>
+          <w:rFonts w:ascii="Times New Roman" w:cs="Times New Roman" w:eastAsia="Times New Roman" w:hAnsi="Times New Roman"/>
+          <w:sz w:val="24"/>
+          <w:szCs w:val="24"/>
+          <w:rtl w:val="0"/>
+        </w:rPr>
+        <w:t xml:space="preserve"> </w:t>
       </w:r>
       <w:r>
         <w:rPr>
@@ -6861,7 +7146,29 @@
           <w:szCs w:val="24"/>
           <w:rtl w:val="0"/>
         </w:rPr>
-        <w:t xml:space="preserve">Dirección Nacional de Derecho de Autor. (s. f.). Registro de software. https://www.derechodeautor.gov.co/es/atencion-y-servicios-a-la-ciudadania/registro-de-obras/registro-de-software/registro-de-software</w:t>
+        <w:t xml:space="preserve">Dirección Nacional de Derecho de Autor. (s. f.). Registro de software. </w:t>
+      </w:r>
+      <w:hyperlink r:id="rId9">
+        <w:r>
+          <w:rPr>
+            <w:rFonts w:ascii="Times New Roman" w:cs="Times New Roman" w:eastAsia="Times New Roman" w:hAnsi="Times New Roman"/>
+            <w:color w:val="1155cc"/>
+            <w:sz w:val="24"/>
+            <w:szCs w:val="24"/>
+            <w:u w:val="single"/>
+            <w:rtl w:val="0"/>
+          </w:rPr>
+          <w:t xml:space="preserve">https://www.derechodeautor.gov.co/es/atencion-y-servicios-a-la-ciudadania/registro-de-obras/registro-de-software/registro-de-software</w:t>
+        </w:r>
+      </w:hyperlink>
+      <w:r>
+        <w:rPr>
+          <w:rFonts w:ascii="Times New Roman" w:cs="Times New Roman" w:eastAsia="Times New Roman" w:hAnsi="Times New Roman"/>
+          <w:sz w:val="24"/>
+          <w:szCs w:val="24"/>
+          <w:rtl w:val="0"/>
+        </w:rPr>
+        <w:t xml:space="preserve"> </w:t>
       </w:r>
       <w:r>
         <w:rPr>
@@ -6882,7 +7189,29 @@
           <w:szCs w:val="24"/>
           <w:rtl w:val="0"/>
         </w:rPr>
-        <w:t xml:space="preserve">Función Pública. (2000). Ley 599 de 2000: Por la cual se expide el Código Penal. https://www.funcionpublica.gov.co/eva/gestornormativo/norma.php?0=&amp;i=6388</w:t>
+        <w:t xml:space="preserve">Función Pública. (2000). Ley 599 de 2000: Por la cual se expide el Código Penal. </w:t>
+      </w:r>
+      <w:hyperlink r:id="rId10">
+        <w:r>
+          <w:rPr>
+            <w:rFonts w:ascii="Times New Roman" w:cs="Times New Roman" w:eastAsia="Times New Roman" w:hAnsi="Times New Roman"/>
+            <w:color w:val="1155cc"/>
+            <w:sz w:val="24"/>
+            <w:szCs w:val="24"/>
+            <w:u w:val="single"/>
+            <w:rtl w:val="0"/>
+          </w:rPr>
+          <w:t xml:space="preserve">https://www.funcionpublica.gov.co/eva/gestornormativo/norma.php?0=&amp;i=6388</w:t>
+        </w:r>
+      </w:hyperlink>
+      <w:r>
+        <w:rPr>
+          <w:rFonts w:ascii="Times New Roman" w:cs="Times New Roman" w:eastAsia="Times New Roman" w:hAnsi="Times New Roman"/>
+          <w:sz w:val="24"/>
+          <w:szCs w:val="24"/>
+          <w:rtl w:val="0"/>
+        </w:rPr>
+        <w:t xml:space="preserve"> </w:t>
       </w:r>
       <w:r>
         <w:rPr>
@@ -6903,7 +7232,29 @@
           <w:szCs w:val="24"/>
           <w:rtl w:val="0"/>
         </w:rPr>
-        <w:t xml:space="preserve">Función Pública. (1982). Ley 23 de 1982: Sobre derechos de autor. https://www1.funcionpublica.gov.co/eva/gestornormativo/norma.php?i=3431</w:t>
+        <w:t xml:space="preserve">Función Pública. (1982). Ley 23 de 1982: Sobre derechos de autor. </w:t>
+      </w:r>
+      <w:hyperlink r:id="rId11">
+        <w:r>
+          <w:rPr>
+            <w:rFonts w:ascii="Times New Roman" w:cs="Times New Roman" w:eastAsia="Times New Roman" w:hAnsi="Times New Roman"/>
+            <w:color w:val="1155cc"/>
+            <w:sz w:val="24"/>
+            <w:szCs w:val="24"/>
+            <w:u w:val="single"/>
+            <w:rtl w:val="0"/>
+          </w:rPr>
+          <w:t xml:space="preserve">https://www1.funcionpublica.gov.co/eva/gestornormativo/norma.php?i=3431</w:t>
+        </w:r>
+      </w:hyperlink>
+      <w:r>
+        <w:rPr>
+          <w:rFonts w:ascii="Times New Roman" w:cs="Times New Roman" w:eastAsia="Times New Roman" w:hAnsi="Times New Roman"/>
+          <w:sz w:val="24"/>
+          <w:szCs w:val="24"/>
+          <w:rtl w:val="0"/>
+        </w:rPr>
+        <w:t xml:space="preserve"> </w:t>
       </w:r>
       <w:r>
         <w:rPr>
@@ -6915,7 +7266,11 @@
       <w:pPr>
         <w:spacing w:line="480" w:lineRule="auto"/>
         <w:ind w:left="720" w:hanging="720"/>
-        <w:rPr/>
+        <w:rPr>
+          <w:rFonts w:ascii="Times New Roman" w:cs="Times New Roman" w:eastAsia="Times New Roman" w:hAnsi="Times New Roman"/>
+          <w:sz w:val="24"/>
+          <w:szCs w:val="24"/>
+        </w:rPr>
       </w:pPr>
       <w:r>
         <w:rPr>
@@ -6926,6 +7281,278 @@
         </w:rPr>
         <w:t xml:space="preserve">Superintendencia de Industria y Comercio. (s. f.). Competencia desleal y propiedad industrial. https://sedeelectronica.sic.gov.co/temas/asuntos-jurisdiccionales/proteccion-del-consumidor/competencia-desleal-y-propiedad-industrial</w:t>
       </w:r>
+    </w:p>
+    <w:p>
+      <w:pPr>
+        <w:spacing w:after="240" w:before="240" w:lineRule="auto"/>
+        <w:ind w:firstLine="0"/>
+        <w:rPr>
+          <w:color w:val="1155cc"/>
+          <w:u w:val="single"/>
+        </w:rPr>
+      </w:pPr>
+      <w:r>
+        <w:rPr>
+          <w:rtl w:val="0"/>
+        </w:rPr>
+        <w:t xml:space="preserve">ZAPATA, Jaime. </w:t>
+      </w:r>
+      <w:r>
+        <w:rPr>
+          <w:i w:val="1"/>
+          <w:iCs w:val="1"/>
+          <w:rtl w:val="0"/>
+        </w:rPr>
+        <w:t xml:space="preserve">Backlog del Producto</w:t>
+      </w:r>
+      <w:r>
+        <w:rPr>
+          <w:rtl w:val="0"/>
+        </w:rPr>
+        <w:t xml:space="preserve">. CESDE, material pédagogique du cours, [s. d.]. Disponible sur :</w:t>
+      </w:r>
+      <w:hyperlink r:id="rId12">
+        <w:r>
+          <w:rPr>
+            <w:rtl w:val="0"/>
+          </w:rPr>
+          <w:t xml:space="preserve"> </w:t>
+        </w:r>
+      </w:hyperlink>
+      <w:hyperlink r:id="rId13">
+        <w:r>
+          <w:rPr>
+            <w:color w:val="1155cc"/>
+            <w:u w:val="single"/>
+            <w:rtl w:val="0"/>
+          </w:rPr>
+          <w:t xml:space="preserve">https://docs.google.com/spreadsheets/d/16S6kVMb1RMUb8icqdKf1Ex3PK7UFzyMs/edit?gid=651647471#gid=651647471</w:t>
+        </w:r>
+      </w:hyperlink>
+      <w:r>
+        <w:rPr>
+          <w:rtl w:val="0"/>
+        </w:rPr>
+      </w:r>
+    </w:p>
+    <w:p>
+      <w:pPr>
+        <w:spacing w:after="240" w:before="240" w:lineRule="auto"/>
+        <w:ind w:firstLine="0"/>
+        <w:rPr>
+          <w:color w:val="1155cc"/>
+          <w:u w:val="single"/>
+        </w:rPr>
+      </w:pPr>
+      <w:r>
+        <w:rPr>
+          <w:rtl w:val="0"/>
+        </w:rPr>
+        <w:t xml:space="preserve">ZAPATA, Jaime. </w:t>
+      </w:r>
+      <w:r>
+        <w:rPr>
+          <w:i w:val="1"/>
+          <w:iCs w:val="1"/>
+          <w:rtl w:val="0"/>
+        </w:rPr>
+        <w:t xml:space="preserve">Asignación – Metodologías</w:t>
+      </w:r>
+      <w:r>
+        <w:rPr>
+          <w:rtl w:val="0"/>
+        </w:rPr>
+        <w:t xml:space="preserve">. CESDE, material pédagogique du cours, [s. d.]. Disponible sur :</w:t>
+      </w:r>
+      <w:hyperlink r:id="rId14">
+        <w:r>
+          <w:rPr>
+            <w:rtl w:val="0"/>
+          </w:rPr>
+          <w:t xml:space="preserve"> </w:t>
+        </w:r>
+      </w:hyperlink>
+      <w:hyperlink r:id="rId15">
+        <w:r>
+          <w:rPr>
+            <w:color w:val="1155cc"/>
+            <w:u w:val="single"/>
+            <w:rtl w:val="0"/>
+          </w:rPr>
+          <w:t xml:space="preserve">https://docs.google.com/spreadsheets/d/1I85dGy3mablUgxN85FjZApJDjE7_gN2L/edit?gid=1472682486#gid=1472682486</w:t>
+        </w:r>
+      </w:hyperlink>
+      <w:r>
+        <w:rPr>
+          <w:rtl w:val="0"/>
+        </w:rPr>
+      </w:r>
+    </w:p>
+    <w:p>
+      <w:pPr>
+        <w:spacing w:after="240" w:before="240" w:lineRule="auto"/>
+        <w:ind w:firstLine="0"/>
+        <w:rPr>
+          <w:color w:val="1155cc"/>
+          <w:u w:val="single"/>
+        </w:rPr>
+      </w:pPr>
+      <w:r>
+        <w:rPr>
+          <w:rtl w:val="0"/>
+        </w:rPr>
+        <w:t xml:space="preserve">COLOMBIE. MINISTERIO DEL TRABAJO. </w:t>
+      </w:r>
+      <w:r>
+        <w:rPr>
+          <w:i w:val="1"/>
+          <w:iCs w:val="1"/>
+          <w:rtl w:val="0"/>
+        </w:rPr>
+        <w:t xml:space="preserve">Decreto 223 de 2026: por el cual se modifican y adicionan disposiciones relacionadas con la vinculación formativa y el contrato de aprendizaje</w:t>
+      </w:r>
+      <w:r>
+        <w:rPr>
+          <w:rtl w:val="0"/>
+        </w:rPr>
+        <w:t xml:space="preserve">. Bogotá D. C.: Ministerio del Trabajo, 2026. Disponible sur :</w:t>
+      </w:r>
+      <w:hyperlink r:id="rId16">
+        <w:r>
+          <w:rPr>
+            <w:rtl w:val="0"/>
+          </w:rPr>
+          <w:t xml:space="preserve"> </w:t>
+        </w:r>
+      </w:hyperlink>
+      <w:hyperlink r:id="rId17">
+        <w:r>
+          <w:rPr>
+            <w:color w:val="1155cc"/>
+            <w:u w:val="single"/>
+            <w:rtl w:val="0"/>
+          </w:rPr>
+          <w:t xml:space="preserve">https://www1.funcionpublica.gov.co/eva/gestornormativo/norma.php?i=272856</w:t>
+        </w:r>
+      </w:hyperlink>
+      <w:r>
+        <w:rPr>
+          <w:rtl w:val="0"/>
+        </w:rPr>
+      </w:r>
+    </w:p>
+    <w:p>
+      <w:pPr>
+        <w:spacing w:after="240" w:before="240" w:lineRule="auto"/>
+        <w:ind w:firstLine="0"/>
+        <w:rPr>
+          <w:color w:val="1155cc"/>
+          <w:u w:val="single"/>
+        </w:rPr>
+      </w:pPr>
+      <w:r>
+        <w:rPr>
+          <w:rtl w:val="0"/>
+        </w:rPr>
+        <w:t xml:space="preserve">COLOMBIE. CONGRESO DE LA REPÚBLICA. </w:t>
+      </w:r>
+      <w:r>
+        <w:rPr>
+          <w:i w:val="1"/>
+          <w:iCs w:val="1"/>
+          <w:rtl w:val="0"/>
+        </w:rPr>
+        <w:t xml:space="preserve">Ley 789 de 2002: por la cual se dictan normas para apoyar el empleo y ampliar la protección social y se modifican algunos artículos del Código Sustantivo de Trabajo</w:t>
+      </w:r>
+      <w:r>
+        <w:rPr>
+          <w:rtl w:val="0"/>
+        </w:rPr>
+        <w:t xml:space="preserve">. Bogotá D. C., 2002. Disponible sur :</w:t>
+      </w:r>
+      <w:hyperlink r:id="rId18">
+        <w:r>
+          <w:rPr>
+            <w:rtl w:val="0"/>
+          </w:rPr>
+          <w:t xml:space="preserve"> </w:t>
+        </w:r>
+      </w:hyperlink>
+      <w:hyperlink r:id="rId19">
+        <w:r>
+          <w:rPr>
+            <w:color w:val="1155cc"/>
+            <w:u w:val="single"/>
+            <w:rtl w:val="0"/>
+          </w:rPr>
+          <w:t xml:space="preserve">https://www.funcionpublica.gov.co/eva/gestornormativo/norma_pdf.php?i=6778</w:t>
+        </w:r>
+      </w:hyperlink>
+      <w:r>
+        <w:rPr>
+          <w:rtl w:val="0"/>
+        </w:rPr>
+      </w:r>
+    </w:p>
+    <w:p>
+      <w:pPr>
+        <w:spacing w:after="240" w:before="240" w:lineRule="auto"/>
+        <w:ind w:firstLine="0"/>
+        <w:rPr>
+          <w:color w:val="1155cc"/>
+          <w:u w:val="single"/>
+        </w:rPr>
+      </w:pPr>
+      <w:r>
+        <w:rPr>
+          <w:rtl w:val="0"/>
+        </w:rPr>
+        <w:t xml:space="preserve">SERVICIO NACIONAL DE APRENDIZAJE — SENA. </w:t>
+      </w:r>
+      <w:r>
+        <w:rPr>
+          <w:i w:val="1"/>
+          <w:iCs w:val="1"/>
+          <w:rtl w:val="0"/>
+        </w:rPr>
+        <w:t xml:space="preserve">Compilación normativa: contrato de aprendizaje</w:t>
+      </w:r>
+      <w:r>
+        <w:rPr>
+          <w:rtl w:val="0"/>
+        </w:rPr>
+        <w:t xml:space="preserve">. Bogotá D. C.: SENA. Disponible sur :</w:t>
+      </w:r>
+      <w:hyperlink r:id="rId20">
+        <w:r>
+          <w:rPr>
+            <w:rtl w:val="0"/>
+          </w:rPr>
+          <w:t xml:space="preserve"> </w:t>
+        </w:r>
+      </w:hyperlink>
+      <w:hyperlink r:id="rId21">
+        <w:r>
+          <w:rPr>
+            <w:color w:val="1155cc"/>
+            <w:u w:val="single"/>
+            <w:rtl w:val="0"/>
+          </w:rPr>
+          <w:t xml:space="preserve">https://normograma.sena.edu.co/compilacion/docs/decreto_0223_2026.htm</w:t>
+        </w:r>
+      </w:hyperlink>
+      <w:r>
+        <w:rPr>
+          <w:rtl w:val="0"/>
+        </w:rPr>
+      </w:r>
+    </w:p>
+    <w:p>
+      <w:pPr>
+        <w:spacing w:line="480" w:lineRule="auto"/>
+        <w:ind w:left="720" w:hanging="720"/>
+        <w:rPr/>
+      </w:pPr>
       <w:r>
         <w:rPr>
           <w:rtl w:val="0"/>
@@ -7018,8 +7645,8 @@
       </w:r>
     </w:p>
     <w:sectPr>
-      <w:headerReference r:id="rId8" w:type="default"/>
-      <w:footerReference r:id="rId9" w:type="default"/>
+      <w:headerReference r:id="rId22" w:type="default"/>
+      <w:footerReference r:id="rId23" w:type="default"/>
       <w:pgSz w:h="15840" w:w="12240" w:orient="portrait"/>
       <w:pgMar w:bottom="1440" w:top="1440" w:left="1440" w:right="1440" w:header="720" w:footer="720"/>
       <w:pgNumType w:start="1"/>

</xml_diff>

<commit_message>
feat: Added data base schema on the report document
</commit_message>
<xml_diff>
--- a/INFORME_REQUISITOS.docx
+++ b/INFORME_REQUISITOS.docx
@@ -297,7 +297,7 @@
     </w:p>
     <w:sdt>
       <w:sdtPr>
-        <w:id w:val="-1007689691"/>
+        <w:id w:val="-1422595390"/>
         <w:docPartObj>
           <w:docPartGallery w:val="Table of Contents"/>
           <w:docPartUnique w:val="1"/>
@@ -2514,7 +2514,7 @@
     </w:p>
     <w:sdt>
       <w:sdtPr>
-        <w:id w:val="-1267647036"/>
+        <w:id w:val="-101603171"/>
         <w:docPartObj>
           <w:docPartGallery w:val="Table of Contents"/>
           <w:docPartUnique w:val="1"/>
@@ -4879,6 +4879,2937 @@
     <w:p>
       <w:pPr>
         <w:pStyle w:val="Heading2"/>
+        <w:spacing w:before="0" w:lineRule="auto"/>
+        <w:ind w:firstLine="0"/>
+        <w:rPr>
+          <w:b w:val="0"/>
+          <w:bCs w:val="0"/>
+        </w:rPr>
+      </w:pPr>
+      <w:r>
+        <w:rPr>
+          <w:b w:val="0"/>
+          <w:bCs w:val="0"/>
+          <w:rtl w:val="0"/>
+        </w:rPr>
+        <w:t xml:space="preserve">-- ============================================================</w:t>
+      </w:r>
+    </w:p>
+    <w:p>
+      <w:pPr>
+        <w:pStyle w:val="Heading2"/>
+        <w:spacing w:before="0" w:lineRule="auto"/>
+        <w:ind w:firstLine="0"/>
+        <w:rPr>
+          <w:b w:val="0"/>
+          <w:bCs w:val="0"/>
+        </w:rPr>
+      </w:pPr>
+      <w:r>
+        <w:rPr>
+          <w:b w:val="0"/>
+          <w:bCs w:val="0"/>
+          <w:rtl w:val="0"/>
+        </w:rPr>
+        <w:t xml:space="preserve">-- SAZÓN</w:t>
+      </w:r>
+    </w:p>
+    <w:p>
+      <w:pPr>
+        <w:pStyle w:val="Heading2"/>
+        <w:spacing w:before="0" w:lineRule="auto"/>
+        <w:ind w:firstLine="0"/>
+        <w:rPr>
+          <w:b w:val="0"/>
+          <w:bCs w:val="0"/>
+        </w:rPr>
+      </w:pPr>
+      <w:r>
+        <w:rPr>
+          <w:b w:val="0"/>
+          <w:bCs w:val="0"/>
+          <w:rtl w:val="0"/>
+        </w:rPr>
+        <w:t xml:space="preserve">-- Célula 5 — Planificador de Menús y Lista de Mercado</w:t>
+      </w:r>
+    </w:p>
+    <w:p>
+      <w:pPr>
+        <w:pStyle w:val="Heading2"/>
+        <w:spacing w:before="0" w:lineRule="auto"/>
+        <w:ind w:firstLine="0"/>
+        <w:rPr>
+          <w:b w:val="0"/>
+          <w:bCs w:val="0"/>
+        </w:rPr>
+      </w:pPr>
+      <w:r>
+        <w:rPr>
+          <w:b w:val="0"/>
+          <w:bCs w:val="0"/>
+          <w:rtl w:val="0"/>
+        </w:rPr>
+        <w:t xml:space="preserve">-- Database schema — MVP</w:t>
+      </w:r>
+    </w:p>
+    <w:p>
+      <w:pPr>
+        <w:pStyle w:val="Heading2"/>
+        <w:spacing w:before="0" w:lineRule="auto"/>
+        <w:ind w:firstLine="0"/>
+        <w:rPr>
+          <w:b w:val="0"/>
+          <w:bCs w:val="0"/>
+        </w:rPr>
+      </w:pPr>
+      <w:r>
+        <w:rPr>
+          <w:b w:val="0"/>
+          <w:bCs w:val="0"/>
+          <w:rtl w:val="0"/>
+        </w:rPr>
+        <w:t xml:space="preserve">-- PostgreSQL</w:t>
+      </w:r>
+    </w:p>
+    <w:p>
+      <w:pPr>
+        <w:pStyle w:val="Heading2"/>
+        <w:spacing w:before="0" w:lineRule="auto"/>
+        <w:ind w:firstLine="0"/>
+        <w:rPr>
+          <w:b w:val="0"/>
+          <w:bCs w:val="0"/>
+        </w:rPr>
+      </w:pPr>
+      <w:r>
+        <w:rPr>
+          <w:b w:val="0"/>
+          <w:bCs w:val="0"/>
+          <w:rtl w:val="0"/>
+        </w:rPr>
+        <w:t xml:space="preserve">-- ============================================================</w:t>
+      </w:r>
+    </w:p>
+    <w:p>
+      <w:pPr>
+        <w:pStyle w:val="Heading2"/>
+        <w:spacing w:before="0" w:lineRule="auto"/>
+        <w:ind w:firstLine="0"/>
+        <w:rPr>
+          <w:b w:val="0"/>
+          <w:bCs w:val="0"/>
+        </w:rPr>
+      </w:pPr>
+      <w:r>
+        <w:rPr>
+          <w:rtl w:val="0"/>
+        </w:rPr>
+      </w:r>
+    </w:p>
+    <w:p>
+      <w:pPr>
+        <w:pStyle w:val="Heading2"/>
+        <w:spacing w:before="0" w:lineRule="auto"/>
+        <w:ind w:firstLine="0"/>
+        <w:rPr>
+          <w:b w:val="0"/>
+          <w:bCs w:val="0"/>
+        </w:rPr>
+      </w:pPr>
+      <w:r>
+        <w:rPr>
+          <w:b w:val="0"/>
+          <w:bCs w:val="0"/>
+          <w:rtl w:val="0"/>
+        </w:rPr>
+        <w:t xml:space="preserve">BEGIN;</w:t>
+      </w:r>
+    </w:p>
+    <w:p>
+      <w:pPr>
+        <w:pStyle w:val="Heading2"/>
+        <w:spacing w:before="0" w:lineRule="auto"/>
+        <w:ind w:firstLine="0"/>
+        <w:rPr>
+          <w:b w:val="0"/>
+          <w:bCs w:val="0"/>
+        </w:rPr>
+      </w:pPr>
+      <w:r>
+        <w:rPr>
+          <w:rtl w:val="0"/>
+        </w:rPr>
+      </w:r>
+    </w:p>
+    <w:p>
+      <w:pPr>
+        <w:pStyle w:val="Heading2"/>
+        <w:spacing w:before="0" w:lineRule="auto"/>
+        <w:ind w:firstLine="0"/>
+        <w:rPr>
+          <w:b w:val="0"/>
+          <w:bCs w:val="0"/>
+        </w:rPr>
+      </w:pPr>
+      <w:r>
+        <w:rPr>
+          <w:b w:val="0"/>
+          <w:bCs w:val="0"/>
+          <w:rtl w:val="0"/>
+        </w:rPr>
+        <w:t xml:space="preserve">-- ============================================================</w:t>
+      </w:r>
+    </w:p>
+    <w:p>
+      <w:pPr>
+        <w:pStyle w:val="Heading2"/>
+        <w:spacing w:before="0" w:lineRule="auto"/>
+        <w:ind w:firstLine="0"/>
+        <w:rPr>
+          <w:b w:val="0"/>
+          <w:bCs w:val="0"/>
+        </w:rPr>
+      </w:pPr>
+      <w:r>
+        <w:rPr>
+          <w:b w:val="0"/>
+          <w:bCs w:val="0"/>
+          <w:rtl w:val="0"/>
+        </w:rPr>
+        <w:t xml:space="preserve">-- 1. PLAN_MENU</w:t>
+      </w:r>
+    </w:p>
+    <w:p>
+      <w:pPr>
+        <w:pStyle w:val="Heading2"/>
+        <w:spacing w:before="0" w:lineRule="auto"/>
+        <w:ind w:firstLine="0"/>
+        <w:rPr>
+          <w:b w:val="0"/>
+          <w:bCs w:val="0"/>
+        </w:rPr>
+      </w:pPr>
+      <w:r>
+        <w:rPr>
+          <w:b w:val="0"/>
+          <w:bCs w:val="0"/>
+          <w:rtl w:val="0"/>
+        </w:rPr>
+        <w:t xml:space="preserve">-- ============================================================</w:t>
+      </w:r>
+    </w:p>
+    <w:p>
+      <w:pPr>
+        <w:pStyle w:val="Heading2"/>
+        <w:spacing w:before="0" w:lineRule="auto"/>
+        <w:ind w:firstLine="0"/>
+        <w:rPr>
+          <w:b w:val="0"/>
+          <w:bCs w:val="0"/>
+        </w:rPr>
+      </w:pPr>
+      <w:r>
+        <w:rPr>
+          <w:b w:val="0"/>
+          <w:bCs w:val="0"/>
+          <w:rtl w:val="0"/>
+        </w:rPr>
+        <w:t xml:space="preserve">CREATE TABLE IF NOT EXISTS plan_menu (</w:t>
+      </w:r>
+    </w:p>
+    <w:p>
+      <w:pPr>
+        <w:pStyle w:val="Heading2"/>
+        <w:spacing w:before="0" w:lineRule="auto"/>
+        <w:ind w:firstLine="0"/>
+        <w:rPr>
+          <w:b w:val="0"/>
+          <w:bCs w:val="0"/>
+        </w:rPr>
+      </w:pPr>
+      <w:r>
+        <w:rPr>
+          <w:b w:val="0"/>
+          <w:bCs w:val="0"/>
+          <w:rtl w:val="0"/>
+        </w:rPr>
+        <w:t xml:space="preserve">    id_plan        BIGSERIAL PRIMARY KEY,</w:t>
+      </w:r>
+    </w:p>
+    <w:p>
+      <w:pPr>
+        <w:pStyle w:val="Heading2"/>
+        <w:spacing w:before="0" w:lineRule="auto"/>
+        <w:ind w:firstLine="0"/>
+        <w:rPr>
+          <w:b w:val="0"/>
+          <w:bCs w:val="0"/>
+        </w:rPr>
+      </w:pPr>
+      <w:r>
+        <w:rPr>
+          <w:b w:val="0"/>
+          <w:bCs w:val="0"/>
+          <w:rtl w:val="0"/>
+        </w:rPr>
+        <w:t xml:space="preserve">    semana_inicio  DATE NOT NULL,</w:t>
+      </w:r>
+    </w:p>
+    <w:p>
+      <w:pPr>
+        <w:pStyle w:val="Heading2"/>
+        <w:spacing w:before="0" w:lineRule="auto"/>
+        <w:ind w:firstLine="0"/>
+        <w:rPr>
+          <w:b w:val="0"/>
+          <w:bCs w:val="0"/>
+        </w:rPr>
+      </w:pPr>
+      <w:r>
+        <w:rPr>
+          <w:b w:val="0"/>
+          <w:bCs w:val="0"/>
+          <w:rtl w:val="0"/>
+        </w:rPr>
+        <w:t xml:space="preserve">    nombre         VARCHAR(150) NOT NULL,</w:t>
+      </w:r>
+    </w:p>
+    <w:p>
+      <w:pPr>
+        <w:pStyle w:val="Heading2"/>
+        <w:spacing w:before="0" w:lineRule="auto"/>
+        <w:ind w:firstLine="0"/>
+        <w:rPr>
+          <w:b w:val="0"/>
+          <w:bCs w:val="0"/>
+        </w:rPr>
+      </w:pPr>
+      <w:r>
+        <w:rPr>
+          <w:b w:val="0"/>
+          <w:bCs w:val="0"/>
+          <w:rtl w:val="0"/>
+        </w:rPr>
+        <w:t xml:space="preserve">    estado         VARCHAR(30) NOT NULL DEFAULT 'ACTIVO',</w:t>
+      </w:r>
+    </w:p>
+    <w:p>
+      <w:pPr>
+        <w:pStyle w:val="Heading2"/>
+        <w:spacing w:before="0" w:lineRule="auto"/>
+        <w:ind w:firstLine="0"/>
+        <w:rPr>
+          <w:b w:val="0"/>
+          <w:bCs w:val="0"/>
+        </w:rPr>
+      </w:pPr>
+      <w:r>
+        <w:rPr>
+          <w:rtl w:val="0"/>
+        </w:rPr>
+      </w:r>
+    </w:p>
+    <w:p>
+      <w:pPr>
+        <w:pStyle w:val="Heading2"/>
+        <w:spacing w:before="0" w:lineRule="auto"/>
+        <w:ind w:firstLine="0"/>
+        <w:rPr>
+          <w:b w:val="0"/>
+          <w:bCs w:val="0"/>
+        </w:rPr>
+      </w:pPr>
+      <w:r>
+        <w:rPr>
+          <w:b w:val="0"/>
+          <w:bCs w:val="0"/>
+          <w:rtl w:val="0"/>
+        </w:rPr>
+        <w:t xml:space="preserve">    CONSTRAINT chk_plan_menu_estado</w:t>
+      </w:r>
+    </w:p>
+    <w:p>
+      <w:pPr>
+        <w:pStyle w:val="Heading2"/>
+        <w:spacing w:before="0" w:lineRule="auto"/>
+        <w:ind w:firstLine="0"/>
+        <w:rPr>
+          <w:b w:val="0"/>
+          <w:bCs w:val="0"/>
+        </w:rPr>
+      </w:pPr>
+      <w:r>
+        <w:rPr>
+          <w:b w:val="0"/>
+          <w:bCs w:val="0"/>
+          <w:rtl w:val="0"/>
+        </w:rPr>
+        <w:t xml:space="preserve">        CHECK (estado IN ('ACTIVO', 'BORRADOR', 'FINALIZADO', 'ARCHIVADO')),</w:t>
+      </w:r>
+    </w:p>
+    <w:p>
+      <w:pPr>
+        <w:pStyle w:val="Heading2"/>
+        <w:spacing w:before="0" w:lineRule="auto"/>
+        <w:ind w:firstLine="0"/>
+        <w:rPr>
+          <w:b w:val="0"/>
+          <w:bCs w:val="0"/>
+        </w:rPr>
+      </w:pPr>
+      <w:r>
+        <w:rPr>
+          <w:rtl w:val="0"/>
+        </w:rPr>
+      </w:r>
+    </w:p>
+    <w:p>
+      <w:pPr>
+        <w:pStyle w:val="Heading2"/>
+        <w:spacing w:before="0" w:lineRule="auto"/>
+        <w:ind w:firstLine="0"/>
+        <w:rPr>
+          <w:b w:val="0"/>
+          <w:bCs w:val="0"/>
+        </w:rPr>
+      </w:pPr>
+      <w:r>
+        <w:rPr>
+          <w:b w:val="0"/>
+          <w:bCs w:val="0"/>
+          <w:rtl w:val="0"/>
+        </w:rPr>
+        <w:t xml:space="preserve">    CONSTRAINT uq_plan_menu_semana</w:t>
+      </w:r>
+    </w:p>
+    <w:p>
+      <w:pPr>
+        <w:pStyle w:val="Heading2"/>
+        <w:spacing w:before="0" w:lineRule="auto"/>
+        <w:ind w:firstLine="0"/>
+        <w:rPr>
+          <w:b w:val="0"/>
+          <w:bCs w:val="0"/>
+        </w:rPr>
+      </w:pPr>
+      <w:r>
+        <w:rPr>
+          <w:b w:val="0"/>
+          <w:bCs w:val="0"/>
+          <w:rtl w:val="0"/>
+        </w:rPr>
+        <w:t xml:space="preserve">        UNIQUE (semana_inicio)</w:t>
+      </w:r>
+    </w:p>
+    <w:p>
+      <w:pPr>
+        <w:pStyle w:val="Heading2"/>
+        <w:spacing w:before="0" w:lineRule="auto"/>
+        <w:ind w:firstLine="0"/>
+        <w:rPr>
+          <w:b w:val="0"/>
+          <w:bCs w:val="0"/>
+        </w:rPr>
+      </w:pPr>
+      <w:r>
+        <w:rPr>
+          <w:b w:val="0"/>
+          <w:bCs w:val="0"/>
+          <w:rtl w:val="0"/>
+        </w:rPr>
+        <w:t xml:space="preserve">);</w:t>
+      </w:r>
+    </w:p>
+    <w:p>
+      <w:pPr>
+        <w:pStyle w:val="Heading2"/>
+        <w:spacing w:before="0" w:lineRule="auto"/>
+        <w:ind w:firstLine="0"/>
+        <w:rPr>
+          <w:b w:val="0"/>
+          <w:bCs w:val="0"/>
+        </w:rPr>
+      </w:pPr>
+      <w:r>
+        <w:rPr>
+          <w:rtl w:val="0"/>
+        </w:rPr>
+      </w:r>
+    </w:p>
+    <w:p>
+      <w:pPr>
+        <w:pStyle w:val="Heading2"/>
+        <w:spacing w:before="0" w:lineRule="auto"/>
+        <w:ind w:firstLine="0"/>
+        <w:rPr>
+          <w:b w:val="0"/>
+          <w:bCs w:val="0"/>
+        </w:rPr>
+      </w:pPr>
+      <w:r>
+        <w:rPr>
+          <w:rtl w:val="0"/>
+        </w:rPr>
+      </w:r>
+    </w:p>
+    <w:p>
+      <w:pPr>
+        <w:pStyle w:val="Heading2"/>
+        <w:spacing w:before="0" w:lineRule="auto"/>
+        <w:ind w:firstLine="0"/>
+        <w:rPr>
+          <w:b w:val="0"/>
+          <w:bCs w:val="0"/>
+        </w:rPr>
+      </w:pPr>
+      <w:r>
+        <w:rPr>
+          <w:b w:val="0"/>
+          <w:bCs w:val="0"/>
+          <w:rtl w:val="0"/>
+        </w:rPr>
+        <w:t xml:space="preserve">-- ============================================================</w:t>
+      </w:r>
+    </w:p>
+    <w:p>
+      <w:pPr>
+        <w:pStyle w:val="Heading2"/>
+        <w:spacing w:before="0" w:lineRule="auto"/>
+        <w:ind w:firstLine="0"/>
+        <w:rPr>
+          <w:b w:val="0"/>
+          <w:bCs w:val="0"/>
+        </w:rPr>
+      </w:pPr>
+      <w:r>
+        <w:rPr>
+          <w:b w:val="0"/>
+          <w:bCs w:val="0"/>
+          <w:rtl w:val="0"/>
+        </w:rPr>
+        <w:t xml:space="preserve">-- 2. RECETA</w:t>
+      </w:r>
+    </w:p>
+    <w:p>
+      <w:pPr>
+        <w:pStyle w:val="Heading2"/>
+        <w:spacing w:before="0" w:lineRule="auto"/>
+        <w:ind w:firstLine="0"/>
+        <w:rPr>
+          <w:b w:val="0"/>
+          <w:bCs w:val="0"/>
+        </w:rPr>
+      </w:pPr>
+      <w:r>
+        <w:rPr>
+          <w:b w:val="0"/>
+          <w:bCs w:val="0"/>
+          <w:rtl w:val="0"/>
+        </w:rPr>
+        <w:t xml:space="preserve">-- ============================================================</w:t>
+      </w:r>
+    </w:p>
+    <w:p>
+      <w:pPr>
+        <w:pStyle w:val="Heading2"/>
+        <w:spacing w:before="0" w:lineRule="auto"/>
+        <w:ind w:firstLine="0"/>
+        <w:rPr>
+          <w:b w:val="0"/>
+          <w:bCs w:val="0"/>
+        </w:rPr>
+      </w:pPr>
+      <w:r>
+        <w:rPr>
+          <w:b w:val="0"/>
+          <w:bCs w:val="0"/>
+          <w:rtl w:val="0"/>
+        </w:rPr>
+        <w:t xml:space="preserve">CREATE TABLE IF NOT EXISTS receta (</w:t>
+      </w:r>
+    </w:p>
+    <w:p>
+      <w:pPr>
+        <w:pStyle w:val="Heading2"/>
+        <w:spacing w:before="0" w:lineRule="auto"/>
+        <w:ind w:firstLine="0"/>
+        <w:rPr>
+          <w:b w:val="0"/>
+          <w:bCs w:val="0"/>
+        </w:rPr>
+      </w:pPr>
+      <w:r>
+        <w:rPr>
+          <w:b w:val="0"/>
+          <w:bCs w:val="0"/>
+          <w:rtl w:val="0"/>
+        </w:rPr>
+        <w:t xml:space="preserve">    id_receta      BIGSERIAL PRIMARY KEY,</w:t>
+      </w:r>
+    </w:p>
+    <w:p>
+      <w:pPr>
+        <w:pStyle w:val="Heading2"/>
+        <w:spacing w:before="0" w:lineRule="auto"/>
+        <w:ind w:firstLine="0"/>
+        <w:rPr>
+          <w:b w:val="0"/>
+          <w:bCs w:val="0"/>
+        </w:rPr>
+      </w:pPr>
+      <w:r>
+        <w:rPr>
+          <w:b w:val="0"/>
+          <w:bCs w:val="0"/>
+          <w:rtl w:val="0"/>
+        </w:rPr>
+        <w:t xml:space="preserve">    nombre         VARCHAR(150) NOT NULL,</w:t>
+      </w:r>
+    </w:p>
+    <w:p>
+      <w:pPr>
+        <w:pStyle w:val="Heading2"/>
+        <w:spacing w:before="0" w:lineRule="auto"/>
+        <w:ind w:firstLine="0"/>
+        <w:rPr>
+          <w:b w:val="0"/>
+          <w:bCs w:val="0"/>
+        </w:rPr>
+      </w:pPr>
+      <w:r>
+        <w:rPr>
+          <w:b w:val="0"/>
+          <w:bCs w:val="0"/>
+          <w:rtl w:val="0"/>
+        </w:rPr>
+        <w:t xml:space="preserve">    porciones      INTEGER NOT NULL DEFAULT 1,</w:t>
+      </w:r>
+    </w:p>
+    <w:p>
+      <w:pPr>
+        <w:pStyle w:val="Heading2"/>
+        <w:spacing w:before="0" w:lineRule="auto"/>
+        <w:ind w:firstLine="0"/>
+        <w:rPr>
+          <w:b w:val="0"/>
+          <w:bCs w:val="0"/>
+        </w:rPr>
+      </w:pPr>
+      <w:r>
+        <w:rPr>
+          <w:b w:val="0"/>
+          <w:bCs w:val="0"/>
+          <w:rtl w:val="0"/>
+        </w:rPr>
+        <w:t xml:space="preserve">    instrucciones  TEXT NOT NULL,</w:t>
+      </w:r>
+    </w:p>
+    <w:p>
+      <w:pPr>
+        <w:pStyle w:val="Heading2"/>
+        <w:spacing w:before="0" w:lineRule="auto"/>
+        <w:ind w:firstLine="0"/>
+        <w:rPr>
+          <w:b w:val="0"/>
+          <w:bCs w:val="0"/>
+        </w:rPr>
+      </w:pPr>
+      <w:r>
+        <w:rPr>
+          <w:rtl w:val="0"/>
+        </w:rPr>
+      </w:r>
+    </w:p>
+    <w:p>
+      <w:pPr>
+        <w:pStyle w:val="Heading2"/>
+        <w:spacing w:before="0" w:lineRule="auto"/>
+        <w:ind w:firstLine="0"/>
+        <w:rPr>
+          <w:b w:val="0"/>
+          <w:bCs w:val="0"/>
+        </w:rPr>
+      </w:pPr>
+      <w:r>
+        <w:rPr>
+          <w:b w:val="0"/>
+          <w:bCs w:val="0"/>
+          <w:rtl w:val="0"/>
+        </w:rPr>
+        <w:t xml:space="preserve">    CONSTRAINT chk_receta_porciones</w:t>
+      </w:r>
+    </w:p>
+    <w:p>
+      <w:pPr>
+        <w:pStyle w:val="Heading2"/>
+        <w:spacing w:before="0" w:lineRule="auto"/>
+        <w:ind w:firstLine="0"/>
+        <w:rPr>
+          <w:b w:val="0"/>
+          <w:bCs w:val="0"/>
+        </w:rPr>
+      </w:pPr>
+      <w:r>
+        <w:rPr>
+          <w:b w:val="0"/>
+          <w:bCs w:val="0"/>
+          <w:rtl w:val="0"/>
+        </w:rPr>
+        <w:t xml:space="preserve">        CHECK (porciones &gt; 0)</w:t>
+      </w:r>
+    </w:p>
+    <w:p>
+      <w:pPr>
+        <w:pStyle w:val="Heading2"/>
+        <w:spacing w:before="0" w:lineRule="auto"/>
+        <w:ind w:firstLine="0"/>
+        <w:rPr>
+          <w:b w:val="0"/>
+          <w:bCs w:val="0"/>
+        </w:rPr>
+      </w:pPr>
+      <w:r>
+        <w:rPr>
+          <w:b w:val="0"/>
+          <w:bCs w:val="0"/>
+          <w:rtl w:val="0"/>
+        </w:rPr>
+        <w:t xml:space="preserve">);</w:t>
+      </w:r>
+    </w:p>
+    <w:p>
+      <w:pPr>
+        <w:pStyle w:val="Heading2"/>
+        <w:spacing w:before="0" w:lineRule="auto"/>
+        <w:ind w:firstLine="0"/>
+        <w:rPr>
+          <w:b w:val="0"/>
+          <w:bCs w:val="0"/>
+        </w:rPr>
+      </w:pPr>
+      <w:r>
+        <w:rPr>
+          <w:rtl w:val="0"/>
+        </w:rPr>
+      </w:r>
+    </w:p>
+    <w:p>
+      <w:pPr>
+        <w:pStyle w:val="Heading2"/>
+        <w:spacing w:before="0" w:lineRule="auto"/>
+        <w:ind w:firstLine="0"/>
+        <w:rPr>
+          <w:b w:val="0"/>
+          <w:bCs w:val="0"/>
+        </w:rPr>
+      </w:pPr>
+      <w:r>
+        <w:rPr>
+          <w:rtl w:val="0"/>
+        </w:rPr>
+      </w:r>
+    </w:p>
+    <w:p>
+      <w:pPr>
+        <w:pStyle w:val="Heading2"/>
+        <w:spacing w:before="0" w:lineRule="auto"/>
+        <w:ind w:firstLine="0"/>
+        <w:rPr>
+          <w:b w:val="0"/>
+          <w:bCs w:val="0"/>
+        </w:rPr>
+      </w:pPr>
+      <w:r>
+        <w:rPr>
+          <w:b w:val="0"/>
+          <w:bCs w:val="0"/>
+          <w:rtl w:val="0"/>
+        </w:rPr>
+        <w:t xml:space="preserve">-- ============================================================</w:t>
+      </w:r>
+    </w:p>
+    <w:p>
+      <w:pPr>
+        <w:pStyle w:val="Heading2"/>
+        <w:spacing w:before="0" w:lineRule="auto"/>
+        <w:ind w:firstLine="0"/>
+        <w:rPr>
+          <w:b w:val="0"/>
+          <w:bCs w:val="0"/>
+        </w:rPr>
+      </w:pPr>
+      <w:r>
+        <w:rPr>
+          <w:b w:val="0"/>
+          <w:bCs w:val="0"/>
+          <w:rtl w:val="0"/>
+        </w:rPr>
+        <w:t xml:space="preserve">-- 3. INGREDIENTE</w:t>
+      </w:r>
+    </w:p>
+    <w:p>
+      <w:pPr>
+        <w:pStyle w:val="Heading2"/>
+        <w:spacing w:before="0" w:lineRule="auto"/>
+        <w:ind w:firstLine="0"/>
+        <w:rPr>
+          <w:b w:val="0"/>
+          <w:bCs w:val="0"/>
+        </w:rPr>
+      </w:pPr>
+      <w:r>
+        <w:rPr>
+          <w:b w:val="0"/>
+          <w:bCs w:val="0"/>
+          <w:rtl w:val="0"/>
+        </w:rPr>
+        <w:t xml:space="preserve">-- ============================================================</w:t>
+      </w:r>
+    </w:p>
+    <w:p>
+      <w:pPr>
+        <w:pStyle w:val="Heading2"/>
+        <w:spacing w:before="0" w:lineRule="auto"/>
+        <w:ind w:firstLine="0"/>
+        <w:rPr>
+          <w:b w:val="0"/>
+          <w:bCs w:val="0"/>
+        </w:rPr>
+      </w:pPr>
+      <w:r>
+        <w:rPr>
+          <w:b w:val="0"/>
+          <w:bCs w:val="0"/>
+          <w:rtl w:val="0"/>
+        </w:rPr>
+        <w:t xml:space="preserve">CREATE TABLE IF NOT EXISTS ingrediente (</w:t>
+      </w:r>
+    </w:p>
+    <w:p>
+      <w:pPr>
+        <w:pStyle w:val="Heading2"/>
+        <w:spacing w:before="0" w:lineRule="auto"/>
+        <w:ind w:firstLine="0"/>
+        <w:rPr>
+          <w:b w:val="0"/>
+          <w:bCs w:val="0"/>
+        </w:rPr>
+      </w:pPr>
+      <w:r>
+        <w:rPr>
+          <w:b w:val="0"/>
+          <w:bCs w:val="0"/>
+          <w:rtl w:val="0"/>
+        </w:rPr>
+        <w:t xml:space="preserve">    id_ingrediente      BIGSERIAL PRIMARY KEY,</w:t>
+      </w:r>
+    </w:p>
+    <w:p>
+      <w:pPr>
+        <w:pStyle w:val="Heading2"/>
+        <w:spacing w:before="0" w:lineRule="auto"/>
+        <w:ind w:firstLine="0"/>
+        <w:rPr>
+          <w:b w:val="0"/>
+          <w:bCs w:val="0"/>
+        </w:rPr>
+      </w:pPr>
+      <w:r>
+        <w:rPr>
+          <w:b w:val="0"/>
+          <w:bCs w:val="0"/>
+          <w:rtl w:val="0"/>
+        </w:rPr>
+        <w:t xml:space="preserve">    nombre              VARCHAR(150) NOT NULL,</w:t>
+      </w:r>
+    </w:p>
+    <w:p>
+      <w:pPr>
+        <w:pStyle w:val="Heading2"/>
+        <w:spacing w:before="0" w:lineRule="auto"/>
+        <w:ind w:firstLine="0"/>
+        <w:rPr>
+          <w:b w:val="0"/>
+          <w:bCs w:val="0"/>
+        </w:rPr>
+      </w:pPr>
+      <w:r>
+        <w:rPr>
+          <w:b w:val="0"/>
+          <w:bCs w:val="0"/>
+          <w:rtl w:val="0"/>
+        </w:rPr>
+        <w:t xml:space="preserve">    unidad_base         VARCHAR(30) NOT NULL,</w:t>
+      </w:r>
+    </w:p>
+    <w:p>
+      <w:pPr>
+        <w:pStyle w:val="Heading2"/>
+        <w:spacing w:before="0" w:lineRule="auto"/>
+        <w:ind w:firstLine="0"/>
+        <w:rPr>
+          <w:b w:val="0"/>
+          <w:bCs w:val="0"/>
+        </w:rPr>
+      </w:pPr>
+      <w:r>
+        <w:rPr>
+          <w:b w:val="0"/>
+          <w:bCs w:val="0"/>
+          <w:rtl w:val="0"/>
+        </w:rPr>
+        <w:t xml:space="preserve">    categoria           VARCHAR(80) NOT NULL,</w:t>
+      </w:r>
+    </w:p>
+    <w:p>
+      <w:pPr>
+        <w:pStyle w:val="Heading2"/>
+        <w:spacing w:before="0" w:lineRule="auto"/>
+        <w:ind w:firstLine="0"/>
+        <w:rPr>
+          <w:b w:val="0"/>
+          <w:bCs w:val="0"/>
+        </w:rPr>
+      </w:pPr>
+      <w:r>
+        <w:rPr>
+          <w:b w:val="0"/>
+          <w:bCs w:val="0"/>
+          <w:rtl w:val="0"/>
+        </w:rPr>
+        <w:t xml:space="preserve">    cantidad_despensa   NUMERIC(12,3) NOT NULL DEFAULT 0,</w:t>
+      </w:r>
+    </w:p>
+    <w:p>
+      <w:pPr>
+        <w:pStyle w:val="Heading2"/>
+        <w:spacing w:before="0" w:lineRule="auto"/>
+        <w:ind w:firstLine="0"/>
+        <w:rPr>
+          <w:b w:val="0"/>
+          <w:bCs w:val="0"/>
+        </w:rPr>
+      </w:pPr>
+      <w:r>
+        <w:rPr>
+          <w:rtl w:val="0"/>
+        </w:rPr>
+      </w:r>
+    </w:p>
+    <w:p>
+      <w:pPr>
+        <w:pStyle w:val="Heading2"/>
+        <w:spacing w:before="0" w:lineRule="auto"/>
+        <w:ind w:firstLine="0"/>
+        <w:rPr>
+          <w:b w:val="0"/>
+          <w:bCs w:val="0"/>
+        </w:rPr>
+      </w:pPr>
+      <w:r>
+        <w:rPr>
+          <w:b w:val="0"/>
+          <w:bCs w:val="0"/>
+          <w:rtl w:val="0"/>
+        </w:rPr>
+        <w:t xml:space="preserve">    CONSTRAINT chk_ingrediente_despensa</w:t>
+      </w:r>
+    </w:p>
+    <w:p>
+      <w:pPr>
+        <w:pStyle w:val="Heading2"/>
+        <w:spacing w:before="0" w:lineRule="auto"/>
+        <w:ind w:firstLine="0"/>
+        <w:rPr>
+          <w:b w:val="0"/>
+          <w:bCs w:val="0"/>
+        </w:rPr>
+      </w:pPr>
+      <w:r>
+        <w:rPr>
+          <w:b w:val="0"/>
+          <w:bCs w:val="0"/>
+          <w:rtl w:val="0"/>
+        </w:rPr>
+        <w:t xml:space="preserve">        CHECK (cantidad_despensa &gt;= 0),</w:t>
+      </w:r>
+    </w:p>
+    <w:p>
+      <w:pPr>
+        <w:pStyle w:val="Heading2"/>
+        <w:spacing w:before="0" w:lineRule="auto"/>
+        <w:ind w:firstLine="0"/>
+        <w:rPr>
+          <w:b w:val="0"/>
+          <w:bCs w:val="0"/>
+        </w:rPr>
+      </w:pPr>
+      <w:r>
+        <w:rPr>
+          <w:rtl w:val="0"/>
+        </w:rPr>
+      </w:r>
+    </w:p>
+    <w:p>
+      <w:pPr>
+        <w:pStyle w:val="Heading2"/>
+        <w:spacing w:before="0" w:lineRule="auto"/>
+        <w:ind w:firstLine="0"/>
+        <w:rPr>
+          <w:b w:val="0"/>
+          <w:bCs w:val="0"/>
+        </w:rPr>
+      </w:pPr>
+      <w:r>
+        <w:rPr>
+          <w:b w:val="0"/>
+          <w:bCs w:val="0"/>
+          <w:rtl w:val="0"/>
+        </w:rPr>
+        <w:t xml:space="preserve">    CONSTRAINT uq_ingrediente_nombre</w:t>
+      </w:r>
+    </w:p>
+    <w:p>
+      <w:pPr>
+        <w:pStyle w:val="Heading2"/>
+        <w:spacing w:before="0" w:lineRule="auto"/>
+        <w:ind w:firstLine="0"/>
+        <w:rPr>
+          <w:b w:val="0"/>
+          <w:bCs w:val="0"/>
+        </w:rPr>
+      </w:pPr>
+      <w:r>
+        <w:rPr>
+          <w:b w:val="0"/>
+          <w:bCs w:val="0"/>
+          <w:rtl w:val="0"/>
+        </w:rPr>
+        <w:t xml:space="preserve">        UNIQUE (nombre)</w:t>
+      </w:r>
+    </w:p>
+    <w:p>
+      <w:pPr>
+        <w:pStyle w:val="Heading2"/>
+        <w:spacing w:before="0" w:lineRule="auto"/>
+        <w:ind w:firstLine="0"/>
+        <w:rPr>
+          <w:b w:val="0"/>
+          <w:bCs w:val="0"/>
+        </w:rPr>
+      </w:pPr>
+      <w:r>
+        <w:rPr>
+          <w:b w:val="0"/>
+          <w:bCs w:val="0"/>
+          <w:rtl w:val="0"/>
+        </w:rPr>
+        <w:t xml:space="preserve">);</w:t>
+      </w:r>
+    </w:p>
+    <w:p>
+      <w:pPr>
+        <w:pStyle w:val="Heading2"/>
+        <w:spacing w:before="0" w:lineRule="auto"/>
+        <w:ind w:firstLine="0"/>
+        <w:rPr>
+          <w:b w:val="0"/>
+          <w:bCs w:val="0"/>
+        </w:rPr>
+      </w:pPr>
+      <w:r>
+        <w:rPr>
+          <w:rtl w:val="0"/>
+        </w:rPr>
+      </w:r>
+    </w:p>
+    <w:p>
+      <w:pPr>
+        <w:pStyle w:val="Heading2"/>
+        <w:spacing w:before="0" w:lineRule="auto"/>
+        <w:ind w:firstLine="0"/>
+        <w:rPr>
+          <w:b w:val="0"/>
+          <w:bCs w:val="0"/>
+        </w:rPr>
+      </w:pPr>
+      <w:r>
+        <w:rPr>
+          <w:rtl w:val="0"/>
+        </w:rPr>
+      </w:r>
+    </w:p>
+    <w:p>
+      <w:pPr>
+        <w:pStyle w:val="Heading2"/>
+        <w:spacing w:before="0" w:lineRule="auto"/>
+        <w:ind w:firstLine="0"/>
+        <w:rPr>
+          <w:b w:val="0"/>
+          <w:bCs w:val="0"/>
+        </w:rPr>
+      </w:pPr>
+      <w:r>
+        <w:rPr>
+          <w:b w:val="0"/>
+          <w:bCs w:val="0"/>
+          <w:rtl w:val="0"/>
+        </w:rPr>
+        <w:t xml:space="preserve">-- ============================================================</w:t>
+      </w:r>
+    </w:p>
+    <w:p>
+      <w:pPr>
+        <w:pStyle w:val="Heading2"/>
+        <w:spacing w:before="0" w:lineRule="auto"/>
+        <w:ind w:firstLine="0"/>
+        <w:rPr>
+          <w:b w:val="0"/>
+          <w:bCs w:val="0"/>
+        </w:rPr>
+      </w:pPr>
+      <w:r>
+        <w:rPr>
+          <w:b w:val="0"/>
+          <w:bCs w:val="0"/>
+          <w:rtl w:val="0"/>
+        </w:rPr>
+        <w:t xml:space="preserve">-- 4. MENU_ITEM</w:t>
+      </w:r>
+    </w:p>
+    <w:p>
+      <w:pPr>
+        <w:pStyle w:val="Heading2"/>
+        <w:spacing w:before="0" w:lineRule="auto"/>
+        <w:ind w:firstLine="0"/>
+        <w:rPr>
+          <w:b w:val="0"/>
+          <w:bCs w:val="0"/>
+        </w:rPr>
+      </w:pPr>
+      <w:r>
+        <w:rPr>
+          <w:b w:val="0"/>
+          <w:bCs w:val="0"/>
+          <w:rtl w:val="0"/>
+        </w:rPr>
+        <w:t xml:space="preserve">-- ============================================================</w:t>
+      </w:r>
+    </w:p>
+    <w:p>
+      <w:pPr>
+        <w:pStyle w:val="Heading2"/>
+        <w:spacing w:before="0" w:lineRule="auto"/>
+        <w:ind w:firstLine="0"/>
+        <w:rPr>
+          <w:b w:val="0"/>
+          <w:bCs w:val="0"/>
+        </w:rPr>
+      </w:pPr>
+      <w:r>
+        <w:rPr>
+          <w:b w:val="0"/>
+          <w:bCs w:val="0"/>
+          <w:rtl w:val="0"/>
+        </w:rPr>
+        <w:t xml:space="preserve">CREATE TABLE IF NOT EXISTS menu_item (</w:t>
+      </w:r>
+    </w:p>
+    <w:p>
+      <w:pPr>
+        <w:pStyle w:val="Heading2"/>
+        <w:spacing w:before="0" w:lineRule="auto"/>
+        <w:ind w:firstLine="0"/>
+        <w:rPr>
+          <w:b w:val="0"/>
+          <w:bCs w:val="0"/>
+        </w:rPr>
+      </w:pPr>
+      <w:r>
+        <w:rPr>
+          <w:b w:val="0"/>
+          <w:bCs w:val="0"/>
+          <w:rtl w:val="0"/>
+        </w:rPr>
+        <w:t xml:space="preserve">    id_item       BIGSERIAL PRIMARY KEY,</w:t>
+      </w:r>
+    </w:p>
+    <w:p>
+      <w:pPr>
+        <w:pStyle w:val="Heading2"/>
+        <w:spacing w:before="0" w:lineRule="auto"/>
+        <w:ind w:firstLine="0"/>
+        <w:rPr>
+          <w:b w:val="0"/>
+          <w:bCs w:val="0"/>
+        </w:rPr>
+      </w:pPr>
+      <w:r>
+        <w:rPr>
+          <w:b w:val="0"/>
+          <w:bCs w:val="0"/>
+          <w:rtl w:val="0"/>
+        </w:rPr>
+        <w:t xml:space="preserve">    id_plan       BIGINT NOT NULL,</w:t>
+      </w:r>
+    </w:p>
+    <w:p>
+      <w:pPr>
+        <w:pStyle w:val="Heading2"/>
+        <w:spacing w:before="0" w:lineRule="auto"/>
+        <w:ind w:firstLine="0"/>
+        <w:rPr>
+          <w:b w:val="0"/>
+          <w:bCs w:val="0"/>
+        </w:rPr>
+      </w:pPr>
+      <w:r>
+        <w:rPr>
+          <w:b w:val="0"/>
+          <w:bCs w:val="0"/>
+          <w:rtl w:val="0"/>
+        </w:rPr>
+        <w:t xml:space="preserve">    id_receta     BIGINT NOT NULL,</w:t>
+      </w:r>
+    </w:p>
+    <w:p>
+      <w:pPr>
+        <w:pStyle w:val="Heading2"/>
+        <w:spacing w:before="0" w:lineRule="auto"/>
+        <w:ind w:firstLine="0"/>
+        <w:rPr>
+          <w:b w:val="0"/>
+          <w:bCs w:val="0"/>
+        </w:rPr>
+      </w:pPr>
+      <w:r>
+        <w:rPr>
+          <w:b w:val="0"/>
+          <w:bCs w:val="0"/>
+          <w:rtl w:val="0"/>
+        </w:rPr>
+        <w:t xml:space="preserve">    dia_semana    SMALLINT NOT NULL,</w:t>
+      </w:r>
+    </w:p>
+    <w:p>
+      <w:pPr>
+        <w:pStyle w:val="Heading2"/>
+        <w:spacing w:before="0" w:lineRule="auto"/>
+        <w:ind w:firstLine="0"/>
+        <w:rPr>
+          <w:b w:val="0"/>
+          <w:bCs w:val="0"/>
+        </w:rPr>
+      </w:pPr>
+      <w:r>
+        <w:rPr>
+          <w:b w:val="0"/>
+          <w:bCs w:val="0"/>
+          <w:rtl w:val="0"/>
+        </w:rPr>
+        <w:t xml:space="preserve">    tipo_comida   VARCHAR(30) NOT NULL,</w:t>
+      </w:r>
+    </w:p>
+    <w:p>
+      <w:pPr>
+        <w:pStyle w:val="Heading2"/>
+        <w:spacing w:before="0" w:lineRule="auto"/>
+        <w:ind w:firstLine="0"/>
+        <w:rPr>
+          <w:b w:val="0"/>
+          <w:bCs w:val="0"/>
+        </w:rPr>
+      </w:pPr>
+      <w:r>
+        <w:rPr>
+          <w:b w:val="0"/>
+          <w:bCs w:val="0"/>
+          <w:rtl w:val="0"/>
+        </w:rPr>
+        <w:t xml:space="preserve">    posicion      INTEGER NOT NULL DEFAULT 0,</w:t>
+      </w:r>
+    </w:p>
+    <w:p>
+      <w:pPr>
+        <w:pStyle w:val="Heading2"/>
+        <w:spacing w:before="0" w:lineRule="auto"/>
+        <w:ind w:firstLine="0"/>
+        <w:rPr>
+          <w:b w:val="0"/>
+          <w:bCs w:val="0"/>
+        </w:rPr>
+      </w:pPr>
+      <w:r>
+        <w:rPr>
+          <w:rtl w:val="0"/>
+        </w:rPr>
+      </w:r>
+    </w:p>
+    <w:p>
+      <w:pPr>
+        <w:pStyle w:val="Heading2"/>
+        <w:spacing w:before="0" w:lineRule="auto"/>
+        <w:ind w:firstLine="0"/>
+        <w:rPr>
+          <w:b w:val="0"/>
+          <w:bCs w:val="0"/>
+        </w:rPr>
+      </w:pPr>
+      <w:r>
+        <w:rPr>
+          <w:b w:val="0"/>
+          <w:bCs w:val="0"/>
+          <w:rtl w:val="0"/>
+        </w:rPr>
+        <w:t xml:space="preserve">    CONSTRAINT fk_menu_item_plan</w:t>
+      </w:r>
+    </w:p>
+    <w:p>
+      <w:pPr>
+        <w:pStyle w:val="Heading2"/>
+        <w:spacing w:before="0" w:lineRule="auto"/>
+        <w:ind w:firstLine="0"/>
+        <w:rPr>
+          <w:b w:val="0"/>
+          <w:bCs w:val="0"/>
+        </w:rPr>
+      </w:pPr>
+      <w:r>
+        <w:rPr>
+          <w:b w:val="0"/>
+          <w:bCs w:val="0"/>
+          <w:rtl w:val="0"/>
+        </w:rPr>
+        <w:t xml:space="preserve">        FOREIGN KEY (id_plan)</w:t>
+      </w:r>
+    </w:p>
+    <w:p>
+      <w:pPr>
+        <w:pStyle w:val="Heading2"/>
+        <w:spacing w:before="0" w:lineRule="auto"/>
+        <w:ind w:firstLine="0"/>
+        <w:rPr>
+          <w:b w:val="0"/>
+          <w:bCs w:val="0"/>
+        </w:rPr>
+      </w:pPr>
+      <w:r>
+        <w:rPr>
+          <w:b w:val="0"/>
+          <w:bCs w:val="0"/>
+          <w:rtl w:val="0"/>
+        </w:rPr>
+        <w:t xml:space="preserve">        REFERENCES plan_menu (id_plan)</w:t>
+      </w:r>
+    </w:p>
+    <w:p>
+      <w:pPr>
+        <w:pStyle w:val="Heading2"/>
+        <w:spacing w:before="0" w:lineRule="auto"/>
+        <w:ind w:firstLine="0"/>
+        <w:rPr>
+          <w:b w:val="0"/>
+          <w:bCs w:val="0"/>
+        </w:rPr>
+      </w:pPr>
+      <w:r>
+        <w:rPr>
+          <w:b w:val="0"/>
+          <w:bCs w:val="0"/>
+          <w:rtl w:val="0"/>
+        </w:rPr>
+        <w:t xml:space="preserve">        ON DELETE CASCADE,</w:t>
+      </w:r>
+    </w:p>
+    <w:p>
+      <w:pPr>
+        <w:pStyle w:val="Heading2"/>
+        <w:spacing w:before="0" w:lineRule="auto"/>
+        <w:ind w:firstLine="0"/>
+        <w:rPr>
+          <w:b w:val="0"/>
+          <w:bCs w:val="0"/>
+        </w:rPr>
+      </w:pPr>
+      <w:r>
+        <w:rPr>
+          <w:rtl w:val="0"/>
+        </w:rPr>
+      </w:r>
+    </w:p>
+    <w:p>
+      <w:pPr>
+        <w:pStyle w:val="Heading2"/>
+        <w:spacing w:before="0" w:lineRule="auto"/>
+        <w:ind w:firstLine="0"/>
+        <w:rPr>
+          <w:b w:val="0"/>
+          <w:bCs w:val="0"/>
+        </w:rPr>
+      </w:pPr>
+      <w:r>
+        <w:rPr>
+          <w:b w:val="0"/>
+          <w:bCs w:val="0"/>
+          <w:rtl w:val="0"/>
+        </w:rPr>
+        <w:t xml:space="preserve">    CONSTRAINT fk_menu_item_receta</w:t>
+      </w:r>
+    </w:p>
+    <w:p>
+      <w:pPr>
+        <w:pStyle w:val="Heading2"/>
+        <w:spacing w:before="0" w:lineRule="auto"/>
+        <w:ind w:firstLine="0"/>
+        <w:rPr>
+          <w:b w:val="0"/>
+          <w:bCs w:val="0"/>
+        </w:rPr>
+      </w:pPr>
+      <w:r>
+        <w:rPr>
+          <w:b w:val="0"/>
+          <w:bCs w:val="0"/>
+          <w:rtl w:val="0"/>
+        </w:rPr>
+        <w:t xml:space="preserve">        FOREIGN KEY (id_receta)</w:t>
+      </w:r>
+    </w:p>
+    <w:p>
+      <w:pPr>
+        <w:pStyle w:val="Heading2"/>
+        <w:spacing w:before="0" w:lineRule="auto"/>
+        <w:ind w:firstLine="0"/>
+        <w:rPr>
+          <w:b w:val="0"/>
+          <w:bCs w:val="0"/>
+        </w:rPr>
+      </w:pPr>
+      <w:r>
+        <w:rPr>
+          <w:b w:val="0"/>
+          <w:bCs w:val="0"/>
+          <w:rtl w:val="0"/>
+        </w:rPr>
+        <w:t xml:space="preserve">        REFERENCES receta (id_receta)</w:t>
+      </w:r>
+    </w:p>
+    <w:p>
+      <w:pPr>
+        <w:pStyle w:val="Heading2"/>
+        <w:spacing w:before="0" w:lineRule="auto"/>
+        <w:ind w:firstLine="0"/>
+        <w:rPr>
+          <w:b w:val="0"/>
+          <w:bCs w:val="0"/>
+        </w:rPr>
+      </w:pPr>
+      <w:r>
+        <w:rPr>
+          <w:b w:val="0"/>
+          <w:bCs w:val="0"/>
+          <w:rtl w:val="0"/>
+        </w:rPr>
+        <w:t xml:space="preserve">        ON DELETE RESTRICT,</w:t>
+      </w:r>
+    </w:p>
+    <w:p>
+      <w:pPr>
+        <w:pStyle w:val="Heading2"/>
+        <w:spacing w:before="0" w:lineRule="auto"/>
+        <w:ind w:firstLine="0"/>
+        <w:rPr>
+          <w:b w:val="0"/>
+          <w:bCs w:val="0"/>
+        </w:rPr>
+      </w:pPr>
+      <w:r>
+        <w:rPr>
+          <w:rtl w:val="0"/>
+        </w:rPr>
+      </w:r>
+    </w:p>
+    <w:p>
+      <w:pPr>
+        <w:pStyle w:val="Heading2"/>
+        <w:spacing w:before="0" w:lineRule="auto"/>
+        <w:ind w:firstLine="0"/>
+        <w:rPr>
+          <w:b w:val="0"/>
+          <w:bCs w:val="0"/>
+        </w:rPr>
+      </w:pPr>
+      <w:r>
+        <w:rPr>
+          <w:b w:val="0"/>
+          <w:bCs w:val="0"/>
+          <w:rtl w:val="0"/>
+        </w:rPr>
+        <w:t xml:space="preserve">    CONSTRAINT chk_menu_item_dia</w:t>
+      </w:r>
+    </w:p>
+    <w:p>
+      <w:pPr>
+        <w:pStyle w:val="Heading2"/>
+        <w:spacing w:before="0" w:lineRule="auto"/>
+        <w:ind w:firstLine="0"/>
+        <w:rPr>
+          <w:b w:val="0"/>
+          <w:bCs w:val="0"/>
+        </w:rPr>
+      </w:pPr>
+      <w:r>
+        <w:rPr>
+          <w:b w:val="0"/>
+          <w:bCs w:val="0"/>
+          <w:rtl w:val="0"/>
+        </w:rPr>
+        <w:t xml:space="preserve">        CHECK (dia_semana BETWEEN 1 AND 7),</w:t>
+      </w:r>
+    </w:p>
+    <w:p>
+      <w:pPr>
+        <w:pStyle w:val="Heading2"/>
+        <w:spacing w:before="0" w:lineRule="auto"/>
+        <w:ind w:firstLine="0"/>
+        <w:rPr>
+          <w:b w:val="0"/>
+          <w:bCs w:val="0"/>
+        </w:rPr>
+      </w:pPr>
+      <w:r>
+        <w:rPr>
+          <w:rtl w:val="0"/>
+        </w:rPr>
+      </w:r>
+    </w:p>
+    <w:p>
+      <w:pPr>
+        <w:pStyle w:val="Heading2"/>
+        <w:spacing w:before="0" w:lineRule="auto"/>
+        <w:ind w:firstLine="0"/>
+        <w:rPr>
+          <w:b w:val="0"/>
+          <w:bCs w:val="0"/>
+        </w:rPr>
+      </w:pPr>
+      <w:r>
+        <w:rPr>
+          <w:b w:val="0"/>
+          <w:bCs w:val="0"/>
+          <w:rtl w:val="0"/>
+        </w:rPr>
+        <w:t xml:space="preserve">    CONSTRAINT chk_menu_item_posicion</w:t>
+      </w:r>
+    </w:p>
+    <w:p>
+      <w:pPr>
+        <w:pStyle w:val="Heading2"/>
+        <w:spacing w:before="0" w:lineRule="auto"/>
+        <w:ind w:firstLine="0"/>
+        <w:rPr>
+          <w:b w:val="0"/>
+          <w:bCs w:val="0"/>
+        </w:rPr>
+      </w:pPr>
+      <w:r>
+        <w:rPr>
+          <w:b w:val="0"/>
+          <w:bCs w:val="0"/>
+          <w:rtl w:val="0"/>
+        </w:rPr>
+        <w:t xml:space="preserve">        CHECK (posicion &gt;= 0),</w:t>
+      </w:r>
+    </w:p>
+    <w:p>
+      <w:pPr>
+        <w:pStyle w:val="Heading2"/>
+        <w:spacing w:before="0" w:lineRule="auto"/>
+        <w:ind w:firstLine="0"/>
+        <w:rPr>
+          <w:b w:val="0"/>
+          <w:bCs w:val="0"/>
+        </w:rPr>
+      </w:pPr>
+      <w:r>
+        <w:rPr>
+          <w:rtl w:val="0"/>
+        </w:rPr>
+      </w:r>
+    </w:p>
+    <w:p>
+      <w:pPr>
+        <w:pStyle w:val="Heading2"/>
+        <w:spacing w:before="0" w:lineRule="auto"/>
+        <w:ind w:firstLine="0"/>
+        <w:rPr>
+          <w:b w:val="0"/>
+          <w:bCs w:val="0"/>
+        </w:rPr>
+      </w:pPr>
+      <w:r>
+        <w:rPr>
+          <w:b w:val="0"/>
+          <w:bCs w:val="0"/>
+          <w:rtl w:val="0"/>
+        </w:rPr>
+        <w:t xml:space="preserve">    CONSTRAINT chk_menu_item_tipo_comida</w:t>
+      </w:r>
+    </w:p>
+    <w:p>
+      <w:pPr>
+        <w:pStyle w:val="Heading2"/>
+        <w:spacing w:before="0" w:lineRule="auto"/>
+        <w:ind w:firstLine="0"/>
+        <w:rPr>
+          <w:b w:val="0"/>
+          <w:bCs w:val="0"/>
+        </w:rPr>
+      </w:pPr>
+      <w:r>
+        <w:rPr>
+          <w:b w:val="0"/>
+          <w:bCs w:val="0"/>
+          <w:rtl w:val="0"/>
+        </w:rPr>
+        <w:t xml:space="preserve">        CHECK (</w:t>
+      </w:r>
+    </w:p>
+    <w:p>
+      <w:pPr>
+        <w:pStyle w:val="Heading2"/>
+        <w:spacing w:before="0" w:lineRule="auto"/>
+        <w:ind w:firstLine="0"/>
+        <w:rPr>
+          <w:b w:val="0"/>
+          <w:bCs w:val="0"/>
+        </w:rPr>
+      </w:pPr>
+      <w:r>
+        <w:rPr>
+          <w:b w:val="0"/>
+          <w:bCs w:val="0"/>
+          <w:rtl w:val="0"/>
+        </w:rPr>
+        <w:t xml:space="preserve">            tipo_comida IN (</w:t>
+      </w:r>
+    </w:p>
+    <w:p>
+      <w:pPr>
+        <w:pStyle w:val="Heading2"/>
+        <w:spacing w:before="0" w:lineRule="auto"/>
+        <w:ind w:firstLine="0"/>
+        <w:rPr>
+          <w:b w:val="0"/>
+          <w:bCs w:val="0"/>
+        </w:rPr>
+      </w:pPr>
+      <w:r>
+        <w:rPr>
+          <w:b w:val="0"/>
+          <w:bCs w:val="0"/>
+          <w:rtl w:val="0"/>
+        </w:rPr>
+        <w:t xml:space="preserve">                'DESAYUNO',</w:t>
+      </w:r>
+    </w:p>
+    <w:p>
+      <w:pPr>
+        <w:pStyle w:val="Heading2"/>
+        <w:spacing w:before="0" w:lineRule="auto"/>
+        <w:ind w:firstLine="0"/>
+        <w:rPr>
+          <w:b w:val="0"/>
+          <w:bCs w:val="0"/>
+        </w:rPr>
+      </w:pPr>
+      <w:r>
+        <w:rPr>
+          <w:b w:val="0"/>
+          <w:bCs w:val="0"/>
+          <w:rtl w:val="0"/>
+        </w:rPr>
+        <w:t xml:space="preserve">                'ALMUERZO',</w:t>
+      </w:r>
+    </w:p>
+    <w:p>
+      <w:pPr>
+        <w:pStyle w:val="Heading2"/>
+        <w:spacing w:before="0" w:lineRule="auto"/>
+        <w:ind w:firstLine="0"/>
+        <w:rPr>
+          <w:b w:val="0"/>
+          <w:bCs w:val="0"/>
+        </w:rPr>
+      </w:pPr>
+      <w:r>
+        <w:rPr>
+          <w:b w:val="0"/>
+          <w:bCs w:val="0"/>
+          <w:rtl w:val="0"/>
+        </w:rPr>
+        <w:t xml:space="preserve">                'CENA',</w:t>
+      </w:r>
+    </w:p>
+    <w:p>
+      <w:pPr>
+        <w:pStyle w:val="Heading2"/>
+        <w:spacing w:before="0" w:lineRule="auto"/>
+        <w:ind w:firstLine="0"/>
+        <w:rPr>
+          <w:b w:val="0"/>
+          <w:bCs w:val="0"/>
+        </w:rPr>
+      </w:pPr>
+      <w:r>
+        <w:rPr>
+          <w:b w:val="0"/>
+          <w:bCs w:val="0"/>
+          <w:rtl w:val="0"/>
+        </w:rPr>
+        <w:t xml:space="preserve">                'MERIENDA'</w:t>
+      </w:r>
+    </w:p>
+    <w:p>
+      <w:pPr>
+        <w:pStyle w:val="Heading2"/>
+        <w:spacing w:before="0" w:lineRule="auto"/>
+        <w:ind w:firstLine="0"/>
+        <w:rPr>
+          <w:b w:val="0"/>
+          <w:bCs w:val="0"/>
+        </w:rPr>
+      </w:pPr>
+      <w:r>
+        <w:rPr>
+          <w:b w:val="0"/>
+          <w:bCs w:val="0"/>
+          <w:rtl w:val="0"/>
+        </w:rPr>
+        <w:t xml:space="preserve">            )</w:t>
+      </w:r>
+    </w:p>
+    <w:p>
+      <w:pPr>
+        <w:pStyle w:val="Heading2"/>
+        <w:spacing w:before="0" w:lineRule="auto"/>
+        <w:ind w:firstLine="0"/>
+        <w:rPr>
+          <w:b w:val="0"/>
+          <w:bCs w:val="0"/>
+        </w:rPr>
+      </w:pPr>
+      <w:r>
+        <w:rPr>
+          <w:b w:val="0"/>
+          <w:bCs w:val="0"/>
+          <w:rtl w:val="0"/>
+        </w:rPr>
+        <w:t xml:space="preserve">        ),</w:t>
+      </w:r>
+    </w:p>
+    <w:p>
+      <w:pPr>
+        <w:pStyle w:val="Heading2"/>
+        <w:spacing w:before="0" w:lineRule="auto"/>
+        <w:ind w:firstLine="0"/>
+        <w:rPr>
+          <w:b w:val="0"/>
+          <w:bCs w:val="0"/>
+        </w:rPr>
+      </w:pPr>
+      <w:r>
+        <w:rPr>
+          <w:rtl w:val="0"/>
+        </w:rPr>
+      </w:r>
+    </w:p>
+    <w:p>
+      <w:pPr>
+        <w:pStyle w:val="Heading2"/>
+        <w:spacing w:before="0" w:lineRule="auto"/>
+        <w:ind w:firstLine="0"/>
+        <w:rPr>
+          <w:b w:val="0"/>
+          <w:bCs w:val="0"/>
+        </w:rPr>
+      </w:pPr>
+      <w:r>
+        <w:rPr>
+          <w:b w:val="0"/>
+          <w:bCs w:val="0"/>
+          <w:rtl w:val="0"/>
+        </w:rPr>
+        <w:t xml:space="preserve">    CONSTRAINT uq_menu_item_slot</w:t>
+      </w:r>
+    </w:p>
+    <w:p>
+      <w:pPr>
+        <w:pStyle w:val="Heading2"/>
+        <w:spacing w:before="0" w:lineRule="auto"/>
+        <w:ind w:firstLine="0"/>
+        <w:rPr>
+          <w:b w:val="0"/>
+          <w:bCs w:val="0"/>
+        </w:rPr>
+      </w:pPr>
+      <w:r>
+        <w:rPr>
+          <w:b w:val="0"/>
+          <w:bCs w:val="0"/>
+          <w:rtl w:val="0"/>
+        </w:rPr>
+        <w:t xml:space="preserve">        UNIQUE (</w:t>
+      </w:r>
+    </w:p>
+    <w:p>
+      <w:pPr>
+        <w:pStyle w:val="Heading2"/>
+        <w:spacing w:before="0" w:lineRule="auto"/>
+        <w:ind w:firstLine="0"/>
+        <w:rPr>
+          <w:b w:val="0"/>
+          <w:bCs w:val="0"/>
+        </w:rPr>
+      </w:pPr>
+      <w:r>
+        <w:rPr>
+          <w:b w:val="0"/>
+          <w:bCs w:val="0"/>
+          <w:rtl w:val="0"/>
+        </w:rPr>
+        <w:t xml:space="preserve">            id_plan,</w:t>
+      </w:r>
+    </w:p>
+    <w:p>
+      <w:pPr>
+        <w:pStyle w:val="Heading2"/>
+        <w:spacing w:before="0" w:lineRule="auto"/>
+        <w:ind w:firstLine="0"/>
+        <w:rPr>
+          <w:b w:val="0"/>
+          <w:bCs w:val="0"/>
+        </w:rPr>
+      </w:pPr>
+      <w:r>
+        <w:rPr>
+          <w:b w:val="0"/>
+          <w:bCs w:val="0"/>
+          <w:rtl w:val="0"/>
+        </w:rPr>
+        <w:t xml:space="preserve">            dia_semana,</w:t>
+      </w:r>
+    </w:p>
+    <w:p>
+      <w:pPr>
+        <w:pStyle w:val="Heading2"/>
+        <w:spacing w:before="0" w:lineRule="auto"/>
+        <w:ind w:firstLine="0"/>
+        <w:rPr>
+          <w:b w:val="0"/>
+          <w:bCs w:val="0"/>
+        </w:rPr>
+      </w:pPr>
+      <w:r>
+        <w:rPr>
+          <w:b w:val="0"/>
+          <w:bCs w:val="0"/>
+          <w:rtl w:val="0"/>
+        </w:rPr>
+        <w:t xml:space="preserve">            tipo_comida,</w:t>
+      </w:r>
+    </w:p>
+    <w:p>
+      <w:pPr>
+        <w:pStyle w:val="Heading2"/>
+        <w:spacing w:before="0" w:lineRule="auto"/>
+        <w:ind w:firstLine="0"/>
+        <w:rPr>
+          <w:b w:val="0"/>
+          <w:bCs w:val="0"/>
+        </w:rPr>
+      </w:pPr>
+      <w:r>
+        <w:rPr>
+          <w:b w:val="0"/>
+          <w:bCs w:val="0"/>
+          <w:rtl w:val="0"/>
+        </w:rPr>
+        <w:t xml:space="preserve">            posicion</w:t>
+      </w:r>
+    </w:p>
+    <w:p>
+      <w:pPr>
+        <w:pStyle w:val="Heading2"/>
+        <w:spacing w:before="0" w:lineRule="auto"/>
+        <w:ind w:firstLine="0"/>
+        <w:rPr>
+          <w:b w:val="0"/>
+          <w:bCs w:val="0"/>
+        </w:rPr>
+      </w:pPr>
+      <w:r>
+        <w:rPr>
+          <w:b w:val="0"/>
+          <w:bCs w:val="0"/>
+          <w:rtl w:val="0"/>
+        </w:rPr>
+        <w:t xml:space="preserve">        )</w:t>
+      </w:r>
+    </w:p>
+    <w:p>
+      <w:pPr>
+        <w:pStyle w:val="Heading2"/>
+        <w:spacing w:before="0" w:lineRule="auto"/>
+        <w:ind w:firstLine="0"/>
+        <w:rPr>
+          <w:b w:val="0"/>
+          <w:bCs w:val="0"/>
+        </w:rPr>
+      </w:pPr>
+      <w:r>
+        <w:rPr>
+          <w:b w:val="0"/>
+          <w:bCs w:val="0"/>
+          <w:rtl w:val="0"/>
+        </w:rPr>
+        <w:t xml:space="preserve">);</w:t>
+      </w:r>
+    </w:p>
+    <w:p>
+      <w:pPr>
+        <w:pStyle w:val="Heading2"/>
+        <w:spacing w:before="0" w:lineRule="auto"/>
+        <w:ind w:firstLine="0"/>
+        <w:rPr>
+          <w:b w:val="0"/>
+          <w:bCs w:val="0"/>
+        </w:rPr>
+      </w:pPr>
+      <w:r>
+        <w:rPr>
+          <w:rtl w:val="0"/>
+        </w:rPr>
+      </w:r>
+    </w:p>
+    <w:p>
+      <w:pPr>
+        <w:pStyle w:val="Heading2"/>
+        <w:spacing w:before="0" w:lineRule="auto"/>
+        <w:ind w:firstLine="0"/>
+        <w:rPr>
+          <w:b w:val="0"/>
+          <w:bCs w:val="0"/>
+        </w:rPr>
+      </w:pPr>
+      <w:r>
+        <w:rPr>
+          <w:rtl w:val="0"/>
+        </w:rPr>
+      </w:r>
+    </w:p>
+    <w:p>
+      <w:pPr>
+        <w:pStyle w:val="Heading2"/>
+        <w:spacing w:before="0" w:lineRule="auto"/>
+        <w:ind w:firstLine="0"/>
+        <w:rPr>
+          <w:b w:val="0"/>
+          <w:bCs w:val="0"/>
+        </w:rPr>
+      </w:pPr>
+      <w:r>
+        <w:rPr>
+          <w:b w:val="0"/>
+          <w:bCs w:val="0"/>
+          <w:rtl w:val="0"/>
+        </w:rPr>
+        <w:t xml:space="preserve">-- ============================================================</w:t>
+      </w:r>
+    </w:p>
+    <w:p>
+      <w:pPr>
+        <w:pStyle w:val="Heading2"/>
+        <w:spacing w:before="0" w:lineRule="auto"/>
+        <w:ind w:firstLine="0"/>
+        <w:rPr>
+          <w:b w:val="0"/>
+          <w:bCs w:val="0"/>
+        </w:rPr>
+      </w:pPr>
+      <w:r>
+        <w:rPr>
+          <w:b w:val="0"/>
+          <w:bCs w:val="0"/>
+          <w:rtl w:val="0"/>
+        </w:rPr>
+        <w:t xml:space="preserve">-- 5. RECETA_INGREDIENTE</w:t>
+      </w:r>
+    </w:p>
+    <w:p>
+      <w:pPr>
+        <w:pStyle w:val="Heading2"/>
+        <w:spacing w:before="0" w:lineRule="auto"/>
+        <w:ind w:firstLine="0"/>
+        <w:rPr>
+          <w:b w:val="0"/>
+          <w:bCs w:val="0"/>
+        </w:rPr>
+      </w:pPr>
+      <w:r>
+        <w:rPr>
+          <w:b w:val="0"/>
+          <w:bCs w:val="0"/>
+          <w:rtl w:val="0"/>
+        </w:rPr>
+        <w:t xml:space="preserve">-- ============================================================</w:t>
+      </w:r>
+    </w:p>
+    <w:p>
+      <w:pPr>
+        <w:pStyle w:val="Heading2"/>
+        <w:spacing w:before="0" w:lineRule="auto"/>
+        <w:ind w:firstLine="0"/>
+        <w:rPr>
+          <w:b w:val="0"/>
+          <w:bCs w:val="0"/>
+        </w:rPr>
+      </w:pPr>
+      <w:r>
+        <w:rPr>
+          <w:b w:val="0"/>
+          <w:bCs w:val="0"/>
+          <w:rtl w:val="0"/>
+        </w:rPr>
+        <w:t xml:space="preserve">CREATE TABLE IF NOT EXISTS receta_ingrediente (</w:t>
+      </w:r>
+    </w:p>
+    <w:p>
+      <w:pPr>
+        <w:pStyle w:val="Heading2"/>
+        <w:spacing w:before="0" w:lineRule="auto"/>
+        <w:ind w:firstLine="0"/>
+        <w:rPr>
+          <w:b w:val="0"/>
+          <w:bCs w:val="0"/>
+        </w:rPr>
+      </w:pPr>
+      <w:r>
+        <w:rPr>
+          <w:b w:val="0"/>
+          <w:bCs w:val="0"/>
+          <w:rtl w:val="0"/>
+        </w:rPr>
+        <w:t xml:space="preserve">    id_receta_ingrediente  BIGSERIAL PRIMARY KEY,</w:t>
+      </w:r>
+    </w:p>
+    <w:p>
+      <w:pPr>
+        <w:pStyle w:val="Heading2"/>
+        <w:spacing w:before="0" w:lineRule="auto"/>
+        <w:ind w:firstLine="0"/>
+        <w:rPr>
+          <w:b w:val="0"/>
+          <w:bCs w:val="0"/>
+        </w:rPr>
+      </w:pPr>
+      <w:r>
+        <w:rPr>
+          <w:b w:val="0"/>
+          <w:bCs w:val="0"/>
+          <w:rtl w:val="0"/>
+        </w:rPr>
+        <w:t xml:space="preserve">    id_receta              BIGINT NOT NULL,</w:t>
+      </w:r>
+    </w:p>
+    <w:p>
+      <w:pPr>
+        <w:pStyle w:val="Heading2"/>
+        <w:spacing w:before="0" w:lineRule="auto"/>
+        <w:ind w:firstLine="0"/>
+        <w:rPr>
+          <w:b w:val="0"/>
+          <w:bCs w:val="0"/>
+        </w:rPr>
+      </w:pPr>
+      <w:r>
+        <w:rPr>
+          <w:b w:val="0"/>
+          <w:bCs w:val="0"/>
+          <w:rtl w:val="0"/>
+        </w:rPr>
+        <w:t xml:space="preserve">    id_ingrediente         BIGINT NOT NULL,</w:t>
+      </w:r>
+    </w:p>
+    <w:p>
+      <w:pPr>
+        <w:pStyle w:val="Heading2"/>
+        <w:spacing w:before="0" w:lineRule="auto"/>
+        <w:ind w:firstLine="0"/>
+        <w:rPr>
+          <w:b w:val="0"/>
+          <w:bCs w:val="0"/>
+        </w:rPr>
+      </w:pPr>
+      <w:r>
+        <w:rPr>
+          <w:b w:val="0"/>
+          <w:bCs w:val="0"/>
+          <w:rtl w:val="0"/>
+        </w:rPr>
+        <w:t xml:space="preserve">    cantidad               NUMERIC(12,3) NOT NULL,</w:t>
+      </w:r>
+    </w:p>
+    <w:p>
+      <w:pPr>
+        <w:pStyle w:val="Heading2"/>
+        <w:spacing w:before="0" w:lineRule="auto"/>
+        <w:ind w:firstLine="0"/>
+        <w:rPr>
+          <w:b w:val="0"/>
+          <w:bCs w:val="0"/>
+        </w:rPr>
+      </w:pPr>
+      <w:r>
+        <w:rPr>
+          <w:rtl w:val="0"/>
+        </w:rPr>
+      </w:r>
+    </w:p>
+    <w:p>
+      <w:pPr>
+        <w:pStyle w:val="Heading2"/>
+        <w:spacing w:before="0" w:lineRule="auto"/>
+        <w:ind w:firstLine="0"/>
+        <w:rPr>
+          <w:b w:val="0"/>
+          <w:bCs w:val="0"/>
+        </w:rPr>
+      </w:pPr>
+      <w:r>
+        <w:rPr>
+          <w:b w:val="0"/>
+          <w:bCs w:val="0"/>
+          <w:rtl w:val="0"/>
+        </w:rPr>
+        <w:t xml:space="preserve">    CONSTRAINT fk_receta_ingrediente_receta</w:t>
+      </w:r>
+    </w:p>
+    <w:p>
+      <w:pPr>
+        <w:pStyle w:val="Heading2"/>
+        <w:spacing w:before="0" w:lineRule="auto"/>
+        <w:ind w:firstLine="0"/>
+        <w:rPr>
+          <w:b w:val="0"/>
+          <w:bCs w:val="0"/>
+        </w:rPr>
+      </w:pPr>
+      <w:r>
+        <w:rPr>
+          <w:b w:val="0"/>
+          <w:bCs w:val="0"/>
+          <w:rtl w:val="0"/>
+        </w:rPr>
+        <w:t xml:space="preserve">        FOREIGN KEY (id_receta)</w:t>
+      </w:r>
+    </w:p>
+    <w:p>
+      <w:pPr>
+        <w:pStyle w:val="Heading2"/>
+        <w:spacing w:before="0" w:lineRule="auto"/>
+        <w:ind w:firstLine="0"/>
+        <w:rPr>
+          <w:b w:val="0"/>
+          <w:bCs w:val="0"/>
+        </w:rPr>
+      </w:pPr>
+      <w:r>
+        <w:rPr>
+          <w:b w:val="0"/>
+          <w:bCs w:val="0"/>
+          <w:rtl w:val="0"/>
+        </w:rPr>
+        <w:t xml:space="preserve">        REFERENCES receta (id_receta)</w:t>
+      </w:r>
+    </w:p>
+    <w:p>
+      <w:pPr>
+        <w:pStyle w:val="Heading2"/>
+        <w:spacing w:before="0" w:lineRule="auto"/>
+        <w:ind w:firstLine="0"/>
+        <w:rPr>
+          <w:b w:val="0"/>
+          <w:bCs w:val="0"/>
+        </w:rPr>
+      </w:pPr>
+      <w:r>
+        <w:rPr>
+          <w:b w:val="0"/>
+          <w:bCs w:val="0"/>
+          <w:rtl w:val="0"/>
+        </w:rPr>
+        <w:t xml:space="preserve">        ON DELETE CASCADE,</w:t>
+      </w:r>
+    </w:p>
+    <w:p>
+      <w:pPr>
+        <w:pStyle w:val="Heading2"/>
+        <w:spacing w:before="0" w:lineRule="auto"/>
+        <w:ind w:firstLine="0"/>
+        <w:rPr>
+          <w:b w:val="0"/>
+          <w:bCs w:val="0"/>
+        </w:rPr>
+      </w:pPr>
+      <w:r>
+        <w:rPr>
+          <w:rtl w:val="0"/>
+        </w:rPr>
+      </w:r>
+    </w:p>
+    <w:p>
+      <w:pPr>
+        <w:pStyle w:val="Heading2"/>
+        <w:spacing w:before="0" w:lineRule="auto"/>
+        <w:ind w:firstLine="0"/>
+        <w:rPr>
+          <w:b w:val="0"/>
+          <w:bCs w:val="0"/>
+        </w:rPr>
+      </w:pPr>
+      <w:r>
+        <w:rPr>
+          <w:b w:val="0"/>
+          <w:bCs w:val="0"/>
+          <w:rtl w:val="0"/>
+        </w:rPr>
+        <w:t xml:space="preserve">    CONSTRAINT fk_receta_ingrediente_ingrediente</w:t>
+      </w:r>
+    </w:p>
+    <w:p>
+      <w:pPr>
+        <w:pStyle w:val="Heading2"/>
+        <w:spacing w:before="0" w:lineRule="auto"/>
+        <w:ind w:firstLine="0"/>
+        <w:rPr>
+          <w:b w:val="0"/>
+          <w:bCs w:val="0"/>
+        </w:rPr>
+      </w:pPr>
+      <w:r>
+        <w:rPr>
+          <w:b w:val="0"/>
+          <w:bCs w:val="0"/>
+          <w:rtl w:val="0"/>
+        </w:rPr>
+        <w:t xml:space="preserve">        FOREIGN KEY (id_ingrediente)</w:t>
+      </w:r>
+    </w:p>
+    <w:p>
+      <w:pPr>
+        <w:pStyle w:val="Heading2"/>
+        <w:spacing w:before="0" w:lineRule="auto"/>
+        <w:ind w:firstLine="0"/>
+        <w:rPr>
+          <w:b w:val="0"/>
+          <w:bCs w:val="0"/>
+        </w:rPr>
+      </w:pPr>
+      <w:r>
+        <w:rPr>
+          <w:b w:val="0"/>
+          <w:bCs w:val="0"/>
+          <w:rtl w:val="0"/>
+        </w:rPr>
+        <w:t xml:space="preserve">        REFERENCES ingrediente (id_ingrediente)</w:t>
+      </w:r>
+    </w:p>
+    <w:p>
+      <w:pPr>
+        <w:pStyle w:val="Heading2"/>
+        <w:spacing w:before="0" w:lineRule="auto"/>
+        <w:ind w:firstLine="0"/>
+        <w:rPr>
+          <w:b w:val="0"/>
+          <w:bCs w:val="0"/>
+        </w:rPr>
+      </w:pPr>
+      <w:r>
+        <w:rPr>
+          <w:b w:val="0"/>
+          <w:bCs w:val="0"/>
+          <w:rtl w:val="0"/>
+        </w:rPr>
+        <w:t xml:space="preserve">        ON DELETE RESTRICT,</w:t>
+      </w:r>
+    </w:p>
+    <w:p>
+      <w:pPr>
+        <w:pStyle w:val="Heading2"/>
+        <w:spacing w:before="0" w:lineRule="auto"/>
+        <w:ind w:firstLine="0"/>
+        <w:rPr>
+          <w:b w:val="0"/>
+          <w:bCs w:val="0"/>
+        </w:rPr>
+      </w:pPr>
+      <w:r>
+        <w:rPr>
+          <w:rtl w:val="0"/>
+        </w:rPr>
+      </w:r>
+    </w:p>
+    <w:p>
+      <w:pPr>
+        <w:pStyle w:val="Heading2"/>
+        <w:spacing w:before="0" w:lineRule="auto"/>
+        <w:ind w:firstLine="0"/>
+        <w:rPr>
+          <w:b w:val="0"/>
+          <w:bCs w:val="0"/>
+        </w:rPr>
+      </w:pPr>
+      <w:r>
+        <w:rPr>
+          <w:b w:val="0"/>
+          <w:bCs w:val="0"/>
+          <w:rtl w:val="0"/>
+        </w:rPr>
+        <w:t xml:space="preserve">    CONSTRAINT chk_receta_ingrediente_cantidad</w:t>
+      </w:r>
+    </w:p>
+    <w:p>
+      <w:pPr>
+        <w:pStyle w:val="Heading2"/>
+        <w:spacing w:before="0" w:lineRule="auto"/>
+        <w:ind w:firstLine="0"/>
+        <w:rPr>
+          <w:b w:val="0"/>
+          <w:bCs w:val="0"/>
+        </w:rPr>
+      </w:pPr>
+      <w:r>
+        <w:rPr>
+          <w:b w:val="0"/>
+          <w:bCs w:val="0"/>
+          <w:rtl w:val="0"/>
+        </w:rPr>
+        <w:t xml:space="preserve">        CHECK (cantidad &gt; 0),</w:t>
+      </w:r>
+    </w:p>
+    <w:p>
+      <w:pPr>
+        <w:pStyle w:val="Heading2"/>
+        <w:spacing w:before="0" w:lineRule="auto"/>
+        <w:ind w:firstLine="0"/>
+        <w:rPr>
+          <w:b w:val="0"/>
+          <w:bCs w:val="0"/>
+        </w:rPr>
+      </w:pPr>
+      <w:r>
+        <w:rPr>
+          <w:rtl w:val="0"/>
+        </w:rPr>
+      </w:r>
+    </w:p>
+    <w:p>
+      <w:pPr>
+        <w:pStyle w:val="Heading2"/>
+        <w:spacing w:before="0" w:lineRule="auto"/>
+        <w:ind w:firstLine="0"/>
+        <w:rPr>
+          <w:b w:val="0"/>
+          <w:bCs w:val="0"/>
+        </w:rPr>
+      </w:pPr>
+      <w:r>
+        <w:rPr>
+          <w:b w:val="0"/>
+          <w:bCs w:val="0"/>
+          <w:rtl w:val="0"/>
+        </w:rPr>
+        <w:t xml:space="preserve">    CONSTRAINT uq_receta_ingrediente</w:t>
+      </w:r>
+    </w:p>
+    <w:p>
+      <w:pPr>
+        <w:pStyle w:val="Heading2"/>
+        <w:spacing w:before="0" w:lineRule="auto"/>
+        <w:ind w:firstLine="0"/>
+        <w:rPr>
+          <w:b w:val="0"/>
+          <w:bCs w:val="0"/>
+        </w:rPr>
+      </w:pPr>
+      <w:r>
+        <w:rPr>
+          <w:b w:val="0"/>
+          <w:bCs w:val="0"/>
+          <w:rtl w:val="0"/>
+        </w:rPr>
+        <w:t xml:space="preserve">        UNIQUE (</w:t>
+      </w:r>
+    </w:p>
+    <w:p>
+      <w:pPr>
+        <w:pStyle w:val="Heading2"/>
+        <w:spacing w:before="0" w:lineRule="auto"/>
+        <w:ind w:firstLine="0"/>
+        <w:rPr>
+          <w:b w:val="0"/>
+          <w:bCs w:val="0"/>
+        </w:rPr>
+      </w:pPr>
+      <w:r>
+        <w:rPr>
+          <w:b w:val="0"/>
+          <w:bCs w:val="0"/>
+          <w:rtl w:val="0"/>
+        </w:rPr>
+        <w:t xml:space="preserve">            id_receta,</w:t>
+      </w:r>
+    </w:p>
+    <w:p>
+      <w:pPr>
+        <w:pStyle w:val="Heading2"/>
+        <w:spacing w:before="0" w:lineRule="auto"/>
+        <w:ind w:firstLine="0"/>
+        <w:rPr>
+          <w:b w:val="0"/>
+          <w:bCs w:val="0"/>
+        </w:rPr>
+      </w:pPr>
+      <w:r>
+        <w:rPr>
+          <w:b w:val="0"/>
+          <w:bCs w:val="0"/>
+          <w:rtl w:val="0"/>
+        </w:rPr>
+        <w:t xml:space="preserve">            id_ingrediente</w:t>
+      </w:r>
+    </w:p>
+    <w:p>
+      <w:pPr>
+        <w:pStyle w:val="Heading2"/>
+        <w:spacing w:before="0" w:lineRule="auto"/>
+        <w:ind w:firstLine="0"/>
+        <w:rPr>
+          <w:b w:val="0"/>
+          <w:bCs w:val="0"/>
+        </w:rPr>
+      </w:pPr>
+      <w:r>
+        <w:rPr>
+          <w:b w:val="0"/>
+          <w:bCs w:val="0"/>
+          <w:rtl w:val="0"/>
+        </w:rPr>
+        <w:t xml:space="preserve">        )</w:t>
+      </w:r>
+    </w:p>
+    <w:p>
+      <w:pPr>
+        <w:pStyle w:val="Heading2"/>
+        <w:spacing w:before="0" w:lineRule="auto"/>
+        <w:ind w:firstLine="0"/>
+        <w:rPr>
+          <w:b w:val="0"/>
+          <w:bCs w:val="0"/>
+        </w:rPr>
+      </w:pPr>
+      <w:r>
+        <w:rPr>
+          <w:b w:val="0"/>
+          <w:bCs w:val="0"/>
+          <w:rtl w:val="0"/>
+        </w:rPr>
+        <w:t xml:space="preserve">);</w:t>
+      </w:r>
+    </w:p>
+    <w:p>
+      <w:pPr>
+        <w:pStyle w:val="Heading2"/>
+        <w:spacing w:before="0" w:lineRule="auto"/>
+        <w:ind w:firstLine="0"/>
+        <w:rPr>
+          <w:b w:val="0"/>
+          <w:bCs w:val="0"/>
+        </w:rPr>
+      </w:pPr>
+      <w:r>
+        <w:rPr>
+          <w:rtl w:val="0"/>
+        </w:rPr>
+      </w:r>
+    </w:p>
+    <w:p>
+      <w:pPr>
+        <w:pStyle w:val="Heading2"/>
+        <w:spacing w:before="0" w:lineRule="auto"/>
+        <w:ind w:firstLine="0"/>
+        <w:rPr>
+          <w:b w:val="0"/>
+          <w:bCs w:val="0"/>
+        </w:rPr>
+      </w:pPr>
+      <w:r>
+        <w:rPr>
+          <w:rtl w:val="0"/>
+        </w:rPr>
+      </w:r>
+    </w:p>
+    <w:p>
+      <w:pPr>
+        <w:pStyle w:val="Heading2"/>
+        <w:spacing w:before="0" w:lineRule="auto"/>
+        <w:ind w:firstLine="0"/>
+        <w:rPr>
+          <w:b w:val="0"/>
+          <w:bCs w:val="0"/>
+        </w:rPr>
+      </w:pPr>
+      <w:r>
+        <w:rPr>
+          <w:b w:val="0"/>
+          <w:bCs w:val="0"/>
+          <w:rtl w:val="0"/>
+        </w:rPr>
+        <w:t xml:space="preserve">-- ============================================================</w:t>
+      </w:r>
+    </w:p>
+    <w:p>
+      <w:pPr>
+        <w:pStyle w:val="Heading2"/>
+        <w:spacing w:before="0" w:lineRule="auto"/>
+        <w:ind w:firstLine="0"/>
+        <w:rPr>
+          <w:b w:val="0"/>
+          <w:bCs w:val="0"/>
+        </w:rPr>
+      </w:pPr>
+      <w:r>
+        <w:rPr>
+          <w:b w:val="0"/>
+          <w:bCs w:val="0"/>
+          <w:rtl w:val="0"/>
+        </w:rPr>
+        <w:t xml:space="preserve">-- INDEXES</w:t>
+      </w:r>
+    </w:p>
+    <w:p>
+      <w:pPr>
+        <w:pStyle w:val="Heading2"/>
+        <w:spacing w:before="0" w:lineRule="auto"/>
+        <w:ind w:firstLine="0"/>
+        <w:rPr>
+          <w:b w:val="0"/>
+          <w:bCs w:val="0"/>
+        </w:rPr>
+      </w:pPr>
+      <w:r>
+        <w:rPr>
+          <w:b w:val="0"/>
+          <w:bCs w:val="0"/>
+          <w:rtl w:val="0"/>
+        </w:rPr>
+        <w:t xml:space="preserve">-- ============================================================</w:t>
+      </w:r>
+    </w:p>
+    <w:p>
+      <w:pPr>
+        <w:pStyle w:val="Heading2"/>
+        <w:spacing w:before="0" w:lineRule="auto"/>
+        <w:ind w:firstLine="0"/>
+        <w:rPr>
+          <w:b w:val="0"/>
+          <w:bCs w:val="0"/>
+        </w:rPr>
+      </w:pPr>
+      <w:r>
+        <w:rPr>
+          <w:rtl w:val="0"/>
+        </w:rPr>
+      </w:r>
+    </w:p>
+    <w:p>
+      <w:pPr>
+        <w:pStyle w:val="Heading2"/>
+        <w:spacing w:before="0" w:lineRule="auto"/>
+        <w:ind w:firstLine="0"/>
+        <w:rPr>
+          <w:b w:val="0"/>
+          <w:bCs w:val="0"/>
+        </w:rPr>
+      </w:pPr>
+      <w:r>
+        <w:rPr>
+          <w:b w:val="0"/>
+          <w:bCs w:val="0"/>
+          <w:rtl w:val="0"/>
+        </w:rPr>
+        <w:t xml:space="preserve">CREATE INDEX IF NOT EXISTS idx_menu_item_plan</w:t>
+      </w:r>
+    </w:p>
+    <w:p>
+      <w:pPr>
+        <w:pStyle w:val="Heading2"/>
+        <w:spacing w:before="0" w:lineRule="auto"/>
+        <w:ind w:firstLine="0"/>
+        <w:rPr>
+          <w:b w:val="0"/>
+          <w:bCs w:val="0"/>
+        </w:rPr>
+      </w:pPr>
+      <w:r>
+        <w:rPr>
+          <w:b w:val="0"/>
+          <w:bCs w:val="0"/>
+          <w:rtl w:val="0"/>
+        </w:rPr>
+        <w:t xml:space="preserve">    ON menu_item (id_plan);</w:t>
+      </w:r>
+    </w:p>
+    <w:p>
+      <w:pPr>
+        <w:pStyle w:val="Heading2"/>
+        <w:spacing w:before="0" w:lineRule="auto"/>
+        <w:ind w:firstLine="0"/>
+        <w:rPr>
+          <w:b w:val="0"/>
+          <w:bCs w:val="0"/>
+        </w:rPr>
+      </w:pPr>
+      <w:r>
+        <w:rPr>
+          <w:rtl w:val="0"/>
+        </w:rPr>
+      </w:r>
+    </w:p>
+    <w:p>
+      <w:pPr>
+        <w:pStyle w:val="Heading2"/>
+        <w:spacing w:before="0" w:lineRule="auto"/>
+        <w:ind w:firstLine="0"/>
+        <w:rPr>
+          <w:b w:val="0"/>
+          <w:bCs w:val="0"/>
+        </w:rPr>
+      </w:pPr>
+      <w:r>
+        <w:rPr>
+          <w:b w:val="0"/>
+          <w:bCs w:val="0"/>
+          <w:rtl w:val="0"/>
+        </w:rPr>
+        <w:t xml:space="preserve">CREATE INDEX IF NOT EXISTS idx_menu_item_receta</w:t>
+      </w:r>
+    </w:p>
+    <w:p>
+      <w:pPr>
+        <w:pStyle w:val="Heading2"/>
+        <w:spacing w:before="0" w:lineRule="auto"/>
+        <w:ind w:firstLine="0"/>
+        <w:rPr>
+          <w:b w:val="0"/>
+          <w:bCs w:val="0"/>
+        </w:rPr>
+      </w:pPr>
+      <w:r>
+        <w:rPr>
+          <w:b w:val="0"/>
+          <w:bCs w:val="0"/>
+          <w:rtl w:val="0"/>
+        </w:rPr>
+        <w:t xml:space="preserve">    ON menu_item (id_receta);</w:t>
+      </w:r>
+    </w:p>
+    <w:p>
+      <w:pPr>
+        <w:pStyle w:val="Heading2"/>
+        <w:spacing w:before="0" w:lineRule="auto"/>
+        <w:ind w:firstLine="0"/>
+        <w:rPr>
+          <w:b w:val="0"/>
+          <w:bCs w:val="0"/>
+        </w:rPr>
+      </w:pPr>
+      <w:r>
+        <w:rPr>
+          <w:rtl w:val="0"/>
+        </w:rPr>
+      </w:r>
+    </w:p>
+    <w:p>
+      <w:pPr>
+        <w:pStyle w:val="Heading2"/>
+        <w:spacing w:before="0" w:lineRule="auto"/>
+        <w:ind w:firstLine="0"/>
+        <w:rPr>
+          <w:b w:val="0"/>
+          <w:bCs w:val="0"/>
+        </w:rPr>
+      </w:pPr>
+      <w:r>
+        <w:rPr>
+          <w:b w:val="0"/>
+          <w:bCs w:val="0"/>
+          <w:rtl w:val="0"/>
+        </w:rPr>
+        <w:t xml:space="preserve">CREATE INDEX IF NOT EXISTS idx_menu_item_dia</w:t>
+      </w:r>
+    </w:p>
+    <w:p>
+      <w:pPr>
+        <w:pStyle w:val="Heading2"/>
+        <w:spacing w:before="0" w:lineRule="auto"/>
+        <w:ind w:firstLine="0"/>
+        <w:rPr>
+          <w:b w:val="0"/>
+          <w:bCs w:val="0"/>
+        </w:rPr>
+      </w:pPr>
+      <w:r>
+        <w:rPr>
+          <w:b w:val="0"/>
+          <w:bCs w:val="0"/>
+          <w:rtl w:val="0"/>
+        </w:rPr>
+        <w:t xml:space="preserve">    ON menu_item (id_plan, dia_semana);</w:t>
+      </w:r>
+    </w:p>
+    <w:p>
+      <w:pPr>
+        <w:pStyle w:val="Heading2"/>
+        <w:spacing w:before="0" w:lineRule="auto"/>
+        <w:ind w:firstLine="0"/>
+        <w:rPr>
+          <w:b w:val="0"/>
+          <w:bCs w:val="0"/>
+        </w:rPr>
+      </w:pPr>
+      <w:r>
+        <w:rPr>
+          <w:rtl w:val="0"/>
+        </w:rPr>
+      </w:r>
+    </w:p>
+    <w:p>
+      <w:pPr>
+        <w:pStyle w:val="Heading2"/>
+        <w:spacing w:before="0" w:lineRule="auto"/>
+        <w:ind w:firstLine="0"/>
+        <w:rPr>
+          <w:b w:val="0"/>
+          <w:bCs w:val="0"/>
+        </w:rPr>
+      </w:pPr>
+      <w:r>
+        <w:rPr>
+          <w:b w:val="0"/>
+          <w:bCs w:val="0"/>
+          <w:rtl w:val="0"/>
+        </w:rPr>
+        <w:t xml:space="preserve">CREATE INDEX IF NOT EXISTS idx_receta_ingrediente_receta</w:t>
+      </w:r>
+    </w:p>
+    <w:p>
+      <w:pPr>
+        <w:pStyle w:val="Heading2"/>
+        <w:spacing w:before="0" w:lineRule="auto"/>
+        <w:ind w:firstLine="0"/>
+        <w:rPr>
+          <w:b w:val="0"/>
+          <w:bCs w:val="0"/>
+        </w:rPr>
+      </w:pPr>
+      <w:r>
+        <w:rPr>
+          <w:b w:val="0"/>
+          <w:bCs w:val="0"/>
+          <w:rtl w:val="0"/>
+        </w:rPr>
+        <w:t xml:space="preserve">    ON receta_ingrediente (id_receta);</w:t>
+      </w:r>
+    </w:p>
+    <w:p>
+      <w:pPr>
+        <w:pStyle w:val="Heading2"/>
+        <w:spacing w:before="0" w:lineRule="auto"/>
+        <w:ind w:firstLine="0"/>
+        <w:rPr>
+          <w:b w:val="0"/>
+          <w:bCs w:val="0"/>
+        </w:rPr>
+      </w:pPr>
+      <w:r>
+        <w:rPr>
+          <w:rtl w:val="0"/>
+        </w:rPr>
+      </w:r>
+    </w:p>
+    <w:p>
+      <w:pPr>
+        <w:pStyle w:val="Heading2"/>
+        <w:spacing w:before="0" w:lineRule="auto"/>
+        <w:ind w:firstLine="0"/>
+        <w:rPr>
+          <w:b w:val="0"/>
+          <w:bCs w:val="0"/>
+        </w:rPr>
+      </w:pPr>
+      <w:r>
+        <w:rPr>
+          <w:b w:val="0"/>
+          <w:bCs w:val="0"/>
+          <w:rtl w:val="0"/>
+        </w:rPr>
+        <w:t xml:space="preserve">CREATE INDEX IF NOT EXISTS idx_receta_ingrediente_ingrediente</w:t>
+      </w:r>
+    </w:p>
+    <w:p>
+      <w:pPr>
+        <w:pStyle w:val="Heading2"/>
+        <w:spacing w:before="0" w:lineRule="auto"/>
+        <w:ind w:firstLine="0"/>
+        <w:rPr>
+          <w:b w:val="0"/>
+          <w:bCs w:val="0"/>
+        </w:rPr>
+      </w:pPr>
+      <w:r>
+        <w:rPr>
+          <w:b w:val="0"/>
+          <w:bCs w:val="0"/>
+          <w:rtl w:val="0"/>
+        </w:rPr>
+        <w:t xml:space="preserve">    ON receta_ingrediente (id_ingrediente);</w:t>
+      </w:r>
+    </w:p>
+    <w:p>
+      <w:pPr>
+        <w:pStyle w:val="Heading2"/>
+        <w:spacing w:before="0" w:lineRule="auto"/>
+        <w:ind w:firstLine="0"/>
+        <w:rPr>
+          <w:b w:val="0"/>
+          <w:bCs w:val="0"/>
+        </w:rPr>
+      </w:pPr>
+      <w:r>
+        <w:rPr>
+          <w:rtl w:val="0"/>
+        </w:rPr>
+      </w:r>
+    </w:p>
+    <w:p>
+      <w:pPr>
+        <w:pStyle w:val="Heading2"/>
+        <w:spacing w:before="0" w:lineRule="auto"/>
+        <w:ind w:firstLine="0"/>
+        <w:rPr>
+          <w:b w:val="0"/>
+          <w:bCs w:val="0"/>
+        </w:rPr>
+      </w:pPr>
+      <w:r>
+        <w:rPr>
+          <w:b w:val="0"/>
+          <w:bCs w:val="0"/>
+          <w:rtl w:val="0"/>
+        </w:rPr>
+        <w:t xml:space="preserve">CREATE INDEX IF NOT EXISTS idx_ingrediente_categoria</w:t>
+      </w:r>
+    </w:p>
+    <w:p>
+      <w:pPr>
+        <w:pStyle w:val="Heading2"/>
+        <w:spacing w:before="0" w:lineRule="auto"/>
+        <w:ind w:firstLine="0"/>
+        <w:rPr>
+          <w:b w:val="0"/>
+          <w:bCs w:val="0"/>
+        </w:rPr>
+      </w:pPr>
+      <w:r>
+        <w:rPr>
+          <w:b w:val="0"/>
+          <w:bCs w:val="0"/>
+          <w:rtl w:val="0"/>
+        </w:rPr>
+        <w:t xml:space="preserve">    ON ingrediente (categoria);</w:t>
+      </w:r>
+    </w:p>
+    <w:p>
+      <w:pPr>
+        <w:pStyle w:val="Heading2"/>
+        <w:spacing w:before="0" w:lineRule="auto"/>
+        <w:ind w:firstLine="0"/>
+        <w:rPr>
+          <w:b w:val="0"/>
+          <w:bCs w:val="0"/>
+        </w:rPr>
+      </w:pPr>
+      <w:r>
+        <w:rPr>
+          <w:rtl w:val="0"/>
+        </w:rPr>
+      </w:r>
+    </w:p>
+    <w:p>
+      <w:pPr>
+        <w:pStyle w:val="Heading2"/>
+        <w:spacing w:before="0" w:lineRule="auto"/>
+        <w:ind w:firstLine="0"/>
+        <w:rPr>
+          <w:b w:val="0"/>
+          <w:bCs w:val="0"/>
+        </w:rPr>
+      </w:pPr>
+      <w:bookmarkStart w:colFirst="0" w:colLast="0" w:name="_ymwz3oyhfggz" w:id="0"/>
+      <w:bookmarkEnd w:id="0"/>
+      <w:r>
+        <w:rPr>
+          <w:rtl w:val="0"/>
+        </w:rPr>
+      </w:r>
+    </w:p>
+    <w:p>
+      <w:pPr>
+        <w:pStyle w:val="Heading2"/>
+        <w:spacing w:after="0" w:before="0" w:line="480" w:lineRule="auto"/>
+        <w:ind w:firstLine="0"/>
+        <w:rPr>
+          <w:b w:val="0"/>
+          <w:bCs w:val="0"/>
+        </w:rPr>
+      </w:pPr>
+      <w:r>
+        <w:rPr>
+          <w:b w:val="0"/>
+          <w:bCs w:val="0"/>
+          <w:rtl w:val="0"/>
+        </w:rPr>
+        <w:t xml:space="preserve">COMMIT;</w:t>
+      </w:r>
+    </w:p>
+    <w:p>
+      <w:pPr>
+        <w:pStyle w:val="Heading2"/>
+        <w:spacing w:after="0" w:before="0" w:line="480" w:lineRule="auto"/>
+        <w:ind w:firstLine="0"/>
+        <w:rPr/>
+      </w:pPr>
+      <w:r>
+        <w:rPr>
+          <w:rtl w:val="0"/>
+        </w:rPr>
+      </w:r>
+    </w:p>
+    <w:p>
+      <w:pPr>
+        <w:pStyle w:val="Heading2"/>
         <w:spacing w:after="0" w:before="0" w:line="480" w:lineRule="auto"/>
         <w:ind w:firstLine="0"/>
         <w:rPr/>
@@ -6188,6 +9119,67 @@
           <w:rtl w:val="0"/>
         </w:rPr>
         <w:t xml:space="preserve">Implementación y condiciones legales</w:t>
+      </w:r>
+    </w:p>
+    <w:p>
+      <w:pPr>
+        <w:ind w:left="0" w:firstLine="0"/>
+        <w:rPr>
+          <w:b w:val="1"/>
+          <w:bCs w:val="1"/>
+        </w:rPr>
+      </w:pPr>
+      <w:r>
+        <w:rPr>
+          <w:b w:val="1"/>
+          <w:bCs w:val="1"/>
+          <w:rtl w:val="0"/>
+        </w:rPr>
+        <w:t xml:space="preserve">Marco Legal y Contractual:</w:t>
+      </w:r>
+    </w:p>
+    <w:p>
+      <w:pPr>
+        <w:spacing w:after="240" w:lineRule="auto"/>
+        <w:ind w:firstLine="720"/>
+        <w:rPr/>
+      </w:pPr>
+      <w:r>
+        <w:rPr>
+          <w:rtl w:val="0"/>
+        </w:rPr>
+        <w:t xml:space="preserve">El desarrollo académico y práctico del proyecto se encuentra contextualizado dentro del marco normativo colombiano aplicable al contrato de aprendizaje. Para efectos de esta documentación, se emplean como referencias públicas la Ley 789 de 2002 y la normativa vigente que desarrolla la figura del contrato de aprendizaje.</w:t>
+      </w:r>
+    </w:p>
+    <w:p>
+      <w:pPr>
+        <w:spacing w:after="240" w:before="240" w:lineRule="auto"/>
+        <w:ind w:firstLine="720"/>
+        <w:rPr/>
+      </w:pPr>
+      <w:r>
+        <w:rPr>
+          <w:rtl w:val="0"/>
+        </w:rPr>
+        <w:t xml:space="preserve">De acuerdo con la regulación vigente, el contrato de aprendizaje constituye una modalidad especial de vinculación laboral orientada a la formación teórico-práctica y relacionada con el programa de formación del aprendiz.</w:t>
+      </w:r>
+    </w:p>
+    <w:p>
+      <w:pPr>
+        <w:spacing w:after="240" w:before="240" w:lineRule="auto"/>
+        <w:ind w:firstLine="720"/>
+        <w:rPr/>
+      </w:pPr>
+      <w:r>
+        <w:rPr>
+          <w:rtl w:val="0"/>
+        </w:rPr>
+        <w:t xml:space="preserve">La presente referencia se incorpora únicamente con fines académicos y de contextualización jurídica. No se incluyen datos personales, condiciones particulares, información confidencial ni elementos identificativos del contrato individual suscrito por el aprendiz.</w:t>
+      </w:r>
+      <w:r>
+        <w:rPr>
+          <w:rtl w:val="0"/>
+        </w:rPr>
       </w:r>
     </w:p>
     <w:p>

</xml_diff>

<commit_message>
feat: Update bibliografic references on the INFORME_REQUISITOS file
</commit_message>
<xml_diff>
--- a/INFORME_REQUISITOS.docx
+++ b/INFORME_REQUISITOS.docx
@@ -297,7 +297,7 @@
     </w:p>
     <w:sdt>
       <w:sdtPr>
-        <w:id w:val="-1594377417"/>
+        <w:id w:val="-1087423041"/>
         <w:docPartObj>
           <w:docPartGallery w:val="Table of Contents"/>
           <w:docPartUnique w:val="1"/>
@@ -2514,7 +2514,7 @@
     </w:p>
     <w:sdt>
       <w:sdtPr>
-        <w:id w:val="-205287922"/>
+        <w:id w:val="1582867803"/>
         <w:docPartObj>
           <w:docPartGallery w:val="Table of Contents"/>
           <w:docPartUnique w:val="1"/>
@@ -11226,7 +11226,29 @@
           <w:szCs w:val="24"/>
           <w:rtl w:val="0"/>
         </w:rPr>
-        <w:t xml:space="preserve">Superintendencia de Industria y Comercio. (s. f.). Competencia desleal y propiedad industrial. https://sedeelectronica.sic.gov.co/temas/asuntos-jurisdiccionales/proteccion-del-consumidor/competencia-desleal-y-propiedad-industrial</w:t>
+        <w:t xml:space="preserve">Superintendencia de Industria y Comercio. (s. f.). Competencia desleal y propiedad industrial. </w:t>
+      </w:r>
+      <w:hyperlink r:id="rId12">
+        <w:r>
+          <w:rPr>
+            <w:rFonts w:ascii="Times New Roman" w:cs="Times New Roman" w:eastAsia="Times New Roman" w:hAnsi="Times New Roman"/>
+            <w:color w:val="1155cc"/>
+            <w:sz w:val="24"/>
+            <w:szCs w:val="24"/>
+            <w:u w:val="single"/>
+            <w:rtl w:val="0"/>
+          </w:rPr>
+          <w:t xml:space="preserve">https://sedeelectronica.sic.gov.co/temas/asuntos-jurisdiccionales/proteccion-del-consumidor/competencia-desleal-y-propiedad-industrial</w:t>
+        </w:r>
+      </w:hyperlink>
+      <w:r>
+        <w:rPr>
+          <w:rFonts w:ascii="Times New Roman" w:cs="Times New Roman" w:eastAsia="Times New Roman" w:hAnsi="Times New Roman"/>
+          <w:sz w:val="24"/>
+          <w:szCs w:val="24"/>
+          <w:rtl w:val="0"/>
+        </w:rPr>
+        <w:t xml:space="preserve"> </w:t>
       </w:r>
     </w:p>
     <w:p>
@@ -11258,7 +11280,7 @@
         </w:rPr>
         <w:t xml:space="preserve">. CESDE, material pédagogique du cours, [s. d.]. Disponible sur :</w:t>
       </w:r>
-      <w:hyperlink r:id="rId12">
+      <w:hyperlink r:id="rId13">
         <w:r>
           <w:rPr>
             <w:rtl w:val="0"/>
@@ -11266,7 +11288,7 @@
           <w:t xml:space="preserve"> </w:t>
         </w:r>
       </w:hyperlink>
-      <w:hyperlink r:id="rId13">
+      <w:hyperlink r:id="rId14">
         <w:r>
           <w:rPr>
             <w:color w:val="1155cc"/>
@@ -11311,7 +11333,7 @@
         </w:rPr>
         <w:t xml:space="preserve">. CESDE, material pédagogique du cours, [s. d.]. Disponible sur :</w:t>
       </w:r>
-      <w:hyperlink r:id="rId14">
+      <w:hyperlink r:id="rId15">
         <w:r>
           <w:rPr>
             <w:rtl w:val="0"/>
@@ -11319,7 +11341,7 @@
           <w:t xml:space="preserve"> </w:t>
         </w:r>
       </w:hyperlink>
-      <w:hyperlink r:id="rId15">
+      <w:hyperlink r:id="rId16">
         <w:r>
           <w:rPr>
             <w:color w:val="1155cc"/>
@@ -11364,7 +11386,7 @@
         </w:rPr>
         <w:t xml:space="preserve">. Bogotá D. C.: Ministerio del Trabajo, 2026. Disponible sur :</w:t>
       </w:r>
-      <w:hyperlink r:id="rId16">
+      <w:hyperlink r:id="rId17">
         <w:r>
           <w:rPr>
             <w:rtl w:val="0"/>
@@ -11372,7 +11394,7 @@
           <w:t xml:space="preserve"> </w:t>
         </w:r>
       </w:hyperlink>
-      <w:hyperlink r:id="rId17">
+      <w:hyperlink r:id="rId18">
         <w:r>
           <w:rPr>
             <w:color w:val="1155cc"/>
@@ -11417,7 +11439,7 @@
         </w:rPr>
         <w:t xml:space="preserve">. Bogotá D. C., 2002. Disponible sur :</w:t>
       </w:r>
-      <w:hyperlink r:id="rId18">
+      <w:hyperlink r:id="rId19">
         <w:r>
           <w:rPr>
             <w:rtl w:val="0"/>
@@ -11425,7 +11447,7 @@
           <w:t xml:space="preserve"> </w:t>
         </w:r>
       </w:hyperlink>
-      <w:hyperlink r:id="rId19">
+      <w:hyperlink r:id="rId20">
         <w:r>
           <w:rPr>
             <w:color w:val="1155cc"/>
@@ -11470,7 +11492,7 @@
         </w:rPr>
         <w:t xml:space="preserve">. Bogotá D. C.: SENA. Disponible sur :</w:t>
       </w:r>
-      <w:hyperlink r:id="rId20">
+      <w:hyperlink r:id="rId21">
         <w:r>
           <w:rPr>
             <w:rtl w:val="0"/>
@@ -11478,28 +11500,87 @@
           <w:t xml:space="preserve"> </w:t>
         </w:r>
       </w:hyperlink>
-      <w:hyperlink r:id="rId21">
+      <w:r>
+        <w:fldChar w:fldCharType="begin"/>
+        <w:instrText xml:space="preserve"> HYPERLINK "https://normograma.sena.edu.co/compilacion/docs/decreto_0223_2026.htm" </w:instrText>
+        <w:fldChar w:fldCharType="separate"/>
+      </w:r>
+      <w:r>
+        <w:rPr>
+          <w:rtl w:val="0"/>
+        </w:rPr>
+      </w:r>
+    </w:p>
+    <w:p>
+      <w:pPr>
+        <w:spacing w:after="240" w:before="240" w:lineRule="auto"/>
+        <w:ind w:firstLine="0"/>
+        <w:rPr/>
+      </w:pPr>
+      <w:r>
+        <w:fldChar w:fldCharType="end"/>
+      </w:r>
+      <w:hyperlink r:id="rId22">
         <w:r>
           <w:rPr>
             <w:color w:val="1155cc"/>
             <w:u w:val="single"/>
             <w:rtl w:val="0"/>
           </w:rPr>
-          <w:t xml:space="preserve">https://normograma.sena.edu.co/compilacion/docs/decreto_0223_2026.htm</w:t>
+          <w:t xml:space="preserve">https://normograma.sena.edu.co/compilacion/docs/decreto_0223_2026.html</w:t>
         </w:r>
       </w:hyperlink>
       <w:r>
         <w:rPr>
           <w:rtl w:val="0"/>
         </w:rPr>
-      </w:r>
-    </w:p>
-    <w:p>
-      <w:pPr>
-        <w:spacing w:line="480" w:lineRule="auto"/>
-        <w:ind w:left="720" w:hanging="720"/>
-        <w:rPr/>
-      </w:pPr>
+        <w:t xml:space="preserve"> </w:t>
+      </w:r>
+    </w:p>
+    <w:p>
+      <w:pPr>
+        <w:spacing w:after="240" w:before="240" w:lineRule="auto"/>
+        <w:ind w:firstLine="0"/>
+        <w:rPr/>
+      </w:pPr>
+      <w:r>
+        <w:rPr>
+          <w:rtl w:val="0"/>
+        </w:rPr>
+        <w:t xml:space="preserve">OPENAI. </w:t>
+      </w:r>
+      <w:r>
+        <w:rPr>
+          <w:i w:val="1"/>
+          <w:iCs w:val="1"/>
+          <w:rtl w:val="0"/>
+        </w:rPr>
+        <w:t xml:space="preserve">ChatGPT : assistant conversationnel d’intelligence artificielle</w:t>
+      </w:r>
+      <w:r>
+        <w:rPr>
+          <w:rtl w:val="0"/>
+        </w:rPr>
+        <w:t xml:space="preserve">. OpenAI, 2026. Disponible sur :</w:t>
+      </w:r>
+      <w:hyperlink r:id="rId23">
+        <w:r>
+          <w:rPr>
+            <w:rtl w:val="0"/>
+          </w:rPr>
+          <w:t xml:space="preserve"> </w:t>
+        </w:r>
+      </w:hyperlink>
+      <w:hyperlink r:id="rId24">
+        <w:r>
+          <w:rPr>
+            <w:color w:val="1155cc"/>
+            <w:u w:val="single"/>
+            <w:rtl w:val="0"/>
+          </w:rPr>
+          <w:t xml:space="preserve">https://chatgpt.com/</w:t>
+        </w:r>
+      </w:hyperlink>
       <w:r>
         <w:rPr>
           <w:rtl w:val="0"/>
@@ -11592,8 +11673,8 @@
       </w:r>
     </w:p>
     <w:sectPr>
-      <w:headerReference r:id="rId22" w:type="default"/>
-      <w:footerReference r:id="rId23" w:type="default"/>
+      <w:headerReference r:id="rId25" w:type="default"/>
+      <w:footerReference r:id="rId26" w:type="default"/>
       <w:pgSz w:h="15840" w:w="12240" w:orient="portrait"/>
       <w:pgMar w:bottom="1440" w:top="1440" w:left="1440" w:right="1440" w:header="720" w:footer="720"/>
       <w:pgNumType w:start="1"/>

</xml_diff>

<commit_message>
feat: I update the bibliografic references in the final report
</commit_message>
<xml_diff>
--- a/INFORME_REQUISITOS.docx
+++ b/INFORME_REQUISITOS.docx
@@ -297,7 +297,7 @@
     </w:p>
     <w:sdt>
       <w:sdtPr>
-        <w:id w:val="-1087423041"/>
+        <w:id w:val="-1236646558"/>
         <w:docPartObj>
           <w:docPartGallery w:val="Table of Contents"/>
           <w:docPartUnique w:val="1"/>
@@ -2514,7 +2514,7 @@
     </w:p>
     <w:sdt>
       <w:sdtPr>
-        <w:id w:val="1582867803"/>
+        <w:id w:val="1978537858"/>
         <w:docPartObj>
           <w:docPartGallery w:val="Table of Contents"/>
           <w:docPartUnique w:val="1"/>
@@ -10927,15 +10927,10 @@
       <w:pPr>
         <w:spacing w:after="240" w:before="240" w:lineRule="auto"/>
         <w:ind w:firstLine="0"/>
-        <w:rPr>
-          <w:b w:val="1"/>
-          <w:bCs w:val="1"/>
-        </w:rPr>
-      </w:pPr>
-      <w:r>
-        <w:rPr>
-          <w:b w:val="1"/>
-          <w:bCs w:val="1"/>
+        <w:rPr/>
+      </w:pPr>
+      <w:r>
+        <w:rPr>
           <w:rtl w:val="0"/>
         </w:rPr>
         <w:t xml:space="preserve">Contrato de Aprendizaje Laboral Especial a Término Fijo.</w:t>
@@ -10991,6 +10986,75 @@
           <w:rtl w:val="0"/>
         </w:rPr>
         <w:t xml:space="preserve">Los materiales proporcionados por el docente, la documentación institucional, los documentos legales o contractuales y la documentación técnica deberán distinguirse de acuerdo con su respectiva naturaleza.</w:t>
+      </w:r>
+    </w:p>
+    <w:p>
+      <w:pPr>
+        <w:pStyle w:val="Heading2"/>
+        <w:keepNext w:val="0"/>
+        <w:keepLines w:val="0"/>
+        <w:spacing w:after="80" w:before="360" w:lineRule="auto"/>
+        <w:ind w:firstLine="0"/>
+        <w:rPr/>
+      </w:pPr>
+      <w:bookmarkStart w:colFirst="0" w:colLast="0" w:name="_asm5kvcyeqmb" w:id="1"/>
+      <w:bookmarkEnd w:id="1"/>
+      <w:r>
+        <w:rPr>
+          <w:rtl w:val="0"/>
+        </w:rPr>
+        <w:t xml:space="preserve">Declaración de uso de herramientas de inteligencia artificial:</w:t>
+      </w:r>
+    </w:p>
+    <w:p>
+      <w:pPr>
+        <w:spacing w:after="240" w:before="240" w:lineRule="auto"/>
+        <w:ind w:firstLine="0"/>
+        <w:rPr/>
+      </w:pPr>
+      <w:r>
+        <w:rPr>
+          <w:rtl w:val="0"/>
+        </w:rPr>
+        <w:t xml:space="preserve">Durante el desarrollo del proyecto se usó Inteligencia Artificial como herramienta de apoyo para actividades de consulta, razonamiento técnico, revisión, redacción, organización documental, generación de ejemplos y asistencia en programación.</w:t>
+      </w:r>
+    </w:p>
+    <w:p>
+      <w:pPr>
+        <w:spacing w:after="240" w:before="240" w:lineRule="auto"/>
+        <w:ind w:firstLine="0"/>
+        <w:rPr/>
+      </w:pPr>
+      <w:r>
+        <w:rPr>
+          <w:rtl w:val="0"/>
+        </w:rPr>
+        <w:t xml:space="preserve">Su utilización no sustituyó la revisión, validación ni toma de decisiones por parte del estudiante. Los contenidos generados o sugeridos mediante la herramienta fueron revisados y adaptados de acuerdo con los requisitos del proyecto, los materiales académicos proporcionados por el docente y las necesidades técnicas identificadas durante el desarrollo.</w:t>
+      </w:r>
+    </w:p>
+    <w:p>
+      <w:pPr>
+        <w:spacing w:after="240" w:before="240" w:lineRule="auto"/>
+        <w:ind w:firstLine="0"/>
+        <w:rPr/>
+      </w:pPr>
+      <w:r>
+        <w:rPr>
+          <w:rtl w:val="0"/>
+        </w:rPr>
+        <w:t xml:space="preserve">La herramienta se utilizó principalmente como apoyo para comprender problemas, explorar alternativas y estructurar soluciones, manteniendo la responsabilidad humana sobre las decisiones finales y sobre el contenido presentado en el proyecto.</w:t>
+      </w:r>
+    </w:p>
+    <w:p>
+      <w:pPr>
+        <w:spacing w:after="240" w:before="240" w:lineRule="auto"/>
+        <w:ind w:firstLine="0"/>
+        <w:rPr/>
+      </w:pPr>
+      <w:r>
+        <w:rPr>
+          <w:rtl w:val="0"/>
+        </w:rPr>
       </w:r>
     </w:p>
     <w:p>
@@ -11589,6 +11653,64 @@
     </w:p>
     <w:p>
       <w:pPr>
+        <w:spacing w:after="240" w:before="240" w:lineRule="auto"/>
+        <w:ind w:firstLine="0"/>
+        <w:rPr/>
+      </w:pPr>
+      <w:r>
+        <w:rPr>
+          <w:rtl w:val="0"/>
+        </w:rPr>
+        <w:t xml:space="preserve">OPENAI</w:t>
+      </w:r>
+      <w:r>
+        <w:rPr>
+          <w:b w:val="1"/>
+          <w:bCs w:val="1"/>
+          <w:rtl w:val="0"/>
+        </w:rPr>
+        <w:t xml:space="preserve">. </w:t>
+      </w:r>
+      <w:r>
+        <w:rPr>
+          <w:i w:val="1"/>
+          <w:iCs w:val="1"/>
+          <w:rtl w:val="0"/>
+        </w:rPr>
+        <w:t xml:space="preserve">What is ChatGPT?</w:t>
+      </w:r>
+      <w:r>
+        <w:rPr>
+          <w:rtl w:val="0"/>
+        </w:rPr>
+        <w:t xml:space="preserve"> OpenAI Help Center, 2026. Disponible sur :</w:t>
+      </w:r>
+      <w:hyperlink r:id="rId25">
+        <w:r>
+          <w:rPr>
+            <w:rtl w:val="0"/>
+          </w:rPr>
+          <w:t xml:space="preserve"> </w:t>
+        </w:r>
+      </w:hyperlink>
+      <w:hyperlink r:id="rId26">
+        <w:r>
+          <w:rPr>
+            <w:color w:val="1155cc"/>
+            <w:u w:val="single"/>
+            <w:rtl w:val="0"/>
+          </w:rPr>
+          <w:t xml:space="preserve">https://help.openai.com/en/articles/6783457-what-is-chatgpt</w:t>
+        </w:r>
+      </w:hyperlink>
+      <w:r>
+        <w:rPr>
+          <w:rtl w:val="0"/>
+        </w:rPr>
+      </w:r>
+    </w:p>
+    <w:p>
+      <w:pPr>
         <w:rPr/>
       </w:pPr>
       <w:r>
@@ -11673,8 +11795,8 @@
       </w:r>
     </w:p>
     <w:sectPr>
-      <w:headerReference r:id="rId25" w:type="default"/>
-      <w:footerReference r:id="rId26" w:type="default"/>
+      <w:headerReference r:id="rId27" w:type="default"/>
+      <w:footerReference r:id="rId28" w:type="default"/>
       <w:pgSz w:h="15840" w:w="12240" w:orient="portrait"/>
       <w:pgMar w:bottom="1440" w:top="1440" w:left="1440" w:right="1440" w:header="720" w:footer="720"/>
       <w:pgNumType w:start="1"/>

</xml_diff>

<commit_message>
feat: Update portrait on report
</commit_message>
<xml_diff>
--- a/INFORME_REQUISITOS.docx
+++ b/INFORME_REQUISITOS.docx
@@ -5,15 +5,20 @@
     <w:p>
       <w:pPr>
         <w:spacing w:after="240" w:lineRule="auto"/>
-        <w:ind w:left="2880" w:firstLine="720"/>
+        <w:ind w:left="2880" w:firstLine="0"/>
         <w:jc w:val="both"/>
-        <w:rPr/>
-      </w:pPr>
-      <w:r>
-        <w:rPr>
-          <w:rtl w:val="0"/>
-        </w:rPr>
-        <w:t xml:space="preserve">INFORME DE REQUISITOS</w:t>
+        <w:rPr>
+          <w:b w:val="1"/>
+          <w:bCs w:val="1"/>
+        </w:rPr>
+      </w:pPr>
+      <w:r>
+        <w:rPr>
+          <w:b w:val="1"/>
+          <w:bCs w:val="1"/>
+          <w:rtl w:val="0"/>
+        </w:rPr>
+        <w:t xml:space="preserve">INFORME DE REQUISITOS CÉLULA 5</w:t>
       </w:r>
     </w:p>
     <w:p>
@@ -32,7 +37,7 @@
     <w:p>
       <w:pPr>
         <w:spacing w:after="240" w:lineRule="auto"/>
-        <w:ind w:left="2880" w:firstLine="720"/>
+        <w:ind w:left="2880" w:firstLine="0"/>
         <w:jc w:val="both"/>
         <w:rPr/>
       </w:pPr>
@@ -55,7 +60,6 @@
         <w:rPr>
           <w:rtl w:val="0"/>
         </w:rPr>
-        <w:tab/>
         <w:t xml:space="preserve">Yeferson Estiven Castañeda</w:t>
       </w:r>
     </w:p>
@@ -70,7 +74,6 @@
         <w:rPr>
           <w:rtl w:val="0"/>
         </w:rPr>
-        <w:tab/>
         <w:t xml:space="preserve">Miguel Samudio</w:t>
       </w:r>
     </w:p>
@@ -85,7 +88,6 @@
         <w:rPr>
           <w:rtl w:val="0"/>
         </w:rPr>
-        <w:tab/>
         <w:t xml:space="preserve">Luis Loaiza García</w:t>
       </w:r>
     </w:p>
@@ -100,7 +102,6 @@
         <w:rPr>
           <w:rtl w:val="0"/>
         </w:rPr>
-        <w:tab/>
         <w:t xml:space="preserve">Andrés Vélez Hurtado</w:t>
       </w:r>
     </w:p>
@@ -119,6 +120,20 @@
     </w:p>
     <w:p>
       <w:pPr>
+        <w:ind w:left="2160" w:firstLine="720"/>
+        <w:jc w:val="left"/>
+        <w:rPr/>
+      </w:pPr>
+      <w:r>
+        <w:rPr>
+          <w:rtl w:val="0"/>
+        </w:rPr>
+        <w:t xml:space="preserve">                  </w:t>
+      </w:r>
+    </w:p>
+    <w:p>
+      <w:pPr>
+        <w:spacing w:line="480" w:lineRule="auto"/>
         <w:ind w:firstLine="0"/>
         <w:jc w:val="center"/>
         <w:rPr/>
@@ -127,11 +142,12 @@
         <w:rPr>
           <w:rtl w:val="0"/>
         </w:rPr>
-        <w:t xml:space="preserve">Célula 5</w:t>
-      </w:r>
-    </w:p>
-    <w:p>
-      <w:pPr>
+        <w:t xml:space="preserve">CESDE</w:t>
+      </w:r>
+    </w:p>
+    <w:p>
+      <w:pPr>
+        <w:spacing w:line="480" w:lineRule="auto"/>
         <w:ind w:firstLine="0"/>
         <w:jc w:val="center"/>
         <w:rPr/>
@@ -140,6 +156,7 @@
         <w:rPr>
           <w:rtl w:val="0"/>
         </w:rPr>
+        <w:t xml:space="preserve">Técnico Laboral en Desarrollo de Software</w:t>
       </w:r>
     </w:p>
     <w:p>
@@ -153,7 +170,7 @@
         <w:rPr>
           <w:rtl w:val="0"/>
         </w:rPr>
-        <w:t xml:space="preserve">CESDE</w:t>
+        <w:t xml:space="preserve">Jaime Zapata</w:t>
       </w:r>
     </w:p>
     <w:p>
@@ -167,7 +184,6 @@
         <w:rPr>
           <w:rtl w:val="0"/>
         </w:rPr>
-        <w:t xml:space="preserve">Técnico Laboral en Desarrollo de Software</w:t>
       </w:r>
     </w:p>
     <w:p>
@@ -181,7 +197,6 @@
         <w:rPr>
           <w:rtl w:val="0"/>
         </w:rPr>
-        <w:t xml:space="preserve">Jaime Zapata</w:t>
       </w:r>
     </w:p>
     <w:p>
@@ -189,7 +204,10 @@
         <w:spacing w:line="480" w:lineRule="auto"/>
         <w:ind w:firstLine="0"/>
         <w:jc w:val="center"/>
-        <w:rPr/>
+        <w:rPr>
+          <w:b w:val="1"/>
+          <w:bCs w:val="1"/>
+        </w:rPr>
       </w:pPr>
       <w:r>
         <w:rPr>
@@ -202,37 +220,15 @@
         <w:spacing w:line="480" w:lineRule="auto"/>
         <w:ind w:firstLine="0"/>
         <w:jc w:val="center"/>
-        <w:rPr/>
-      </w:pPr>
-      <w:r>
-        <w:rPr>
-          <w:rtl w:val="0"/>
-        </w:rPr>
-      </w:r>
-    </w:p>
-    <w:p>
-      <w:pPr>
-        <w:spacing w:line="480" w:lineRule="auto"/>
-        <w:ind w:firstLine="0"/>
-        <w:jc w:val="center"/>
-        <w:rPr/>
-      </w:pPr>
-      <w:r>
-        <w:rPr>
-          <w:rtl w:val="0"/>
-        </w:rPr>
-      </w:r>
-    </w:p>
-    <w:p>
-      <w:pPr>
-        <w:spacing w:line="480" w:lineRule="auto"/>
-        <w:ind w:firstLine="0"/>
-        <w:jc w:val="center"/>
-        <w:rPr/>
-      </w:pPr>
-      <w:r>
-        <w:rPr>
-          <w:rFonts w:ascii="Times New Roman" w:cs="Times New Roman" w:eastAsia="Times New Roman" w:hAnsi="Times New Roman"/>
+        <w:rPr>
+          <w:b w:val="1"/>
+          <w:bCs w:val="1"/>
+        </w:rPr>
+      </w:pPr>
+      <w:r>
+        <w:rPr>
+          <w:b w:val="1"/>
+          <w:bCs w:val="1"/>
           <w:sz w:val="24"/>
           <w:szCs w:val="24"/>
           <w:rtl w:val="0"/>
@@ -250,11 +246,15 @@
         <w:spacing w:line="480" w:lineRule="auto"/>
         <w:ind w:firstLine="0"/>
         <w:jc w:val="center"/>
-        <w:rPr/>
-      </w:pPr>
-      <w:r>
-        <w:rPr>
-          <w:rFonts w:ascii="Times New Roman" w:cs="Times New Roman" w:eastAsia="Times New Roman" w:hAnsi="Times New Roman"/>
+        <w:rPr>
+          <w:b w:val="1"/>
+          <w:bCs w:val="1"/>
+        </w:rPr>
+      </w:pPr>
+      <w:r>
+        <w:rPr>
+          <w:b w:val="1"/>
+          <w:bCs w:val="1"/>
           <w:sz w:val="24"/>
           <w:szCs w:val="24"/>
           <w:rtl w:val="0"/>
@@ -270,7 +270,10 @@
     <w:p>
       <w:pPr>
         <w:jc w:val="both"/>
-        <w:rPr/>
+        <w:rPr>
+          <w:b w:val="1"/>
+          <w:bCs w:val="1"/>
+        </w:rPr>
       </w:pPr>
       <w:r>
         <w:br w:type="page"/>
@@ -297,7 +300,7 @@
     </w:p>
     <w:sdt>
       <w:sdtPr>
-        <w:id w:val="-1236646558"/>
+        <w:id w:val="348180782"/>
         <w:docPartObj>
           <w:docPartGallery w:val="Table of Contents"/>
           <w:docPartUnique w:val="1"/>
@@ -2514,7 +2517,7 @@
     </w:p>
     <w:sdt>
       <w:sdtPr>
-        <w:id w:val="1978537858"/>
+        <w:id w:val="615403388"/>
         <w:docPartObj>
           <w:docPartGallery w:val="Table of Contents"/>
           <w:docPartUnique w:val="1"/>
@@ -8944,12 +8947,12 @@
           <wp:inline distB="114300" distT="114300" distL="114300" distR="114300">
             <wp:extent cx="5943600" cy="3962400"/>
             <wp:effectExtent b="0" l="0" r="0" t="0"/>
-            <wp:docPr descr="Ilustración 1. Casos de uso principales del sistema&#10;" id="2" name="image1.png"/>
+            <wp:docPr descr="Ilustración 1. Casos de uso principales del sistema&#10;" id="2" name="image2.png"/>
             <a:graphic>
               <a:graphicData uri="http://schemas.openxmlformats.org/drawingml/2006/picture">
                 <pic:pic>
                   <pic:nvPicPr>
-                    <pic:cNvPr descr="Ilustración 1. Casos de uso principales del sistema&#10;" id="0" name="image1.png"/>
+                    <pic:cNvPr descr="Ilustración 1. Casos de uso principales del sistema&#10;" id="0" name="image2.png"/>
                     <pic:cNvPicPr preferRelativeResize="0"/>
                   </pic:nvPicPr>
                   <pic:blipFill>
@@ -9053,12 +9056,12 @@
           <wp:inline distB="114300" distT="114300" distL="114300" distR="114300">
             <wp:extent cx="5943600" cy="3962400"/>
             <wp:effectExtent b="0" l="0" r="0" t="0"/>
-            <wp:docPr id="1" name="image2.png"/>
+            <wp:docPr id="1" name="image1.png"/>
             <a:graphic>
               <a:graphicData uri="http://schemas.openxmlformats.org/drawingml/2006/picture">
                 <pic:pic>
                   <pic:nvPicPr>
-                    <pic:cNvPr id="0" name="image2.png"/>
+                    <pic:cNvPr id="0" name="image1.png"/>
                     <pic:cNvPicPr preferRelativeResize="0"/>
                   </pic:nvPicPr>
                   <pic:blipFill>

</xml_diff>